<commit_message>
Third Commit: Doc completo
</commit_message>
<xml_diff>
--- a/docs/Tarea1P3.docx
+++ b/docs/Tarea1P3.docx
@@ -669,7 +669,7 @@
           <w:szCs w:val="24"/>
         </w:rPr>
       </w:pPr>
-      <w:bookmarkStart w:id="0" w:name="_Toc234187690"/>
+      <w:bookmarkStart w:id="0" w:name="_Toc234190905"/>
       <w:r>
         <w:rPr>
           <w:rFonts w:cs="Times New Roman"/>
@@ -678,8 +678,8 @@
         <w:lastRenderedPageBreak/>
         <w:t>Índice de contenido</w:t>
       </w:r>
-    </w:p>
-    <w:bookmarkEnd w:id="0" w:displacedByCustomXml="next"/>
+      <w:bookmarkEnd w:id="0"/>
+    </w:p>
     <w:sdt>
       <w:sdtPr>
         <w:rPr>
@@ -711,7 +711,9 @@
               <w:numId w:val="0"/>
             </w:numPr>
             <w:rPr>
-              <w:szCs w:val="24"/>
+              <w:rFonts w:cs="Times New Roman"/>
+              <w:sz w:val="16"/>
+              <w:szCs w:val="18"/>
             </w:rPr>
           </w:pPr>
         </w:p>
@@ -723,50 +725,55 @@
               <w:tab w:val="right" w:leader="dot" w:pos="8494"/>
             </w:tabs>
             <w:rPr>
-              <w:rFonts w:ascii="Times New Roman" w:hAnsi="Times New Roman" w:cs="Times New Roman"/>
+              <w:rFonts w:ascii="Times New Roman" w:eastAsiaTheme="minorEastAsia" w:hAnsi="Times New Roman" w:cs="Times New Roman"/>
               <w:noProof/>
-              <w:sz w:val="18"/>
-              <w:szCs w:val="18"/>
+              <w:sz w:val="16"/>
+              <w:szCs w:val="16"/>
+              <w:lang w:eastAsia="es-EC"/>
             </w:rPr>
           </w:pPr>
           <w:r>
             <w:rPr>
-              <w:sz w:val="18"/>
-              <w:szCs w:val="18"/>
+              <w:rFonts w:ascii="Times New Roman" w:hAnsi="Times New Roman" w:cs="Times New Roman"/>
+              <w:sz w:val="14"/>
+              <w:szCs w:val="14"/>
             </w:rPr>
             <w:fldChar w:fldCharType="begin"/>
           </w:r>
           <w:r>
             <w:rPr>
-              <w:sz w:val="18"/>
-              <w:szCs w:val="18"/>
+              <w:rFonts w:ascii="Times New Roman" w:hAnsi="Times New Roman" w:cs="Times New Roman"/>
+              <w:sz w:val="14"/>
+              <w:szCs w:val="14"/>
             </w:rPr>
             <w:instrText xml:space="preserve"> TOC \o "1-3" \h \z \u </w:instrText>
           </w:r>
           <w:r>
             <w:rPr>
-              <w:sz w:val="18"/>
-              <w:szCs w:val="18"/>
+              <w:rFonts w:ascii="Times New Roman" w:hAnsi="Times New Roman" w:cs="Times New Roman"/>
+              <w:sz w:val="14"/>
+              <w:szCs w:val="14"/>
             </w:rPr>
             <w:fldChar w:fldCharType="separate"/>
           </w:r>
-          <w:hyperlink w:anchor="_Toc234187690" w:history="1">
+          <w:hyperlink w:anchor="_Toc234190905" w:history="1">
             <w:r>
               <w:rPr>
                 <w:rStyle w:val="Hipervnculo"/>
                 <w:rFonts w:ascii="Times New Roman" w:hAnsi="Times New Roman" w:cs="Times New Roman"/>
                 <w:noProof/>
-                <w:sz w:val="18"/>
-                <w:szCs w:val="18"/>
+                <w:sz w:val="16"/>
+                <w:szCs w:val="16"/>
               </w:rPr>
               <w:t>1.</w:t>
             </w:r>
             <w:r>
               <w:rPr>
-                <w:rFonts w:ascii="Times New Roman" w:hAnsi="Times New Roman" w:cs="Times New Roman"/>
+                <w:rFonts w:ascii="Times New Roman" w:eastAsiaTheme="minorEastAsia" w:hAnsi="Times New Roman" w:cs="Times New Roman"/>
                 <w:noProof/>
-                <w:sz w:val="18"/>
-                <w:szCs w:val="18"/>
+                <w:sz w:val="16"/>
+                <w:szCs w:val="16"/>
+                <w:lang w:eastAsia="es-EC"/>
               </w:rPr>
               <w:tab/>
             </w:r>
@@ -775,8 +782,8 @@
                 <w:rStyle w:val="Hipervnculo"/>
                 <w:rFonts w:ascii="Times New Roman" w:hAnsi="Times New Roman" w:cs="Times New Roman"/>
                 <w:noProof/>
-                <w:sz w:val="18"/>
-                <w:szCs w:val="18"/>
+                <w:sz w:val="16"/>
+                <w:szCs w:val="16"/>
               </w:rPr>
               <w:t>Índice de contenido</w:t>
             </w:r>
@@ -785,8 +792,8 @@
                 <w:rFonts w:ascii="Times New Roman" w:hAnsi="Times New Roman" w:cs="Times New Roman"/>
                 <w:noProof/>
                 <w:webHidden/>
-                <w:sz w:val="18"/>
-                <w:szCs w:val="18"/>
+                <w:sz w:val="16"/>
+                <w:szCs w:val="16"/>
               </w:rPr>
               <w:tab/>
             </w:r>
@@ -795,8 +802,8 @@
                 <w:rFonts w:ascii="Times New Roman" w:hAnsi="Times New Roman" w:cs="Times New Roman"/>
                 <w:noProof/>
                 <w:webHidden/>
-                <w:sz w:val="18"/>
-                <w:szCs w:val="18"/>
+                <w:sz w:val="16"/>
+                <w:szCs w:val="16"/>
               </w:rPr>
               <w:fldChar w:fldCharType="begin"/>
             </w:r>
@@ -805,18 +812,18 @@
                 <w:rFonts w:ascii="Times New Roman" w:hAnsi="Times New Roman" w:cs="Times New Roman"/>
                 <w:noProof/>
                 <w:webHidden/>
-                <w:sz w:val="18"/>
-                <w:szCs w:val="18"/>
-              </w:rPr>
-              <w:instrText xml:space="preserve"> PAGEREF _Toc234187690 \h </w:instrText>
+                <w:sz w:val="16"/>
+                <w:szCs w:val="16"/>
+              </w:rPr>
+              <w:instrText xml:space="preserve"> PAGEREF _Toc234190905 \h </w:instrText>
             </w:r>
             <w:r>
               <w:rPr>
                 <w:rFonts w:ascii="Times New Roman" w:hAnsi="Times New Roman" w:cs="Times New Roman"/>
                 <w:noProof/>
                 <w:webHidden/>
-                <w:sz w:val="18"/>
-                <w:szCs w:val="18"/>
+                <w:sz w:val="16"/>
+                <w:szCs w:val="16"/>
               </w:rPr>
             </w:r>
             <w:r>
@@ -824,8 +831,8 @@
                 <w:rFonts w:ascii="Times New Roman" w:hAnsi="Times New Roman" w:cs="Times New Roman"/>
                 <w:noProof/>
                 <w:webHidden/>
-                <w:sz w:val="18"/>
-                <w:szCs w:val="18"/>
+                <w:sz w:val="16"/>
+                <w:szCs w:val="16"/>
               </w:rPr>
               <w:fldChar w:fldCharType="separate"/>
             </w:r>
@@ -834,8 +841,8 @@
                 <w:rFonts w:ascii="Times New Roman" w:hAnsi="Times New Roman" w:cs="Times New Roman"/>
                 <w:noProof/>
                 <w:webHidden/>
-                <w:sz w:val="18"/>
-                <w:szCs w:val="18"/>
+                <w:sz w:val="16"/>
+                <w:szCs w:val="16"/>
               </w:rPr>
               <w:t>2</w:t>
             </w:r>
@@ -844,8 +851,8 @@
                 <w:rFonts w:ascii="Times New Roman" w:hAnsi="Times New Roman" w:cs="Times New Roman"/>
                 <w:noProof/>
                 <w:webHidden/>
-                <w:sz w:val="18"/>
-                <w:szCs w:val="18"/>
+                <w:sz w:val="16"/>
+                <w:szCs w:val="16"/>
               </w:rPr>
               <w:fldChar w:fldCharType="end"/>
             </w:r>
@@ -859,29 +866,31 @@
               <w:tab w:val="right" w:leader="dot" w:pos="8494"/>
             </w:tabs>
             <w:rPr>
-              <w:rFonts w:ascii="Times New Roman" w:hAnsi="Times New Roman" w:cs="Times New Roman"/>
+              <w:rFonts w:ascii="Times New Roman" w:eastAsiaTheme="minorEastAsia" w:hAnsi="Times New Roman" w:cs="Times New Roman"/>
               <w:noProof/>
-              <w:sz w:val="18"/>
-              <w:szCs w:val="18"/>
+              <w:sz w:val="16"/>
+              <w:szCs w:val="16"/>
+              <w:lang w:eastAsia="es-EC"/>
             </w:rPr>
           </w:pPr>
-          <w:hyperlink w:anchor="_Toc234187691" w:history="1">
+          <w:hyperlink w:anchor="_Toc234190906" w:history="1">
             <w:r>
               <w:rPr>
                 <w:rStyle w:val="Hipervnculo"/>
                 <w:rFonts w:ascii="Times New Roman" w:hAnsi="Times New Roman" w:cs="Times New Roman"/>
                 <w:noProof/>
-                <w:sz w:val="18"/>
-                <w:szCs w:val="18"/>
+                <w:sz w:val="16"/>
+                <w:szCs w:val="16"/>
               </w:rPr>
               <w:t>2.</w:t>
             </w:r>
             <w:r>
               <w:rPr>
-                <w:rFonts w:ascii="Times New Roman" w:hAnsi="Times New Roman" w:cs="Times New Roman"/>
+                <w:rFonts w:ascii="Times New Roman" w:eastAsiaTheme="minorEastAsia" w:hAnsi="Times New Roman" w:cs="Times New Roman"/>
                 <w:noProof/>
-                <w:sz w:val="18"/>
-                <w:szCs w:val="18"/>
+                <w:sz w:val="16"/>
+                <w:szCs w:val="16"/>
+                <w:lang w:eastAsia="es-EC"/>
               </w:rPr>
               <w:tab/>
             </w:r>
@@ -890,8 +899,8 @@
                 <w:rStyle w:val="Hipervnculo"/>
                 <w:rFonts w:ascii="Times New Roman" w:hAnsi="Times New Roman" w:cs="Times New Roman"/>
                 <w:noProof/>
-                <w:sz w:val="18"/>
-                <w:szCs w:val="18"/>
+                <w:sz w:val="16"/>
+                <w:szCs w:val="16"/>
               </w:rPr>
               <w:t>Índice de figuras</w:t>
             </w:r>
@@ -900,8 +909,8 @@
                 <w:rFonts w:ascii="Times New Roman" w:hAnsi="Times New Roman" w:cs="Times New Roman"/>
                 <w:noProof/>
                 <w:webHidden/>
-                <w:sz w:val="18"/>
-                <w:szCs w:val="18"/>
+                <w:sz w:val="16"/>
+                <w:szCs w:val="16"/>
               </w:rPr>
               <w:tab/>
             </w:r>
@@ -910,8 +919,8 @@
                 <w:rFonts w:ascii="Times New Roman" w:hAnsi="Times New Roman" w:cs="Times New Roman"/>
                 <w:noProof/>
                 <w:webHidden/>
-                <w:sz w:val="18"/>
-                <w:szCs w:val="18"/>
+                <w:sz w:val="16"/>
+                <w:szCs w:val="16"/>
               </w:rPr>
               <w:fldChar w:fldCharType="begin"/>
             </w:r>
@@ -920,18 +929,18 @@
                 <w:rFonts w:ascii="Times New Roman" w:hAnsi="Times New Roman" w:cs="Times New Roman"/>
                 <w:noProof/>
                 <w:webHidden/>
-                <w:sz w:val="18"/>
-                <w:szCs w:val="18"/>
-              </w:rPr>
-              <w:instrText xml:space="preserve"> PAGEREF _Toc234187691 \h </w:instrText>
+                <w:sz w:val="16"/>
+                <w:szCs w:val="16"/>
+              </w:rPr>
+              <w:instrText xml:space="preserve"> PAGEREF _Toc234190906 \h </w:instrText>
             </w:r>
             <w:r>
               <w:rPr>
                 <w:rFonts w:ascii="Times New Roman" w:hAnsi="Times New Roman" w:cs="Times New Roman"/>
                 <w:noProof/>
                 <w:webHidden/>
-                <w:sz w:val="18"/>
-                <w:szCs w:val="18"/>
+                <w:sz w:val="16"/>
+                <w:szCs w:val="16"/>
               </w:rPr>
             </w:r>
             <w:r>
@@ -939,8 +948,8 @@
                 <w:rFonts w:ascii="Times New Roman" w:hAnsi="Times New Roman" w:cs="Times New Roman"/>
                 <w:noProof/>
                 <w:webHidden/>
-                <w:sz w:val="18"/>
-                <w:szCs w:val="18"/>
+                <w:sz w:val="16"/>
+                <w:szCs w:val="16"/>
               </w:rPr>
               <w:fldChar w:fldCharType="separate"/>
             </w:r>
@@ -949,8 +958,8 @@
                 <w:rFonts w:ascii="Times New Roman" w:hAnsi="Times New Roman" w:cs="Times New Roman"/>
                 <w:noProof/>
                 <w:webHidden/>
-                <w:sz w:val="18"/>
-                <w:szCs w:val="18"/>
+                <w:sz w:val="16"/>
+                <w:szCs w:val="16"/>
               </w:rPr>
               <w:t>2</w:t>
             </w:r>
@@ -959,8 +968,8 @@
                 <w:rFonts w:ascii="Times New Roman" w:hAnsi="Times New Roman" w:cs="Times New Roman"/>
                 <w:noProof/>
                 <w:webHidden/>
-                <w:sz w:val="18"/>
-                <w:szCs w:val="18"/>
+                <w:sz w:val="16"/>
+                <w:szCs w:val="16"/>
               </w:rPr>
               <w:fldChar w:fldCharType="end"/>
             </w:r>
@@ -974,29 +983,31 @@
               <w:tab w:val="right" w:leader="dot" w:pos="8494"/>
             </w:tabs>
             <w:rPr>
-              <w:rFonts w:ascii="Times New Roman" w:hAnsi="Times New Roman" w:cs="Times New Roman"/>
+              <w:rFonts w:ascii="Times New Roman" w:eastAsiaTheme="minorEastAsia" w:hAnsi="Times New Roman" w:cs="Times New Roman"/>
               <w:noProof/>
-              <w:sz w:val="18"/>
-              <w:szCs w:val="18"/>
+              <w:sz w:val="16"/>
+              <w:szCs w:val="16"/>
+              <w:lang w:eastAsia="es-EC"/>
             </w:rPr>
           </w:pPr>
-          <w:hyperlink w:anchor="_Toc234187692" w:history="1">
+          <w:hyperlink w:anchor="_Toc234190907" w:history="1">
             <w:r>
               <w:rPr>
                 <w:rStyle w:val="Hipervnculo"/>
                 <w:rFonts w:ascii="Times New Roman" w:hAnsi="Times New Roman" w:cs="Times New Roman"/>
                 <w:noProof/>
-                <w:sz w:val="18"/>
-                <w:szCs w:val="18"/>
+                <w:sz w:val="16"/>
+                <w:szCs w:val="16"/>
               </w:rPr>
               <w:t>3.</w:t>
             </w:r>
             <w:r>
               <w:rPr>
-                <w:rFonts w:ascii="Times New Roman" w:hAnsi="Times New Roman" w:cs="Times New Roman"/>
+                <w:rFonts w:ascii="Times New Roman" w:eastAsiaTheme="minorEastAsia" w:hAnsi="Times New Roman" w:cs="Times New Roman"/>
                 <w:noProof/>
-                <w:sz w:val="18"/>
-                <w:szCs w:val="18"/>
+                <w:sz w:val="16"/>
+                <w:szCs w:val="16"/>
+                <w:lang w:eastAsia="es-EC"/>
               </w:rPr>
               <w:tab/>
             </w:r>
@@ -1005,8 +1016,8 @@
                 <w:rStyle w:val="Hipervnculo"/>
                 <w:rFonts w:ascii="Times New Roman" w:hAnsi="Times New Roman" w:cs="Times New Roman"/>
                 <w:noProof/>
-                <w:sz w:val="18"/>
-                <w:szCs w:val="18"/>
+                <w:sz w:val="16"/>
+                <w:szCs w:val="16"/>
               </w:rPr>
               <w:t>Índice de tablas</w:t>
             </w:r>
@@ -1015,8 +1026,8 @@
                 <w:rFonts w:ascii="Times New Roman" w:hAnsi="Times New Roman" w:cs="Times New Roman"/>
                 <w:noProof/>
                 <w:webHidden/>
-                <w:sz w:val="18"/>
-                <w:szCs w:val="18"/>
+                <w:sz w:val="16"/>
+                <w:szCs w:val="16"/>
               </w:rPr>
               <w:tab/>
             </w:r>
@@ -1025,8 +1036,8 @@
                 <w:rFonts w:ascii="Times New Roman" w:hAnsi="Times New Roman" w:cs="Times New Roman"/>
                 <w:noProof/>
                 <w:webHidden/>
-                <w:sz w:val="18"/>
-                <w:szCs w:val="18"/>
+                <w:sz w:val="16"/>
+                <w:szCs w:val="16"/>
               </w:rPr>
               <w:fldChar w:fldCharType="begin"/>
             </w:r>
@@ -1035,18 +1046,18 @@
                 <w:rFonts w:ascii="Times New Roman" w:hAnsi="Times New Roman" w:cs="Times New Roman"/>
                 <w:noProof/>
                 <w:webHidden/>
-                <w:sz w:val="18"/>
-                <w:szCs w:val="18"/>
-              </w:rPr>
-              <w:instrText xml:space="preserve"> PAGEREF _Toc234187692 \h </w:instrText>
+                <w:sz w:val="16"/>
+                <w:szCs w:val="16"/>
+              </w:rPr>
+              <w:instrText xml:space="preserve"> PAGEREF _Toc234190907 \h </w:instrText>
             </w:r>
             <w:r>
               <w:rPr>
                 <w:rFonts w:ascii="Times New Roman" w:hAnsi="Times New Roman" w:cs="Times New Roman"/>
                 <w:noProof/>
                 <w:webHidden/>
-                <w:sz w:val="18"/>
-                <w:szCs w:val="18"/>
+                <w:sz w:val="16"/>
+                <w:szCs w:val="16"/>
               </w:rPr>
             </w:r>
             <w:r>
@@ -1054,8 +1065,8 @@
                 <w:rFonts w:ascii="Times New Roman" w:hAnsi="Times New Roman" w:cs="Times New Roman"/>
                 <w:noProof/>
                 <w:webHidden/>
-                <w:sz w:val="18"/>
-                <w:szCs w:val="18"/>
+                <w:sz w:val="16"/>
+                <w:szCs w:val="16"/>
               </w:rPr>
               <w:fldChar w:fldCharType="separate"/>
             </w:r>
@@ -1064,8 +1075,8 @@
                 <w:rFonts w:ascii="Times New Roman" w:hAnsi="Times New Roman" w:cs="Times New Roman"/>
                 <w:noProof/>
                 <w:webHidden/>
-                <w:sz w:val="18"/>
-                <w:szCs w:val="18"/>
+                <w:sz w:val="16"/>
+                <w:szCs w:val="16"/>
               </w:rPr>
               <w:t>2</w:t>
             </w:r>
@@ -1074,8 +1085,8 @@
                 <w:rFonts w:ascii="Times New Roman" w:hAnsi="Times New Roman" w:cs="Times New Roman"/>
                 <w:noProof/>
                 <w:webHidden/>
-                <w:sz w:val="18"/>
-                <w:szCs w:val="18"/>
+                <w:sz w:val="16"/>
+                <w:szCs w:val="16"/>
               </w:rPr>
               <w:fldChar w:fldCharType="end"/>
             </w:r>
@@ -1089,29 +1100,31 @@
               <w:tab w:val="right" w:leader="dot" w:pos="8494"/>
             </w:tabs>
             <w:rPr>
-              <w:rFonts w:ascii="Times New Roman" w:hAnsi="Times New Roman" w:cs="Times New Roman"/>
+              <w:rFonts w:ascii="Times New Roman" w:eastAsiaTheme="minorEastAsia" w:hAnsi="Times New Roman" w:cs="Times New Roman"/>
               <w:noProof/>
-              <w:sz w:val="18"/>
-              <w:szCs w:val="18"/>
+              <w:sz w:val="16"/>
+              <w:szCs w:val="16"/>
+              <w:lang w:eastAsia="es-EC"/>
             </w:rPr>
           </w:pPr>
-          <w:hyperlink w:anchor="_Toc234187693" w:history="1">
+          <w:hyperlink w:anchor="_Toc234190908" w:history="1">
             <w:r>
               <w:rPr>
                 <w:rStyle w:val="Hipervnculo"/>
                 <w:rFonts w:ascii="Times New Roman" w:hAnsi="Times New Roman" w:cs="Times New Roman"/>
                 <w:noProof/>
-                <w:sz w:val="18"/>
-                <w:szCs w:val="18"/>
+                <w:sz w:val="16"/>
+                <w:szCs w:val="16"/>
               </w:rPr>
               <w:t>4.</w:t>
             </w:r>
             <w:r>
               <w:rPr>
-                <w:rFonts w:ascii="Times New Roman" w:hAnsi="Times New Roman" w:cs="Times New Roman"/>
+                <w:rFonts w:ascii="Times New Roman" w:eastAsiaTheme="minorEastAsia" w:hAnsi="Times New Roman" w:cs="Times New Roman"/>
                 <w:noProof/>
-                <w:sz w:val="18"/>
-                <w:szCs w:val="18"/>
+                <w:sz w:val="16"/>
+                <w:szCs w:val="16"/>
+                <w:lang w:eastAsia="es-EC"/>
               </w:rPr>
               <w:tab/>
             </w:r>
@@ -1120,18 +1133,18 @@
                 <w:rStyle w:val="Hipervnculo"/>
                 <w:rFonts w:ascii="Times New Roman" w:hAnsi="Times New Roman" w:cs="Times New Roman"/>
                 <w:noProof/>
-                <w:sz w:val="18"/>
-                <w:szCs w:val="18"/>
-              </w:rPr>
-              <w:t>Objetivo</w:t>
+                <w:sz w:val="16"/>
+                <w:szCs w:val="16"/>
+              </w:rPr>
+              <w:t>Link de GitHub</w:t>
             </w:r>
             <w:r>
               <w:rPr>
                 <w:rFonts w:ascii="Times New Roman" w:hAnsi="Times New Roman" w:cs="Times New Roman"/>
                 <w:noProof/>
                 <w:webHidden/>
-                <w:sz w:val="18"/>
-                <w:szCs w:val="18"/>
+                <w:sz w:val="16"/>
+                <w:szCs w:val="16"/>
               </w:rPr>
               <w:tab/>
             </w:r>
@@ -1140,8 +1153,8 @@
                 <w:rFonts w:ascii="Times New Roman" w:hAnsi="Times New Roman" w:cs="Times New Roman"/>
                 <w:noProof/>
                 <w:webHidden/>
-                <w:sz w:val="18"/>
-                <w:szCs w:val="18"/>
+                <w:sz w:val="16"/>
+                <w:szCs w:val="16"/>
               </w:rPr>
               <w:fldChar w:fldCharType="begin"/>
             </w:r>
@@ -1150,18 +1163,18 @@
                 <w:rFonts w:ascii="Times New Roman" w:hAnsi="Times New Roman" w:cs="Times New Roman"/>
                 <w:noProof/>
                 <w:webHidden/>
-                <w:sz w:val="18"/>
-                <w:szCs w:val="18"/>
-              </w:rPr>
-              <w:instrText xml:space="preserve"> PAGEREF _Toc234187693 \h </w:instrText>
+                <w:sz w:val="16"/>
+                <w:szCs w:val="16"/>
+              </w:rPr>
+              <w:instrText xml:space="preserve"> PAGEREF _Toc234190908 \h </w:instrText>
             </w:r>
             <w:r>
               <w:rPr>
                 <w:rFonts w:ascii="Times New Roman" w:hAnsi="Times New Roman" w:cs="Times New Roman"/>
                 <w:noProof/>
                 <w:webHidden/>
-                <w:sz w:val="18"/>
-                <w:szCs w:val="18"/>
+                <w:sz w:val="16"/>
+                <w:szCs w:val="16"/>
               </w:rPr>
             </w:r>
             <w:r>
@@ -1169,8 +1182,8 @@
                 <w:rFonts w:ascii="Times New Roman" w:hAnsi="Times New Roman" w:cs="Times New Roman"/>
                 <w:noProof/>
                 <w:webHidden/>
-                <w:sz w:val="18"/>
-                <w:szCs w:val="18"/>
+                <w:sz w:val="16"/>
+                <w:szCs w:val="16"/>
               </w:rPr>
               <w:fldChar w:fldCharType="separate"/>
             </w:r>
@@ -1179,18 +1192,18 @@
                 <w:rFonts w:ascii="Times New Roman" w:hAnsi="Times New Roman" w:cs="Times New Roman"/>
                 <w:noProof/>
                 <w:webHidden/>
-                <w:sz w:val="18"/>
-                <w:szCs w:val="18"/>
-              </w:rPr>
-              <w:t>2</w:t>
+                <w:sz w:val="16"/>
+                <w:szCs w:val="16"/>
+              </w:rPr>
+              <w:t>3</w:t>
             </w:r>
             <w:r>
               <w:rPr>
                 <w:rFonts w:ascii="Times New Roman" w:hAnsi="Times New Roman" w:cs="Times New Roman"/>
                 <w:noProof/>
                 <w:webHidden/>
-                <w:sz w:val="18"/>
-                <w:szCs w:val="18"/>
+                <w:sz w:val="16"/>
+                <w:szCs w:val="16"/>
               </w:rPr>
               <w:fldChar w:fldCharType="end"/>
             </w:r>
@@ -1204,29 +1217,31 @@
               <w:tab w:val="right" w:leader="dot" w:pos="8494"/>
             </w:tabs>
             <w:rPr>
-              <w:rFonts w:ascii="Times New Roman" w:hAnsi="Times New Roman" w:cs="Times New Roman"/>
+              <w:rFonts w:ascii="Times New Roman" w:eastAsiaTheme="minorEastAsia" w:hAnsi="Times New Roman" w:cs="Times New Roman"/>
               <w:noProof/>
-              <w:sz w:val="18"/>
-              <w:szCs w:val="18"/>
+              <w:sz w:val="16"/>
+              <w:szCs w:val="16"/>
+              <w:lang w:eastAsia="es-EC"/>
             </w:rPr>
           </w:pPr>
-          <w:hyperlink w:anchor="_Toc234187694" w:history="1">
+          <w:hyperlink w:anchor="_Toc234190909" w:history="1">
             <w:r>
               <w:rPr>
                 <w:rStyle w:val="Hipervnculo"/>
                 <w:rFonts w:ascii="Times New Roman" w:hAnsi="Times New Roman" w:cs="Times New Roman"/>
                 <w:noProof/>
-                <w:sz w:val="18"/>
-                <w:szCs w:val="18"/>
+                <w:sz w:val="16"/>
+                <w:szCs w:val="16"/>
               </w:rPr>
               <w:t>5.</w:t>
             </w:r>
             <w:r>
               <w:rPr>
-                <w:rFonts w:ascii="Times New Roman" w:hAnsi="Times New Roman" w:cs="Times New Roman"/>
+                <w:rFonts w:ascii="Times New Roman" w:eastAsiaTheme="minorEastAsia" w:hAnsi="Times New Roman" w:cs="Times New Roman"/>
                 <w:noProof/>
-                <w:sz w:val="18"/>
-                <w:szCs w:val="18"/>
+                <w:sz w:val="16"/>
+                <w:szCs w:val="16"/>
+                <w:lang w:eastAsia="es-EC"/>
               </w:rPr>
               <w:tab/>
             </w:r>
@@ -1235,18 +1250,18 @@
                 <w:rStyle w:val="Hipervnculo"/>
                 <w:rFonts w:ascii="Times New Roman" w:hAnsi="Times New Roman" w:cs="Times New Roman"/>
                 <w:noProof/>
-                <w:sz w:val="18"/>
-                <w:szCs w:val="18"/>
-              </w:rPr>
-              <w:t>Descripción del cliente</w:t>
+                <w:sz w:val="16"/>
+                <w:szCs w:val="16"/>
+              </w:rPr>
+              <w:t>Objetivo</w:t>
             </w:r>
             <w:r>
               <w:rPr>
                 <w:rFonts w:ascii="Times New Roman" w:hAnsi="Times New Roman" w:cs="Times New Roman"/>
                 <w:noProof/>
                 <w:webHidden/>
-                <w:sz w:val="18"/>
-                <w:szCs w:val="18"/>
+                <w:sz w:val="16"/>
+                <w:szCs w:val="16"/>
               </w:rPr>
               <w:tab/>
             </w:r>
@@ -1255,8 +1270,8 @@
                 <w:rFonts w:ascii="Times New Roman" w:hAnsi="Times New Roman" w:cs="Times New Roman"/>
                 <w:noProof/>
                 <w:webHidden/>
-                <w:sz w:val="18"/>
-                <w:szCs w:val="18"/>
+                <w:sz w:val="16"/>
+                <w:szCs w:val="16"/>
               </w:rPr>
               <w:fldChar w:fldCharType="begin"/>
             </w:r>
@@ -1265,18 +1280,18 @@
                 <w:rFonts w:ascii="Times New Roman" w:hAnsi="Times New Roman" w:cs="Times New Roman"/>
                 <w:noProof/>
                 <w:webHidden/>
-                <w:sz w:val="18"/>
-                <w:szCs w:val="18"/>
-              </w:rPr>
-              <w:instrText xml:space="preserve"> PAGEREF _Toc234187694 \h </w:instrText>
+                <w:sz w:val="16"/>
+                <w:szCs w:val="16"/>
+              </w:rPr>
+              <w:instrText xml:space="preserve"> PAGEREF _Toc234190909 \h </w:instrText>
             </w:r>
             <w:r>
               <w:rPr>
                 <w:rFonts w:ascii="Times New Roman" w:hAnsi="Times New Roman" w:cs="Times New Roman"/>
                 <w:noProof/>
                 <w:webHidden/>
-                <w:sz w:val="18"/>
-                <w:szCs w:val="18"/>
+                <w:sz w:val="16"/>
+                <w:szCs w:val="16"/>
               </w:rPr>
             </w:r>
             <w:r>
@@ -1284,8 +1299,8 @@
                 <w:rFonts w:ascii="Times New Roman" w:hAnsi="Times New Roman" w:cs="Times New Roman"/>
                 <w:noProof/>
                 <w:webHidden/>
-                <w:sz w:val="18"/>
-                <w:szCs w:val="18"/>
+                <w:sz w:val="16"/>
+                <w:szCs w:val="16"/>
               </w:rPr>
               <w:fldChar w:fldCharType="separate"/>
             </w:r>
@@ -1294,18 +1309,18 @@
                 <w:rFonts w:ascii="Times New Roman" w:hAnsi="Times New Roman" w:cs="Times New Roman"/>
                 <w:noProof/>
                 <w:webHidden/>
-                <w:sz w:val="18"/>
-                <w:szCs w:val="18"/>
-              </w:rPr>
-              <w:t>2</w:t>
+                <w:sz w:val="16"/>
+                <w:szCs w:val="16"/>
+              </w:rPr>
+              <w:t>3</w:t>
             </w:r>
             <w:r>
               <w:rPr>
                 <w:rFonts w:ascii="Times New Roman" w:hAnsi="Times New Roman" w:cs="Times New Roman"/>
                 <w:noProof/>
                 <w:webHidden/>
-                <w:sz w:val="18"/>
-                <w:szCs w:val="18"/>
+                <w:sz w:val="16"/>
+                <w:szCs w:val="16"/>
               </w:rPr>
               <w:fldChar w:fldCharType="end"/>
             </w:r>
@@ -1319,29 +1334,31 @@
               <w:tab w:val="right" w:leader="dot" w:pos="8494"/>
             </w:tabs>
             <w:rPr>
-              <w:rFonts w:ascii="Times New Roman" w:hAnsi="Times New Roman" w:cs="Times New Roman"/>
+              <w:rFonts w:ascii="Times New Roman" w:eastAsiaTheme="minorEastAsia" w:hAnsi="Times New Roman" w:cs="Times New Roman"/>
               <w:noProof/>
-              <w:sz w:val="18"/>
-              <w:szCs w:val="18"/>
+              <w:sz w:val="16"/>
+              <w:szCs w:val="16"/>
+              <w:lang w:eastAsia="es-EC"/>
             </w:rPr>
           </w:pPr>
-          <w:hyperlink w:anchor="_Toc234187695" w:history="1">
+          <w:hyperlink w:anchor="_Toc234190910" w:history="1">
             <w:r>
               <w:rPr>
                 <w:rStyle w:val="Hipervnculo"/>
                 <w:rFonts w:ascii="Times New Roman" w:hAnsi="Times New Roman" w:cs="Times New Roman"/>
                 <w:noProof/>
-                <w:sz w:val="18"/>
-                <w:szCs w:val="18"/>
+                <w:sz w:val="16"/>
+                <w:szCs w:val="16"/>
               </w:rPr>
               <w:t>6.</w:t>
             </w:r>
             <w:r>
               <w:rPr>
-                <w:rFonts w:ascii="Times New Roman" w:hAnsi="Times New Roman" w:cs="Times New Roman"/>
+                <w:rFonts w:ascii="Times New Roman" w:eastAsiaTheme="minorEastAsia" w:hAnsi="Times New Roman" w:cs="Times New Roman"/>
                 <w:noProof/>
-                <w:sz w:val="18"/>
-                <w:szCs w:val="18"/>
+                <w:sz w:val="16"/>
+                <w:szCs w:val="16"/>
+                <w:lang w:eastAsia="es-EC"/>
               </w:rPr>
               <w:tab/>
             </w:r>
@@ -1350,18 +1367,18 @@
                 <w:rStyle w:val="Hipervnculo"/>
                 <w:rFonts w:ascii="Times New Roman" w:hAnsi="Times New Roman" w:cs="Times New Roman"/>
                 <w:noProof/>
-                <w:sz w:val="18"/>
-                <w:szCs w:val="18"/>
-              </w:rPr>
-              <w:t>Requerimientos del diseño</w:t>
+                <w:sz w:val="16"/>
+                <w:szCs w:val="16"/>
+              </w:rPr>
+              <w:t>Descripción del cliente</w:t>
             </w:r>
             <w:r>
               <w:rPr>
                 <w:rFonts w:ascii="Times New Roman" w:hAnsi="Times New Roman" w:cs="Times New Roman"/>
                 <w:noProof/>
                 <w:webHidden/>
-                <w:sz w:val="18"/>
-                <w:szCs w:val="18"/>
+                <w:sz w:val="16"/>
+                <w:szCs w:val="16"/>
               </w:rPr>
               <w:tab/>
             </w:r>
@@ -1370,8 +1387,8 @@
                 <w:rFonts w:ascii="Times New Roman" w:hAnsi="Times New Roman" w:cs="Times New Roman"/>
                 <w:noProof/>
                 <w:webHidden/>
-                <w:sz w:val="18"/>
-                <w:szCs w:val="18"/>
+                <w:sz w:val="16"/>
+                <w:szCs w:val="16"/>
               </w:rPr>
               <w:fldChar w:fldCharType="begin"/>
             </w:r>
@@ -1380,18 +1397,18 @@
                 <w:rFonts w:ascii="Times New Roman" w:hAnsi="Times New Roman" w:cs="Times New Roman"/>
                 <w:noProof/>
                 <w:webHidden/>
-                <w:sz w:val="18"/>
-                <w:szCs w:val="18"/>
-              </w:rPr>
-              <w:instrText xml:space="preserve"> PAGEREF _Toc234187695 \h </w:instrText>
+                <w:sz w:val="16"/>
+                <w:szCs w:val="16"/>
+              </w:rPr>
+              <w:instrText xml:space="preserve"> PAGEREF _Toc234190910 \h </w:instrText>
             </w:r>
             <w:r>
               <w:rPr>
                 <w:rFonts w:ascii="Times New Roman" w:hAnsi="Times New Roman" w:cs="Times New Roman"/>
                 <w:noProof/>
                 <w:webHidden/>
-                <w:sz w:val="18"/>
-                <w:szCs w:val="18"/>
+                <w:sz w:val="16"/>
+                <w:szCs w:val="16"/>
               </w:rPr>
             </w:r>
             <w:r>
@@ -1399,8 +1416,8 @@
                 <w:rFonts w:ascii="Times New Roman" w:hAnsi="Times New Roman" w:cs="Times New Roman"/>
                 <w:noProof/>
                 <w:webHidden/>
-                <w:sz w:val="18"/>
-                <w:szCs w:val="18"/>
+                <w:sz w:val="16"/>
+                <w:szCs w:val="16"/>
               </w:rPr>
               <w:fldChar w:fldCharType="separate"/>
             </w:r>
@@ -1409,8 +1426,8 @@
                 <w:rFonts w:ascii="Times New Roman" w:hAnsi="Times New Roman" w:cs="Times New Roman"/>
                 <w:noProof/>
                 <w:webHidden/>
-                <w:sz w:val="18"/>
-                <w:szCs w:val="18"/>
+                <w:sz w:val="16"/>
+                <w:szCs w:val="16"/>
               </w:rPr>
               <w:t>3</w:t>
             </w:r>
@@ -1419,8 +1436,8 @@
                 <w:rFonts w:ascii="Times New Roman" w:hAnsi="Times New Roman" w:cs="Times New Roman"/>
                 <w:noProof/>
                 <w:webHidden/>
-                <w:sz w:val="18"/>
-                <w:szCs w:val="18"/>
+                <w:sz w:val="16"/>
+                <w:szCs w:val="16"/>
               </w:rPr>
               <w:fldChar w:fldCharType="end"/>
             </w:r>
@@ -1434,29 +1451,31 @@
               <w:tab w:val="right" w:leader="dot" w:pos="8494"/>
             </w:tabs>
             <w:rPr>
-              <w:rFonts w:ascii="Times New Roman" w:hAnsi="Times New Roman" w:cs="Times New Roman"/>
+              <w:rFonts w:ascii="Times New Roman" w:eastAsiaTheme="minorEastAsia" w:hAnsi="Times New Roman" w:cs="Times New Roman"/>
               <w:noProof/>
-              <w:sz w:val="18"/>
-              <w:szCs w:val="18"/>
+              <w:sz w:val="16"/>
+              <w:szCs w:val="16"/>
+              <w:lang w:eastAsia="es-EC"/>
             </w:rPr>
           </w:pPr>
-          <w:hyperlink w:anchor="_Toc234187696" w:history="1">
+          <w:hyperlink w:anchor="_Toc234190911" w:history="1">
             <w:r>
               <w:rPr>
                 <w:rStyle w:val="Hipervnculo"/>
                 <w:rFonts w:ascii="Times New Roman" w:hAnsi="Times New Roman" w:cs="Times New Roman"/>
                 <w:noProof/>
-                <w:sz w:val="18"/>
-                <w:szCs w:val="18"/>
+                <w:sz w:val="16"/>
+                <w:szCs w:val="16"/>
               </w:rPr>
               <w:t>7.</w:t>
             </w:r>
             <w:r>
               <w:rPr>
-                <w:rFonts w:ascii="Times New Roman" w:hAnsi="Times New Roman" w:cs="Times New Roman"/>
+                <w:rFonts w:ascii="Times New Roman" w:eastAsiaTheme="minorEastAsia" w:hAnsi="Times New Roman" w:cs="Times New Roman"/>
                 <w:noProof/>
-                <w:sz w:val="18"/>
-                <w:szCs w:val="18"/>
+                <w:sz w:val="16"/>
+                <w:szCs w:val="16"/>
+                <w:lang w:eastAsia="es-EC"/>
               </w:rPr>
               <w:tab/>
             </w:r>
@@ -1465,18 +1484,18 @@
                 <w:rStyle w:val="Hipervnculo"/>
                 <w:rFonts w:ascii="Times New Roman" w:hAnsi="Times New Roman" w:cs="Times New Roman"/>
                 <w:noProof/>
-                <w:sz w:val="18"/>
-                <w:szCs w:val="18"/>
-              </w:rPr>
-              <w:t>Boceto o wireframe</w:t>
+                <w:sz w:val="16"/>
+                <w:szCs w:val="16"/>
+              </w:rPr>
+              <w:t>Requerimientos del diseño</w:t>
             </w:r>
             <w:r>
               <w:rPr>
                 <w:rFonts w:ascii="Times New Roman" w:hAnsi="Times New Roman" w:cs="Times New Roman"/>
                 <w:noProof/>
                 <w:webHidden/>
-                <w:sz w:val="18"/>
-                <w:szCs w:val="18"/>
+                <w:sz w:val="16"/>
+                <w:szCs w:val="16"/>
               </w:rPr>
               <w:tab/>
             </w:r>
@@ -1485,8 +1504,8 @@
                 <w:rFonts w:ascii="Times New Roman" w:hAnsi="Times New Roman" w:cs="Times New Roman"/>
                 <w:noProof/>
                 <w:webHidden/>
-                <w:sz w:val="18"/>
-                <w:szCs w:val="18"/>
+                <w:sz w:val="16"/>
+                <w:szCs w:val="16"/>
               </w:rPr>
               <w:fldChar w:fldCharType="begin"/>
             </w:r>
@@ -1495,18 +1514,18 @@
                 <w:rFonts w:ascii="Times New Roman" w:hAnsi="Times New Roman" w:cs="Times New Roman"/>
                 <w:noProof/>
                 <w:webHidden/>
-                <w:sz w:val="18"/>
-                <w:szCs w:val="18"/>
-              </w:rPr>
-              <w:instrText xml:space="preserve"> PAGEREF _Toc234187696 \h </w:instrText>
+                <w:sz w:val="16"/>
+                <w:szCs w:val="16"/>
+              </w:rPr>
+              <w:instrText xml:space="preserve"> PAGEREF _Toc234190911 \h </w:instrText>
             </w:r>
             <w:r>
               <w:rPr>
                 <w:rFonts w:ascii="Times New Roman" w:hAnsi="Times New Roman" w:cs="Times New Roman"/>
                 <w:noProof/>
                 <w:webHidden/>
-                <w:sz w:val="18"/>
-                <w:szCs w:val="18"/>
+                <w:sz w:val="16"/>
+                <w:szCs w:val="16"/>
               </w:rPr>
             </w:r>
             <w:r>
@@ -1514,8 +1533,8 @@
                 <w:rFonts w:ascii="Times New Roman" w:hAnsi="Times New Roman" w:cs="Times New Roman"/>
                 <w:noProof/>
                 <w:webHidden/>
-                <w:sz w:val="18"/>
-                <w:szCs w:val="18"/>
+                <w:sz w:val="16"/>
+                <w:szCs w:val="16"/>
               </w:rPr>
               <w:fldChar w:fldCharType="separate"/>
             </w:r>
@@ -1524,8 +1543,8 @@
                 <w:rFonts w:ascii="Times New Roman" w:hAnsi="Times New Roman" w:cs="Times New Roman"/>
                 <w:noProof/>
                 <w:webHidden/>
-                <w:sz w:val="18"/>
-                <w:szCs w:val="18"/>
+                <w:sz w:val="16"/>
+                <w:szCs w:val="16"/>
               </w:rPr>
               <w:t>4</w:t>
             </w:r>
@@ -1534,8 +1553,8 @@
                 <w:rFonts w:ascii="Times New Roman" w:hAnsi="Times New Roman" w:cs="Times New Roman"/>
                 <w:noProof/>
                 <w:webHidden/>
-                <w:sz w:val="18"/>
-                <w:szCs w:val="18"/>
+                <w:sz w:val="16"/>
+                <w:szCs w:val="16"/>
               </w:rPr>
               <w:fldChar w:fldCharType="end"/>
             </w:r>
@@ -1549,29 +1568,31 @@
               <w:tab w:val="right" w:leader="dot" w:pos="8494"/>
             </w:tabs>
             <w:rPr>
-              <w:rFonts w:ascii="Times New Roman" w:hAnsi="Times New Roman" w:cs="Times New Roman"/>
+              <w:rFonts w:ascii="Times New Roman" w:eastAsiaTheme="minorEastAsia" w:hAnsi="Times New Roman" w:cs="Times New Roman"/>
               <w:noProof/>
-              <w:sz w:val="18"/>
-              <w:szCs w:val="18"/>
+              <w:sz w:val="16"/>
+              <w:szCs w:val="16"/>
+              <w:lang w:eastAsia="es-EC"/>
             </w:rPr>
           </w:pPr>
-          <w:hyperlink w:anchor="_Toc234187697" w:history="1">
+          <w:hyperlink w:anchor="_Toc234190912" w:history="1">
             <w:r>
               <w:rPr>
                 <w:rStyle w:val="Hipervnculo"/>
                 <w:rFonts w:ascii="Times New Roman" w:hAnsi="Times New Roman" w:cs="Times New Roman"/>
                 <w:noProof/>
-                <w:sz w:val="18"/>
-                <w:szCs w:val="18"/>
+                <w:sz w:val="16"/>
+                <w:szCs w:val="16"/>
               </w:rPr>
               <w:t>8.</w:t>
             </w:r>
             <w:r>
               <w:rPr>
-                <w:rFonts w:ascii="Times New Roman" w:hAnsi="Times New Roman" w:cs="Times New Roman"/>
+                <w:rFonts w:ascii="Times New Roman" w:eastAsiaTheme="minorEastAsia" w:hAnsi="Times New Roman" w:cs="Times New Roman"/>
                 <w:noProof/>
-                <w:sz w:val="18"/>
-                <w:szCs w:val="18"/>
+                <w:sz w:val="16"/>
+                <w:szCs w:val="16"/>
+                <w:lang w:eastAsia="es-EC"/>
               </w:rPr>
               <w:tab/>
             </w:r>
@@ -1580,18 +1601,18 @@
                 <w:rStyle w:val="Hipervnculo"/>
                 <w:rFonts w:ascii="Times New Roman" w:hAnsi="Times New Roman" w:cs="Times New Roman"/>
                 <w:noProof/>
-                <w:sz w:val="18"/>
-                <w:szCs w:val="18"/>
-              </w:rPr>
-              <w:t>Paleta de colores</w:t>
+                <w:sz w:val="16"/>
+                <w:szCs w:val="16"/>
+              </w:rPr>
+              <w:t>Boceto o wireframe</w:t>
             </w:r>
             <w:r>
               <w:rPr>
                 <w:rFonts w:ascii="Times New Roman" w:hAnsi="Times New Roman" w:cs="Times New Roman"/>
                 <w:noProof/>
                 <w:webHidden/>
-                <w:sz w:val="18"/>
-                <w:szCs w:val="18"/>
+                <w:sz w:val="16"/>
+                <w:szCs w:val="16"/>
               </w:rPr>
               <w:tab/>
             </w:r>
@@ -1600,8 +1621,8 @@
                 <w:rFonts w:ascii="Times New Roman" w:hAnsi="Times New Roman" w:cs="Times New Roman"/>
                 <w:noProof/>
                 <w:webHidden/>
-                <w:sz w:val="18"/>
-                <w:szCs w:val="18"/>
+                <w:sz w:val="16"/>
+                <w:szCs w:val="16"/>
               </w:rPr>
               <w:fldChar w:fldCharType="begin"/>
             </w:r>
@@ -1610,18 +1631,18 @@
                 <w:rFonts w:ascii="Times New Roman" w:hAnsi="Times New Roman" w:cs="Times New Roman"/>
                 <w:noProof/>
                 <w:webHidden/>
-                <w:sz w:val="18"/>
-                <w:szCs w:val="18"/>
-              </w:rPr>
-              <w:instrText xml:space="preserve"> PAGEREF _Toc234187697 \h </w:instrText>
+                <w:sz w:val="16"/>
+                <w:szCs w:val="16"/>
+              </w:rPr>
+              <w:instrText xml:space="preserve"> PAGEREF _Toc234190912 \h </w:instrText>
             </w:r>
             <w:r>
               <w:rPr>
                 <w:rFonts w:ascii="Times New Roman" w:hAnsi="Times New Roman" w:cs="Times New Roman"/>
                 <w:noProof/>
                 <w:webHidden/>
-                <w:sz w:val="18"/>
-                <w:szCs w:val="18"/>
+                <w:sz w:val="16"/>
+                <w:szCs w:val="16"/>
               </w:rPr>
             </w:r>
             <w:r>
@@ -1629,8 +1650,8 @@
                 <w:rFonts w:ascii="Times New Roman" w:hAnsi="Times New Roman" w:cs="Times New Roman"/>
                 <w:noProof/>
                 <w:webHidden/>
-                <w:sz w:val="18"/>
-                <w:szCs w:val="18"/>
+                <w:sz w:val="16"/>
+                <w:szCs w:val="16"/>
               </w:rPr>
               <w:fldChar w:fldCharType="separate"/>
             </w:r>
@@ -1639,18 +1660,18 @@
                 <w:rFonts w:ascii="Times New Roman" w:hAnsi="Times New Roman" w:cs="Times New Roman"/>
                 <w:noProof/>
                 <w:webHidden/>
-                <w:sz w:val="18"/>
-                <w:szCs w:val="18"/>
-              </w:rPr>
-              <w:t>5</w:t>
+                <w:sz w:val="16"/>
+                <w:szCs w:val="16"/>
+              </w:rPr>
+              <w:t>4</w:t>
             </w:r>
             <w:r>
               <w:rPr>
                 <w:rFonts w:ascii="Times New Roman" w:hAnsi="Times New Roman" w:cs="Times New Roman"/>
                 <w:noProof/>
                 <w:webHidden/>
-                <w:sz w:val="18"/>
-                <w:szCs w:val="18"/>
+                <w:sz w:val="16"/>
+                <w:szCs w:val="16"/>
               </w:rPr>
               <w:fldChar w:fldCharType="end"/>
             </w:r>
@@ -1664,29 +1685,31 @@
               <w:tab w:val="right" w:leader="dot" w:pos="8494"/>
             </w:tabs>
             <w:rPr>
-              <w:rFonts w:ascii="Times New Roman" w:hAnsi="Times New Roman" w:cs="Times New Roman"/>
+              <w:rFonts w:ascii="Times New Roman" w:eastAsiaTheme="minorEastAsia" w:hAnsi="Times New Roman" w:cs="Times New Roman"/>
               <w:noProof/>
-              <w:sz w:val="18"/>
-              <w:szCs w:val="18"/>
+              <w:sz w:val="16"/>
+              <w:szCs w:val="16"/>
+              <w:lang w:eastAsia="es-EC"/>
             </w:rPr>
           </w:pPr>
-          <w:hyperlink w:anchor="_Toc234187698" w:history="1">
+          <w:hyperlink w:anchor="_Toc234190913" w:history="1">
             <w:r>
               <w:rPr>
                 <w:rStyle w:val="Hipervnculo"/>
                 <w:rFonts w:ascii="Times New Roman" w:hAnsi="Times New Roman" w:cs="Times New Roman"/>
                 <w:noProof/>
-                <w:sz w:val="18"/>
-                <w:szCs w:val="18"/>
+                <w:sz w:val="16"/>
+                <w:szCs w:val="16"/>
               </w:rPr>
               <w:t>9.</w:t>
             </w:r>
             <w:r>
               <w:rPr>
-                <w:rFonts w:ascii="Times New Roman" w:hAnsi="Times New Roman" w:cs="Times New Roman"/>
+                <w:rFonts w:ascii="Times New Roman" w:eastAsiaTheme="minorEastAsia" w:hAnsi="Times New Roman" w:cs="Times New Roman"/>
                 <w:noProof/>
-                <w:sz w:val="18"/>
-                <w:szCs w:val="18"/>
+                <w:sz w:val="16"/>
+                <w:szCs w:val="16"/>
+                <w:lang w:eastAsia="es-EC"/>
               </w:rPr>
               <w:tab/>
             </w:r>
@@ -1695,18 +1718,18 @@
                 <w:rStyle w:val="Hipervnculo"/>
                 <w:rFonts w:ascii="Times New Roman" w:hAnsi="Times New Roman" w:cs="Times New Roman"/>
                 <w:noProof/>
-                <w:sz w:val="18"/>
-                <w:szCs w:val="18"/>
-              </w:rPr>
-              <w:t>Tipografía e iconos</w:t>
+                <w:sz w:val="16"/>
+                <w:szCs w:val="16"/>
+              </w:rPr>
+              <w:t>Paleta de colores</w:t>
             </w:r>
             <w:r>
               <w:rPr>
                 <w:rFonts w:ascii="Times New Roman" w:hAnsi="Times New Roman" w:cs="Times New Roman"/>
                 <w:noProof/>
                 <w:webHidden/>
-                <w:sz w:val="18"/>
-                <w:szCs w:val="18"/>
+                <w:sz w:val="16"/>
+                <w:szCs w:val="16"/>
               </w:rPr>
               <w:tab/>
             </w:r>
@@ -1715,8 +1738,8 @@
                 <w:rFonts w:ascii="Times New Roman" w:hAnsi="Times New Roman" w:cs="Times New Roman"/>
                 <w:noProof/>
                 <w:webHidden/>
-                <w:sz w:val="18"/>
-                <w:szCs w:val="18"/>
+                <w:sz w:val="16"/>
+                <w:szCs w:val="16"/>
               </w:rPr>
               <w:fldChar w:fldCharType="begin"/>
             </w:r>
@@ -1725,18 +1748,18 @@
                 <w:rFonts w:ascii="Times New Roman" w:hAnsi="Times New Roman" w:cs="Times New Roman"/>
                 <w:noProof/>
                 <w:webHidden/>
-                <w:sz w:val="18"/>
-                <w:szCs w:val="18"/>
-              </w:rPr>
-              <w:instrText xml:space="preserve"> PAGEREF _Toc234187698 \h </w:instrText>
+                <w:sz w:val="16"/>
+                <w:szCs w:val="16"/>
+              </w:rPr>
+              <w:instrText xml:space="preserve"> PAGEREF _Toc234190913 \h </w:instrText>
             </w:r>
             <w:r>
               <w:rPr>
                 <w:rFonts w:ascii="Times New Roman" w:hAnsi="Times New Roman" w:cs="Times New Roman"/>
                 <w:noProof/>
                 <w:webHidden/>
-                <w:sz w:val="18"/>
-                <w:szCs w:val="18"/>
+                <w:sz w:val="16"/>
+                <w:szCs w:val="16"/>
               </w:rPr>
             </w:r>
             <w:r>
@@ -1744,8 +1767,8 @@
                 <w:rFonts w:ascii="Times New Roman" w:hAnsi="Times New Roman" w:cs="Times New Roman"/>
                 <w:noProof/>
                 <w:webHidden/>
-                <w:sz w:val="18"/>
-                <w:szCs w:val="18"/>
+                <w:sz w:val="16"/>
+                <w:szCs w:val="16"/>
               </w:rPr>
               <w:fldChar w:fldCharType="separate"/>
             </w:r>
@@ -1754,8 +1777,8 @@
                 <w:rFonts w:ascii="Times New Roman" w:hAnsi="Times New Roman" w:cs="Times New Roman"/>
                 <w:noProof/>
                 <w:webHidden/>
-                <w:sz w:val="18"/>
-                <w:szCs w:val="18"/>
+                <w:sz w:val="16"/>
+                <w:szCs w:val="16"/>
               </w:rPr>
               <w:t>6</w:t>
             </w:r>
@@ -1764,8 +1787,8 @@
                 <w:rFonts w:ascii="Times New Roman" w:hAnsi="Times New Roman" w:cs="Times New Roman"/>
                 <w:noProof/>
                 <w:webHidden/>
-                <w:sz w:val="18"/>
-                <w:szCs w:val="18"/>
+                <w:sz w:val="16"/>
+                <w:szCs w:val="16"/>
               </w:rPr>
               <w:fldChar w:fldCharType="end"/>
             </w:r>
@@ -1779,29 +1802,31 @@
               <w:tab w:val="right" w:leader="dot" w:pos="8494"/>
             </w:tabs>
             <w:rPr>
-              <w:rFonts w:ascii="Times New Roman" w:hAnsi="Times New Roman" w:cs="Times New Roman"/>
+              <w:rFonts w:ascii="Times New Roman" w:eastAsiaTheme="minorEastAsia" w:hAnsi="Times New Roman" w:cs="Times New Roman"/>
               <w:noProof/>
-              <w:sz w:val="18"/>
-              <w:szCs w:val="18"/>
+              <w:sz w:val="16"/>
+              <w:szCs w:val="16"/>
+              <w:lang w:eastAsia="es-EC"/>
             </w:rPr>
           </w:pPr>
-          <w:hyperlink w:anchor="_Toc234187699" w:history="1">
+          <w:hyperlink w:anchor="_Toc234190914" w:history="1">
             <w:r>
               <w:rPr>
                 <w:rStyle w:val="Hipervnculo"/>
                 <w:rFonts w:ascii="Times New Roman" w:hAnsi="Times New Roman" w:cs="Times New Roman"/>
                 <w:noProof/>
-                <w:sz w:val="18"/>
-                <w:szCs w:val="18"/>
+                <w:sz w:val="16"/>
+                <w:szCs w:val="16"/>
               </w:rPr>
               <w:t>10.</w:t>
             </w:r>
             <w:r>
               <w:rPr>
-                <w:rFonts w:ascii="Times New Roman" w:hAnsi="Times New Roman" w:cs="Times New Roman"/>
+                <w:rFonts w:ascii="Times New Roman" w:eastAsiaTheme="minorEastAsia" w:hAnsi="Times New Roman" w:cs="Times New Roman"/>
                 <w:noProof/>
-                <w:sz w:val="18"/>
-                <w:szCs w:val="18"/>
+                <w:sz w:val="16"/>
+                <w:szCs w:val="16"/>
+                <w:lang w:eastAsia="es-EC"/>
               </w:rPr>
               <w:tab/>
             </w:r>
@@ -1810,18 +1835,18 @@
                 <w:rStyle w:val="Hipervnculo"/>
                 <w:rFonts w:ascii="Times New Roman" w:hAnsi="Times New Roman" w:cs="Times New Roman"/>
                 <w:noProof/>
-                <w:sz w:val="18"/>
-                <w:szCs w:val="18"/>
-              </w:rPr>
-              <w:t>Estructura del proyecto</w:t>
+                <w:sz w:val="16"/>
+                <w:szCs w:val="16"/>
+              </w:rPr>
+              <w:t>Tipografía e iconos</w:t>
             </w:r>
             <w:r>
               <w:rPr>
                 <w:rFonts w:ascii="Times New Roman" w:hAnsi="Times New Roman" w:cs="Times New Roman"/>
                 <w:noProof/>
                 <w:webHidden/>
-                <w:sz w:val="18"/>
-                <w:szCs w:val="18"/>
+                <w:sz w:val="16"/>
+                <w:szCs w:val="16"/>
               </w:rPr>
               <w:tab/>
             </w:r>
@@ -1830,8 +1855,8 @@
                 <w:rFonts w:ascii="Times New Roman" w:hAnsi="Times New Roman" w:cs="Times New Roman"/>
                 <w:noProof/>
                 <w:webHidden/>
-                <w:sz w:val="18"/>
-                <w:szCs w:val="18"/>
+                <w:sz w:val="16"/>
+                <w:szCs w:val="16"/>
               </w:rPr>
               <w:fldChar w:fldCharType="begin"/>
             </w:r>
@@ -1840,18 +1865,18 @@
                 <w:rFonts w:ascii="Times New Roman" w:hAnsi="Times New Roman" w:cs="Times New Roman"/>
                 <w:noProof/>
                 <w:webHidden/>
-                <w:sz w:val="18"/>
-                <w:szCs w:val="18"/>
-              </w:rPr>
-              <w:instrText xml:space="preserve"> PAGEREF _Toc234187699 \h </w:instrText>
+                <w:sz w:val="16"/>
+                <w:szCs w:val="16"/>
+              </w:rPr>
+              <w:instrText xml:space="preserve"> PAGEREF _Toc234190914 \h </w:instrText>
             </w:r>
             <w:r>
               <w:rPr>
                 <w:rFonts w:ascii="Times New Roman" w:hAnsi="Times New Roman" w:cs="Times New Roman"/>
                 <w:noProof/>
                 <w:webHidden/>
-                <w:sz w:val="18"/>
-                <w:szCs w:val="18"/>
+                <w:sz w:val="16"/>
+                <w:szCs w:val="16"/>
               </w:rPr>
             </w:r>
             <w:r>
@@ -1859,8 +1884,8 @@
                 <w:rFonts w:ascii="Times New Roman" w:hAnsi="Times New Roman" w:cs="Times New Roman"/>
                 <w:noProof/>
                 <w:webHidden/>
-                <w:sz w:val="18"/>
-                <w:szCs w:val="18"/>
+                <w:sz w:val="16"/>
+                <w:szCs w:val="16"/>
               </w:rPr>
               <w:fldChar w:fldCharType="separate"/>
             </w:r>
@@ -1869,18 +1894,18 @@
                 <w:rFonts w:ascii="Times New Roman" w:hAnsi="Times New Roman" w:cs="Times New Roman"/>
                 <w:noProof/>
                 <w:webHidden/>
-                <w:sz w:val="18"/>
-                <w:szCs w:val="18"/>
-              </w:rPr>
-              <w:t>10</w:t>
+                <w:sz w:val="16"/>
+                <w:szCs w:val="16"/>
+              </w:rPr>
+              <w:t>7</w:t>
             </w:r>
             <w:r>
               <w:rPr>
                 <w:rFonts w:ascii="Times New Roman" w:hAnsi="Times New Roman" w:cs="Times New Roman"/>
                 <w:noProof/>
                 <w:webHidden/>
-                <w:sz w:val="18"/>
-                <w:szCs w:val="18"/>
+                <w:sz w:val="16"/>
+                <w:szCs w:val="16"/>
               </w:rPr>
               <w:fldChar w:fldCharType="end"/>
             </w:r>
@@ -1894,29 +1919,31 @@
               <w:tab w:val="right" w:leader="dot" w:pos="8494"/>
             </w:tabs>
             <w:rPr>
-              <w:rFonts w:ascii="Times New Roman" w:hAnsi="Times New Roman" w:cs="Times New Roman"/>
+              <w:rFonts w:ascii="Times New Roman" w:eastAsiaTheme="minorEastAsia" w:hAnsi="Times New Roman" w:cs="Times New Roman"/>
               <w:noProof/>
-              <w:sz w:val="18"/>
-              <w:szCs w:val="18"/>
+              <w:sz w:val="16"/>
+              <w:szCs w:val="16"/>
+              <w:lang w:eastAsia="es-EC"/>
             </w:rPr>
           </w:pPr>
-          <w:hyperlink w:anchor="_Toc234187700" w:history="1">
+          <w:hyperlink w:anchor="_Toc234190915" w:history="1">
             <w:r>
               <w:rPr>
                 <w:rStyle w:val="Hipervnculo"/>
                 <w:rFonts w:ascii="Times New Roman" w:hAnsi="Times New Roman" w:cs="Times New Roman"/>
                 <w:noProof/>
-                <w:sz w:val="18"/>
-                <w:szCs w:val="18"/>
+                <w:sz w:val="16"/>
+                <w:szCs w:val="16"/>
               </w:rPr>
               <w:t>11.</w:t>
             </w:r>
             <w:r>
               <w:rPr>
-                <w:rFonts w:ascii="Times New Roman" w:hAnsi="Times New Roman" w:cs="Times New Roman"/>
+                <w:rFonts w:ascii="Times New Roman" w:eastAsiaTheme="minorEastAsia" w:hAnsi="Times New Roman" w:cs="Times New Roman"/>
                 <w:noProof/>
-                <w:sz w:val="18"/>
-                <w:szCs w:val="18"/>
+                <w:sz w:val="16"/>
+                <w:szCs w:val="16"/>
+                <w:lang w:eastAsia="es-EC"/>
               </w:rPr>
               <w:tab/>
             </w:r>
@@ -1925,18 +1952,18 @@
                 <w:rStyle w:val="Hipervnculo"/>
                 <w:rFonts w:ascii="Times New Roman" w:hAnsi="Times New Roman" w:cs="Times New Roman"/>
                 <w:noProof/>
-                <w:sz w:val="18"/>
-                <w:szCs w:val="18"/>
-              </w:rPr>
-              <w:t>Estructura semántica</w:t>
+                <w:sz w:val="16"/>
+                <w:szCs w:val="16"/>
+              </w:rPr>
+              <w:t>Estructura del proyecto</w:t>
             </w:r>
             <w:r>
               <w:rPr>
                 <w:rFonts w:ascii="Times New Roman" w:hAnsi="Times New Roman" w:cs="Times New Roman"/>
                 <w:noProof/>
                 <w:webHidden/>
-                <w:sz w:val="18"/>
-                <w:szCs w:val="18"/>
+                <w:sz w:val="16"/>
+                <w:szCs w:val="16"/>
               </w:rPr>
               <w:tab/>
             </w:r>
@@ -1945,8 +1972,8 @@
                 <w:rFonts w:ascii="Times New Roman" w:hAnsi="Times New Roman" w:cs="Times New Roman"/>
                 <w:noProof/>
                 <w:webHidden/>
-                <w:sz w:val="18"/>
-                <w:szCs w:val="18"/>
+                <w:sz w:val="16"/>
+                <w:szCs w:val="16"/>
               </w:rPr>
               <w:fldChar w:fldCharType="begin"/>
             </w:r>
@@ -1955,18 +1982,18 @@
                 <w:rFonts w:ascii="Times New Roman" w:hAnsi="Times New Roman" w:cs="Times New Roman"/>
                 <w:noProof/>
                 <w:webHidden/>
-                <w:sz w:val="18"/>
-                <w:szCs w:val="18"/>
-              </w:rPr>
-              <w:instrText xml:space="preserve"> PAGEREF _Toc234187700 \h </w:instrText>
+                <w:sz w:val="16"/>
+                <w:szCs w:val="16"/>
+              </w:rPr>
+              <w:instrText xml:space="preserve"> PAGEREF _Toc234190915 \h </w:instrText>
             </w:r>
             <w:r>
               <w:rPr>
                 <w:rFonts w:ascii="Times New Roman" w:hAnsi="Times New Roman" w:cs="Times New Roman"/>
                 <w:noProof/>
                 <w:webHidden/>
-                <w:sz w:val="18"/>
-                <w:szCs w:val="18"/>
+                <w:sz w:val="16"/>
+                <w:szCs w:val="16"/>
               </w:rPr>
             </w:r>
             <w:r>
@@ -1974,8 +2001,8 @@
                 <w:rFonts w:ascii="Times New Roman" w:hAnsi="Times New Roman" w:cs="Times New Roman"/>
                 <w:noProof/>
                 <w:webHidden/>
-                <w:sz w:val="18"/>
-                <w:szCs w:val="18"/>
+                <w:sz w:val="16"/>
+                <w:szCs w:val="16"/>
               </w:rPr>
               <w:fldChar w:fldCharType="separate"/>
             </w:r>
@@ -1984,18 +2011,18 @@
                 <w:rFonts w:ascii="Times New Roman" w:hAnsi="Times New Roman" w:cs="Times New Roman"/>
                 <w:noProof/>
                 <w:webHidden/>
-                <w:sz w:val="18"/>
-                <w:szCs w:val="18"/>
-              </w:rPr>
-              <w:t>10</w:t>
+                <w:sz w:val="16"/>
+                <w:szCs w:val="16"/>
+              </w:rPr>
+              <w:t>11</w:t>
             </w:r>
             <w:r>
               <w:rPr>
                 <w:rFonts w:ascii="Times New Roman" w:hAnsi="Times New Roman" w:cs="Times New Roman"/>
                 <w:noProof/>
                 <w:webHidden/>
-                <w:sz w:val="18"/>
-                <w:szCs w:val="18"/>
+                <w:sz w:val="16"/>
+                <w:szCs w:val="16"/>
               </w:rPr>
               <w:fldChar w:fldCharType="end"/>
             </w:r>
@@ -2009,29 +2036,31 @@
               <w:tab w:val="right" w:leader="dot" w:pos="8494"/>
             </w:tabs>
             <w:rPr>
-              <w:rFonts w:ascii="Times New Roman" w:hAnsi="Times New Roman" w:cs="Times New Roman"/>
+              <w:rFonts w:ascii="Times New Roman" w:eastAsiaTheme="minorEastAsia" w:hAnsi="Times New Roman" w:cs="Times New Roman"/>
               <w:noProof/>
-              <w:sz w:val="18"/>
-              <w:szCs w:val="18"/>
+              <w:sz w:val="16"/>
+              <w:szCs w:val="16"/>
+              <w:lang w:eastAsia="es-EC"/>
             </w:rPr>
           </w:pPr>
-          <w:hyperlink w:anchor="_Toc234187701" w:history="1">
+          <w:hyperlink w:anchor="_Toc234190916" w:history="1">
             <w:r>
               <w:rPr>
                 <w:rStyle w:val="Hipervnculo"/>
                 <w:rFonts w:ascii="Times New Roman" w:hAnsi="Times New Roman" w:cs="Times New Roman"/>
                 <w:noProof/>
-                <w:sz w:val="18"/>
-                <w:szCs w:val="18"/>
+                <w:sz w:val="16"/>
+                <w:szCs w:val="16"/>
               </w:rPr>
               <w:t>12.</w:t>
             </w:r>
             <w:r>
               <w:rPr>
-                <w:rFonts w:ascii="Times New Roman" w:hAnsi="Times New Roman" w:cs="Times New Roman"/>
+                <w:rFonts w:ascii="Times New Roman" w:eastAsiaTheme="minorEastAsia" w:hAnsi="Times New Roman" w:cs="Times New Roman"/>
                 <w:noProof/>
-                <w:sz w:val="18"/>
-                <w:szCs w:val="18"/>
+                <w:sz w:val="16"/>
+                <w:szCs w:val="16"/>
+                <w:lang w:eastAsia="es-EC"/>
               </w:rPr>
               <w:tab/>
             </w:r>
@@ -2040,18 +2069,18 @@
                 <w:rStyle w:val="Hipervnculo"/>
                 <w:rFonts w:ascii="Times New Roman" w:hAnsi="Times New Roman" w:cs="Times New Roman"/>
                 <w:noProof/>
-                <w:sz w:val="18"/>
-                <w:szCs w:val="18"/>
-              </w:rPr>
-              <w:t>Desarrollo con Bootstrap</w:t>
+                <w:sz w:val="16"/>
+                <w:szCs w:val="16"/>
+              </w:rPr>
+              <w:t>Estructura semántica</w:t>
             </w:r>
             <w:r>
               <w:rPr>
                 <w:rFonts w:ascii="Times New Roman" w:hAnsi="Times New Roman" w:cs="Times New Roman"/>
                 <w:noProof/>
                 <w:webHidden/>
-                <w:sz w:val="18"/>
-                <w:szCs w:val="18"/>
+                <w:sz w:val="16"/>
+                <w:szCs w:val="16"/>
               </w:rPr>
               <w:tab/>
             </w:r>
@@ -2060,8 +2089,8 @@
                 <w:rFonts w:ascii="Times New Roman" w:hAnsi="Times New Roman" w:cs="Times New Roman"/>
                 <w:noProof/>
                 <w:webHidden/>
-                <w:sz w:val="18"/>
-                <w:szCs w:val="18"/>
+                <w:sz w:val="16"/>
+                <w:szCs w:val="16"/>
               </w:rPr>
               <w:fldChar w:fldCharType="begin"/>
             </w:r>
@@ -2070,18 +2099,18 @@
                 <w:rFonts w:ascii="Times New Roman" w:hAnsi="Times New Roman" w:cs="Times New Roman"/>
                 <w:noProof/>
                 <w:webHidden/>
-                <w:sz w:val="18"/>
-                <w:szCs w:val="18"/>
-              </w:rPr>
-              <w:instrText xml:space="preserve"> PAGEREF _Toc234187701 \h </w:instrText>
+                <w:sz w:val="16"/>
+                <w:szCs w:val="16"/>
+              </w:rPr>
+              <w:instrText xml:space="preserve"> PAGEREF _Toc234190916 \h </w:instrText>
             </w:r>
             <w:r>
               <w:rPr>
                 <w:rFonts w:ascii="Times New Roman" w:hAnsi="Times New Roman" w:cs="Times New Roman"/>
                 <w:noProof/>
                 <w:webHidden/>
-                <w:sz w:val="18"/>
-                <w:szCs w:val="18"/>
+                <w:sz w:val="16"/>
+                <w:szCs w:val="16"/>
               </w:rPr>
             </w:r>
             <w:r>
@@ -2089,8 +2118,8 @@
                 <w:rFonts w:ascii="Times New Roman" w:hAnsi="Times New Roman" w:cs="Times New Roman"/>
                 <w:noProof/>
                 <w:webHidden/>
-                <w:sz w:val="18"/>
-                <w:szCs w:val="18"/>
+                <w:sz w:val="16"/>
+                <w:szCs w:val="16"/>
               </w:rPr>
               <w:fldChar w:fldCharType="separate"/>
             </w:r>
@@ -2099,18 +2128,18 @@
                 <w:rFonts w:ascii="Times New Roman" w:hAnsi="Times New Roman" w:cs="Times New Roman"/>
                 <w:noProof/>
                 <w:webHidden/>
-                <w:sz w:val="18"/>
-                <w:szCs w:val="18"/>
-              </w:rPr>
-              <w:t>11</w:t>
+                <w:sz w:val="16"/>
+                <w:szCs w:val="16"/>
+              </w:rPr>
+              <w:t>13</w:t>
             </w:r>
             <w:r>
               <w:rPr>
                 <w:rFonts w:ascii="Times New Roman" w:hAnsi="Times New Roman" w:cs="Times New Roman"/>
                 <w:noProof/>
                 <w:webHidden/>
-                <w:sz w:val="18"/>
-                <w:szCs w:val="18"/>
+                <w:sz w:val="16"/>
+                <w:szCs w:val="16"/>
               </w:rPr>
               <w:fldChar w:fldCharType="end"/>
             </w:r>
@@ -2124,29 +2153,31 @@
               <w:tab w:val="right" w:leader="dot" w:pos="8494"/>
             </w:tabs>
             <w:rPr>
-              <w:rFonts w:ascii="Times New Roman" w:hAnsi="Times New Roman" w:cs="Times New Roman"/>
+              <w:rFonts w:ascii="Times New Roman" w:eastAsiaTheme="minorEastAsia" w:hAnsi="Times New Roman" w:cs="Times New Roman"/>
               <w:noProof/>
-              <w:sz w:val="18"/>
-              <w:szCs w:val="18"/>
+              <w:sz w:val="16"/>
+              <w:szCs w:val="16"/>
+              <w:lang w:eastAsia="es-EC"/>
             </w:rPr>
           </w:pPr>
-          <w:hyperlink w:anchor="_Toc234187702" w:history="1">
+          <w:hyperlink w:anchor="_Toc234190917" w:history="1">
             <w:r>
               <w:rPr>
                 <w:rStyle w:val="Hipervnculo"/>
                 <w:rFonts w:ascii="Times New Roman" w:hAnsi="Times New Roman" w:cs="Times New Roman"/>
                 <w:noProof/>
-                <w:sz w:val="18"/>
-                <w:szCs w:val="18"/>
+                <w:sz w:val="16"/>
+                <w:szCs w:val="16"/>
               </w:rPr>
               <w:t>13.</w:t>
             </w:r>
             <w:r>
               <w:rPr>
-                <w:rFonts w:ascii="Times New Roman" w:hAnsi="Times New Roman" w:cs="Times New Roman"/>
+                <w:rFonts w:ascii="Times New Roman" w:eastAsiaTheme="minorEastAsia" w:hAnsi="Times New Roman" w:cs="Times New Roman"/>
                 <w:noProof/>
-                <w:sz w:val="18"/>
-                <w:szCs w:val="18"/>
+                <w:sz w:val="16"/>
+                <w:szCs w:val="16"/>
+                <w:lang w:eastAsia="es-EC"/>
               </w:rPr>
               <w:tab/>
             </w:r>
@@ -2155,18 +2186,18 @@
                 <w:rStyle w:val="Hipervnculo"/>
                 <w:rFonts w:ascii="Times New Roman" w:hAnsi="Times New Roman" w:cs="Times New Roman"/>
                 <w:noProof/>
-                <w:sz w:val="18"/>
-                <w:szCs w:val="18"/>
-              </w:rPr>
-              <w:t>Desarrollo del CSS externo</w:t>
+                <w:sz w:val="16"/>
+                <w:szCs w:val="16"/>
+              </w:rPr>
+              <w:t>Desarrollo con Bootstrap</w:t>
             </w:r>
             <w:r>
               <w:rPr>
                 <w:rFonts w:ascii="Times New Roman" w:hAnsi="Times New Roman" w:cs="Times New Roman"/>
                 <w:noProof/>
                 <w:webHidden/>
-                <w:sz w:val="18"/>
-                <w:szCs w:val="18"/>
+                <w:sz w:val="16"/>
+                <w:szCs w:val="16"/>
               </w:rPr>
               <w:tab/>
             </w:r>
@@ -2175,8 +2206,8 @@
                 <w:rFonts w:ascii="Times New Roman" w:hAnsi="Times New Roman" w:cs="Times New Roman"/>
                 <w:noProof/>
                 <w:webHidden/>
-                <w:sz w:val="18"/>
-                <w:szCs w:val="18"/>
+                <w:sz w:val="16"/>
+                <w:szCs w:val="16"/>
               </w:rPr>
               <w:fldChar w:fldCharType="begin"/>
             </w:r>
@@ -2185,18 +2216,18 @@
                 <w:rFonts w:ascii="Times New Roman" w:hAnsi="Times New Roman" w:cs="Times New Roman"/>
                 <w:noProof/>
                 <w:webHidden/>
-                <w:sz w:val="18"/>
-                <w:szCs w:val="18"/>
-              </w:rPr>
-              <w:instrText xml:space="preserve"> PAGEREF _Toc234187702 \h </w:instrText>
+                <w:sz w:val="16"/>
+                <w:szCs w:val="16"/>
+              </w:rPr>
+              <w:instrText xml:space="preserve"> PAGEREF _Toc234190917 \h </w:instrText>
             </w:r>
             <w:r>
               <w:rPr>
                 <w:rFonts w:ascii="Times New Roman" w:hAnsi="Times New Roman" w:cs="Times New Roman"/>
                 <w:noProof/>
                 <w:webHidden/>
-                <w:sz w:val="18"/>
-                <w:szCs w:val="18"/>
+                <w:sz w:val="16"/>
+                <w:szCs w:val="16"/>
               </w:rPr>
             </w:r>
             <w:r>
@@ -2204,8 +2235,8 @@
                 <w:rFonts w:ascii="Times New Roman" w:hAnsi="Times New Roman" w:cs="Times New Roman"/>
                 <w:noProof/>
                 <w:webHidden/>
-                <w:sz w:val="18"/>
-                <w:szCs w:val="18"/>
+                <w:sz w:val="16"/>
+                <w:szCs w:val="16"/>
               </w:rPr>
               <w:fldChar w:fldCharType="separate"/>
             </w:r>
@@ -2214,18 +2245,18 @@
                 <w:rFonts w:ascii="Times New Roman" w:hAnsi="Times New Roman" w:cs="Times New Roman"/>
                 <w:noProof/>
                 <w:webHidden/>
-                <w:sz w:val="18"/>
-                <w:szCs w:val="18"/>
-              </w:rPr>
-              <w:t>13</w:t>
+                <w:sz w:val="16"/>
+                <w:szCs w:val="16"/>
+              </w:rPr>
+              <w:t>14</w:t>
             </w:r>
             <w:r>
               <w:rPr>
                 <w:rFonts w:ascii="Times New Roman" w:hAnsi="Times New Roman" w:cs="Times New Roman"/>
                 <w:noProof/>
                 <w:webHidden/>
-                <w:sz w:val="18"/>
-                <w:szCs w:val="18"/>
+                <w:sz w:val="16"/>
+                <w:szCs w:val="16"/>
               </w:rPr>
               <w:fldChar w:fldCharType="end"/>
             </w:r>
@@ -2239,29 +2270,31 @@
               <w:tab w:val="right" w:leader="dot" w:pos="8494"/>
             </w:tabs>
             <w:rPr>
-              <w:rFonts w:ascii="Times New Roman" w:hAnsi="Times New Roman" w:cs="Times New Roman"/>
+              <w:rFonts w:ascii="Times New Roman" w:eastAsiaTheme="minorEastAsia" w:hAnsi="Times New Roman" w:cs="Times New Roman"/>
               <w:noProof/>
-              <w:sz w:val="18"/>
-              <w:szCs w:val="18"/>
+              <w:sz w:val="16"/>
+              <w:szCs w:val="16"/>
+              <w:lang w:eastAsia="es-EC"/>
             </w:rPr>
           </w:pPr>
-          <w:hyperlink w:anchor="_Toc234187703" w:history="1">
+          <w:hyperlink w:anchor="_Toc234190918" w:history="1">
             <w:r>
               <w:rPr>
                 <w:rStyle w:val="Hipervnculo"/>
                 <w:rFonts w:ascii="Times New Roman" w:hAnsi="Times New Roman" w:cs="Times New Roman"/>
                 <w:noProof/>
-                <w:sz w:val="18"/>
-                <w:szCs w:val="18"/>
+                <w:sz w:val="16"/>
+                <w:szCs w:val="16"/>
               </w:rPr>
               <w:t>14.</w:t>
             </w:r>
             <w:r>
               <w:rPr>
-                <w:rFonts w:ascii="Times New Roman" w:hAnsi="Times New Roman" w:cs="Times New Roman"/>
+                <w:rFonts w:ascii="Times New Roman" w:eastAsiaTheme="minorEastAsia" w:hAnsi="Times New Roman" w:cs="Times New Roman"/>
                 <w:noProof/>
-                <w:sz w:val="18"/>
-                <w:szCs w:val="18"/>
+                <w:sz w:val="16"/>
+                <w:szCs w:val="16"/>
+                <w:lang w:eastAsia="es-EC"/>
               </w:rPr>
               <w:tab/>
             </w:r>
@@ -2270,18 +2303,18 @@
                 <w:rStyle w:val="Hipervnculo"/>
                 <w:rFonts w:ascii="Times New Roman" w:hAnsi="Times New Roman" w:cs="Times New Roman"/>
                 <w:noProof/>
-                <w:sz w:val="18"/>
-                <w:szCs w:val="18"/>
-              </w:rPr>
-              <w:t>Aplicación de mobile first</w:t>
+                <w:sz w:val="16"/>
+                <w:szCs w:val="16"/>
+              </w:rPr>
+              <w:t>Desarrollo del CSS externo</w:t>
             </w:r>
             <w:r>
               <w:rPr>
                 <w:rFonts w:ascii="Times New Roman" w:hAnsi="Times New Roman" w:cs="Times New Roman"/>
                 <w:noProof/>
                 <w:webHidden/>
-                <w:sz w:val="18"/>
-                <w:szCs w:val="18"/>
+                <w:sz w:val="16"/>
+                <w:szCs w:val="16"/>
               </w:rPr>
               <w:tab/>
             </w:r>
@@ -2290,8 +2323,8 @@
                 <w:rFonts w:ascii="Times New Roman" w:hAnsi="Times New Roman" w:cs="Times New Roman"/>
                 <w:noProof/>
                 <w:webHidden/>
-                <w:sz w:val="18"/>
-                <w:szCs w:val="18"/>
+                <w:sz w:val="16"/>
+                <w:szCs w:val="16"/>
               </w:rPr>
               <w:fldChar w:fldCharType="begin"/>
             </w:r>
@@ -2300,18 +2333,18 @@
                 <w:rFonts w:ascii="Times New Roman" w:hAnsi="Times New Roman" w:cs="Times New Roman"/>
                 <w:noProof/>
                 <w:webHidden/>
-                <w:sz w:val="18"/>
-                <w:szCs w:val="18"/>
-              </w:rPr>
-              <w:instrText xml:space="preserve"> PAGEREF _Toc234187703 \h </w:instrText>
+                <w:sz w:val="16"/>
+                <w:szCs w:val="16"/>
+              </w:rPr>
+              <w:instrText xml:space="preserve"> PAGEREF _Toc234190918 \h </w:instrText>
             </w:r>
             <w:r>
               <w:rPr>
                 <w:rFonts w:ascii="Times New Roman" w:hAnsi="Times New Roman" w:cs="Times New Roman"/>
                 <w:noProof/>
                 <w:webHidden/>
-                <w:sz w:val="18"/>
-                <w:szCs w:val="18"/>
+                <w:sz w:val="16"/>
+                <w:szCs w:val="16"/>
               </w:rPr>
             </w:r>
             <w:r>
@@ -2319,8 +2352,8 @@
                 <w:rFonts w:ascii="Times New Roman" w:hAnsi="Times New Roman" w:cs="Times New Roman"/>
                 <w:noProof/>
                 <w:webHidden/>
-                <w:sz w:val="18"/>
-                <w:szCs w:val="18"/>
+                <w:sz w:val="16"/>
+                <w:szCs w:val="16"/>
               </w:rPr>
               <w:fldChar w:fldCharType="separate"/>
             </w:r>
@@ -2329,18 +2362,18 @@
                 <w:rFonts w:ascii="Times New Roman" w:hAnsi="Times New Roman" w:cs="Times New Roman"/>
                 <w:noProof/>
                 <w:webHidden/>
-                <w:sz w:val="18"/>
-                <w:szCs w:val="18"/>
-              </w:rPr>
-              <w:t>15</w:t>
+                <w:sz w:val="16"/>
+                <w:szCs w:val="16"/>
+              </w:rPr>
+              <w:t>16</w:t>
             </w:r>
             <w:r>
               <w:rPr>
                 <w:rFonts w:ascii="Times New Roman" w:hAnsi="Times New Roman" w:cs="Times New Roman"/>
                 <w:noProof/>
                 <w:webHidden/>
-                <w:sz w:val="18"/>
-                <w:szCs w:val="18"/>
+                <w:sz w:val="16"/>
+                <w:szCs w:val="16"/>
               </w:rPr>
               <w:fldChar w:fldCharType="end"/>
             </w:r>
@@ -2354,29 +2387,31 @@
               <w:tab w:val="right" w:leader="dot" w:pos="8494"/>
             </w:tabs>
             <w:rPr>
-              <w:rFonts w:ascii="Times New Roman" w:hAnsi="Times New Roman" w:cs="Times New Roman"/>
+              <w:rFonts w:ascii="Times New Roman" w:eastAsiaTheme="minorEastAsia" w:hAnsi="Times New Roman" w:cs="Times New Roman"/>
               <w:noProof/>
-              <w:sz w:val="18"/>
-              <w:szCs w:val="18"/>
+              <w:sz w:val="16"/>
+              <w:szCs w:val="16"/>
+              <w:lang w:eastAsia="es-EC"/>
             </w:rPr>
           </w:pPr>
-          <w:hyperlink w:anchor="_Toc234187704" w:history="1">
+          <w:hyperlink w:anchor="_Toc234190919" w:history="1">
             <w:r>
               <w:rPr>
                 <w:rStyle w:val="Hipervnculo"/>
                 <w:rFonts w:ascii="Times New Roman" w:hAnsi="Times New Roman" w:cs="Times New Roman"/>
                 <w:noProof/>
-                <w:sz w:val="18"/>
-                <w:szCs w:val="18"/>
+                <w:sz w:val="16"/>
+                <w:szCs w:val="16"/>
               </w:rPr>
               <w:t>15.</w:t>
             </w:r>
             <w:r>
               <w:rPr>
-                <w:rFonts w:ascii="Times New Roman" w:hAnsi="Times New Roman" w:cs="Times New Roman"/>
+                <w:rFonts w:ascii="Times New Roman" w:eastAsiaTheme="minorEastAsia" w:hAnsi="Times New Roman" w:cs="Times New Roman"/>
                 <w:noProof/>
-                <w:sz w:val="18"/>
-                <w:szCs w:val="18"/>
+                <w:sz w:val="16"/>
+                <w:szCs w:val="16"/>
+                <w:lang w:eastAsia="es-EC"/>
               </w:rPr>
               <w:tab/>
             </w:r>
@@ -2385,18 +2420,18 @@
                 <w:rStyle w:val="Hipervnculo"/>
                 <w:rFonts w:ascii="Times New Roman" w:hAnsi="Times New Roman" w:cs="Times New Roman"/>
                 <w:noProof/>
-                <w:sz w:val="18"/>
-                <w:szCs w:val="18"/>
-              </w:rPr>
-              <w:t>Evidencias del resultado</w:t>
+                <w:sz w:val="16"/>
+                <w:szCs w:val="16"/>
+              </w:rPr>
+              <w:t>Aplicación de mobile first</w:t>
             </w:r>
             <w:r>
               <w:rPr>
                 <w:rFonts w:ascii="Times New Roman" w:hAnsi="Times New Roman" w:cs="Times New Roman"/>
                 <w:noProof/>
                 <w:webHidden/>
-                <w:sz w:val="18"/>
-                <w:szCs w:val="18"/>
+                <w:sz w:val="16"/>
+                <w:szCs w:val="16"/>
               </w:rPr>
               <w:tab/>
             </w:r>
@@ -2405,8 +2440,8 @@
                 <w:rFonts w:ascii="Times New Roman" w:hAnsi="Times New Roman" w:cs="Times New Roman"/>
                 <w:noProof/>
                 <w:webHidden/>
-                <w:sz w:val="18"/>
-                <w:szCs w:val="18"/>
+                <w:sz w:val="16"/>
+                <w:szCs w:val="16"/>
               </w:rPr>
               <w:fldChar w:fldCharType="begin"/>
             </w:r>
@@ -2415,18 +2450,18 @@
                 <w:rFonts w:ascii="Times New Roman" w:hAnsi="Times New Roman" w:cs="Times New Roman"/>
                 <w:noProof/>
                 <w:webHidden/>
-                <w:sz w:val="18"/>
-                <w:szCs w:val="18"/>
-              </w:rPr>
-              <w:instrText xml:space="preserve"> PAGEREF _Toc234187704 \h </w:instrText>
+                <w:sz w:val="16"/>
+                <w:szCs w:val="16"/>
+              </w:rPr>
+              <w:instrText xml:space="preserve"> PAGEREF _Toc234190919 \h </w:instrText>
             </w:r>
             <w:r>
               <w:rPr>
                 <w:rFonts w:ascii="Times New Roman" w:hAnsi="Times New Roman" w:cs="Times New Roman"/>
                 <w:noProof/>
                 <w:webHidden/>
-                <w:sz w:val="18"/>
-                <w:szCs w:val="18"/>
+                <w:sz w:val="16"/>
+                <w:szCs w:val="16"/>
               </w:rPr>
             </w:r>
             <w:r>
@@ -2434,8 +2469,8 @@
                 <w:rFonts w:ascii="Times New Roman" w:hAnsi="Times New Roman" w:cs="Times New Roman"/>
                 <w:noProof/>
                 <w:webHidden/>
-                <w:sz w:val="18"/>
-                <w:szCs w:val="18"/>
+                <w:sz w:val="16"/>
+                <w:szCs w:val="16"/>
               </w:rPr>
               <w:fldChar w:fldCharType="separate"/>
             </w:r>
@@ -2444,18 +2479,18 @@
                 <w:rFonts w:ascii="Times New Roman" w:hAnsi="Times New Roman" w:cs="Times New Roman"/>
                 <w:noProof/>
                 <w:webHidden/>
-                <w:sz w:val="18"/>
-                <w:szCs w:val="18"/>
-              </w:rPr>
-              <w:t>17</w:t>
+                <w:sz w:val="16"/>
+                <w:szCs w:val="16"/>
+              </w:rPr>
+              <w:t>18</w:t>
             </w:r>
             <w:r>
               <w:rPr>
                 <w:rFonts w:ascii="Times New Roman" w:hAnsi="Times New Roman" w:cs="Times New Roman"/>
                 <w:noProof/>
                 <w:webHidden/>
-                <w:sz w:val="18"/>
-                <w:szCs w:val="18"/>
+                <w:sz w:val="16"/>
+                <w:szCs w:val="16"/>
               </w:rPr>
               <w:fldChar w:fldCharType="end"/>
             </w:r>
@@ -2469,29 +2504,31 @@
               <w:tab w:val="right" w:leader="dot" w:pos="8494"/>
             </w:tabs>
             <w:rPr>
-              <w:rFonts w:ascii="Times New Roman" w:hAnsi="Times New Roman" w:cs="Times New Roman"/>
+              <w:rFonts w:ascii="Times New Roman" w:eastAsiaTheme="minorEastAsia" w:hAnsi="Times New Roman" w:cs="Times New Roman"/>
               <w:noProof/>
-              <w:sz w:val="18"/>
-              <w:szCs w:val="18"/>
+              <w:sz w:val="16"/>
+              <w:szCs w:val="16"/>
+              <w:lang w:eastAsia="es-EC"/>
             </w:rPr>
           </w:pPr>
-          <w:hyperlink w:anchor="_Toc234187705" w:history="1">
+          <w:hyperlink w:anchor="_Toc234190920" w:history="1">
             <w:r>
               <w:rPr>
                 <w:rStyle w:val="Hipervnculo"/>
                 <w:rFonts w:ascii="Times New Roman" w:hAnsi="Times New Roman" w:cs="Times New Roman"/>
                 <w:noProof/>
-                <w:sz w:val="18"/>
-                <w:szCs w:val="18"/>
+                <w:sz w:val="16"/>
+                <w:szCs w:val="16"/>
               </w:rPr>
               <w:t>16.</w:t>
             </w:r>
             <w:r>
               <w:rPr>
-                <w:rFonts w:ascii="Times New Roman" w:hAnsi="Times New Roman" w:cs="Times New Roman"/>
+                <w:rFonts w:ascii="Times New Roman" w:eastAsiaTheme="minorEastAsia" w:hAnsi="Times New Roman" w:cs="Times New Roman"/>
                 <w:noProof/>
-                <w:sz w:val="18"/>
-                <w:szCs w:val="18"/>
+                <w:sz w:val="16"/>
+                <w:szCs w:val="16"/>
+                <w:lang w:eastAsia="es-EC"/>
               </w:rPr>
               <w:tab/>
             </w:r>
@@ -2500,18 +2537,18 @@
                 <w:rStyle w:val="Hipervnculo"/>
                 <w:rFonts w:ascii="Times New Roman" w:hAnsi="Times New Roman" w:cs="Times New Roman"/>
                 <w:noProof/>
-                <w:sz w:val="18"/>
-                <w:szCs w:val="18"/>
-              </w:rPr>
-              <w:t>Pruebas responsive</w:t>
+                <w:sz w:val="16"/>
+                <w:szCs w:val="16"/>
+              </w:rPr>
+              <w:t>Evidencias del resultado</w:t>
             </w:r>
             <w:r>
               <w:rPr>
                 <w:rFonts w:ascii="Times New Roman" w:hAnsi="Times New Roman" w:cs="Times New Roman"/>
                 <w:noProof/>
                 <w:webHidden/>
-                <w:sz w:val="18"/>
-                <w:szCs w:val="18"/>
+                <w:sz w:val="16"/>
+                <w:szCs w:val="16"/>
               </w:rPr>
               <w:tab/>
             </w:r>
@@ -2520,8 +2557,8 @@
                 <w:rFonts w:ascii="Times New Roman" w:hAnsi="Times New Roman" w:cs="Times New Roman"/>
                 <w:noProof/>
                 <w:webHidden/>
-                <w:sz w:val="18"/>
-                <w:szCs w:val="18"/>
+                <w:sz w:val="16"/>
+                <w:szCs w:val="16"/>
               </w:rPr>
               <w:fldChar w:fldCharType="begin"/>
             </w:r>
@@ -2530,18 +2567,18 @@
                 <w:rFonts w:ascii="Times New Roman" w:hAnsi="Times New Roman" w:cs="Times New Roman"/>
                 <w:noProof/>
                 <w:webHidden/>
-                <w:sz w:val="18"/>
-                <w:szCs w:val="18"/>
-              </w:rPr>
-              <w:instrText xml:space="preserve"> PAGEREF _Toc234187705 \h </w:instrText>
+                <w:sz w:val="16"/>
+                <w:szCs w:val="16"/>
+              </w:rPr>
+              <w:instrText xml:space="preserve"> PAGEREF _Toc234190920 \h </w:instrText>
             </w:r>
             <w:r>
               <w:rPr>
                 <w:rFonts w:ascii="Times New Roman" w:hAnsi="Times New Roman" w:cs="Times New Roman"/>
                 <w:noProof/>
                 <w:webHidden/>
-                <w:sz w:val="18"/>
-                <w:szCs w:val="18"/>
+                <w:sz w:val="16"/>
+                <w:szCs w:val="16"/>
               </w:rPr>
             </w:r>
             <w:r>
@@ -2549,8 +2586,8 @@
                 <w:rFonts w:ascii="Times New Roman" w:hAnsi="Times New Roman" w:cs="Times New Roman"/>
                 <w:noProof/>
                 <w:webHidden/>
-                <w:sz w:val="18"/>
-                <w:szCs w:val="18"/>
+                <w:sz w:val="16"/>
+                <w:szCs w:val="16"/>
               </w:rPr>
               <w:fldChar w:fldCharType="separate"/>
             </w:r>
@@ -2559,18 +2596,18 @@
                 <w:rFonts w:ascii="Times New Roman" w:hAnsi="Times New Roman" w:cs="Times New Roman"/>
                 <w:noProof/>
                 <w:webHidden/>
-                <w:sz w:val="18"/>
-                <w:szCs w:val="18"/>
-              </w:rPr>
-              <w:t>22</w:t>
+                <w:sz w:val="16"/>
+                <w:szCs w:val="16"/>
+              </w:rPr>
+              <w:t>19</w:t>
             </w:r>
             <w:r>
               <w:rPr>
                 <w:rFonts w:ascii="Times New Roman" w:hAnsi="Times New Roman" w:cs="Times New Roman"/>
                 <w:noProof/>
                 <w:webHidden/>
-                <w:sz w:val="18"/>
-                <w:szCs w:val="18"/>
+                <w:sz w:val="16"/>
+                <w:szCs w:val="16"/>
               </w:rPr>
               <w:fldChar w:fldCharType="end"/>
             </w:r>
@@ -2584,29 +2621,31 @@
               <w:tab w:val="right" w:leader="dot" w:pos="8494"/>
             </w:tabs>
             <w:rPr>
-              <w:rFonts w:ascii="Times New Roman" w:hAnsi="Times New Roman" w:cs="Times New Roman"/>
+              <w:rFonts w:ascii="Times New Roman" w:eastAsiaTheme="minorEastAsia" w:hAnsi="Times New Roman" w:cs="Times New Roman"/>
               <w:noProof/>
-              <w:sz w:val="18"/>
-              <w:szCs w:val="18"/>
+              <w:sz w:val="16"/>
+              <w:szCs w:val="16"/>
+              <w:lang w:eastAsia="es-EC"/>
             </w:rPr>
           </w:pPr>
-          <w:hyperlink w:anchor="_Toc234187706" w:history="1">
+          <w:hyperlink w:anchor="_Toc234190921" w:history="1">
             <w:r>
               <w:rPr>
                 <w:rStyle w:val="Hipervnculo"/>
                 <w:rFonts w:ascii="Times New Roman" w:hAnsi="Times New Roman" w:cs="Times New Roman"/>
                 <w:noProof/>
-                <w:sz w:val="18"/>
-                <w:szCs w:val="18"/>
+                <w:sz w:val="16"/>
+                <w:szCs w:val="16"/>
               </w:rPr>
               <w:t>17.</w:t>
             </w:r>
             <w:r>
               <w:rPr>
-                <w:rFonts w:ascii="Times New Roman" w:hAnsi="Times New Roman" w:cs="Times New Roman"/>
+                <w:rFonts w:ascii="Times New Roman" w:eastAsiaTheme="minorEastAsia" w:hAnsi="Times New Roman" w:cs="Times New Roman"/>
                 <w:noProof/>
-                <w:sz w:val="18"/>
-                <w:szCs w:val="18"/>
+                <w:sz w:val="16"/>
+                <w:szCs w:val="16"/>
+                <w:lang w:eastAsia="es-EC"/>
               </w:rPr>
               <w:tab/>
             </w:r>
@@ -2615,18 +2654,18 @@
                 <w:rStyle w:val="Hipervnculo"/>
                 <w:rFonts w:ascii="Times New Roman" w:hAnsi="Times New Roman" w:cs="Times New Roman"/>
                 <w:noProof/>
-                <w:sz w:val="18"/>
-                <w:szCs w:val="18"/>
-              </w:rPr>
-              <w:t>Fragmentos de código</w:t>
+                <w:sz w:val="16"/>
+                <w:szCs w:val="16"/>
+              </w:rPr>
+              <w:t>Pruebas responsive</w:t>
             </w:r>
             <w:r>
               <w:rPr>
                 <w:rFonts w:ascii="Times New Roman" w:hAnsi="Times New Roman" w:cs="Times New Roman"/>
                 <w:noProof/>
                 <w:webHidden/>
-                <w:sz w:val="18"/>
-                <w:szCs w:val="18"/>
+                <w:sz w:val="16"/>
+                <w:szCs w:val="16"/>
               </w:rPr>
               <w:tab/>
             </w:r>
@@ -2635,8 +2674,8 @@
                 <w:rFonts w:ascii="Times New Roman" w:hAnsi="Times New Roman" w:cs="Times New Roman"/>
                 <w:noProof/>
                 <w:webHidden/>
-                <w:sz w:val="18"/>
-                <w:szCs w:val="18"/>
+                <w:sz w:val="16"/>
+                <w:szCs w:val="16"/>
               </w:rPr>
               <w:fldChar w:fldCharType="begin"/>
             </w:r>
@@ -2645,18 +2684,18 @@
                 <w:rFonts w:ascii="Times New Roman" w:hAnsi="Times New Roman" w:cs="Times New Roman"/>
                 <w:noProof/>
                 <w:webHidden/>
-                <w:sz w:val="18"/>
-                <w:szCs w:val="18"/>
-              </w:rPr>
-              <w:instrText xml:space="preserve"> PAGEREF _Toc234187706 \h </w:instrText>
+                <w:sz w:val="16"/>
+                <w:szCs w:val="16"/>
+              </w:rPr>
+              <w:instrText xml:space="preserve"> PAGEREF _Toc234190921 \h </w:instrText>
             </w:r>
             <w:r>
               <w:rPr>
                 <w:rFonts w:ascii="Times New Roman" w:hAnsi="Times New Roman" w:cs="Times New Roman"/>
                 <w:noProof/>
                 <w:webHidden/>
-                <w:sz w:val="18"/>
-                <w:szCs w:val="18"/>
+                <w:sz w:val="16"/>
+                <w:szCs w:val="16"/>
               </w:rPr>
             </w:r>
             <w:r>
@@ -2664,8 +2703,8 @@
                 <w:rFonts w:ascii="Times New Roman" w:hAnsi="Times New Roman" w:cs="Times New Roman"/>
                 <w:noProof/>
                 <w:webHidden/>
-                <w:sz w:val="18"/>
-                <w:szCs w:val="18"/>
+                <w:sz w:val="16"/>
+                <w:szCs w:val="16"/>
               </w:rPr>
               <w:fldChar w:fldCharType="separate"/>
             </w:r>
@@ -2674,18 +2713,18 @@
                 <w:rFonts w:ascii="Times New Roman" w:hAnsi="Times New Roman" w:cs="Times New Roman"/>
                 <w:noProof/>
                 <w:webHidden/>
-                <w:sz w:val="18"/>
-                <w:szCs w:val="18"/>
-              </w:rPr>
-              <w:t>22</w:t>
+                <w:sz w:val="16"/>
+                <w:szCs w:val="16"/>
+              </w:rPr>
+              <w:t>24</w:t>
             </w:r>
             <w:r>
               <w:rPr>
                 <w:rFonts w:ascii="Times New Roman" w:hAnsi="Times New Roman" w:cs="Times New Roman"/>
                 <w:noProof/>
                 <w:webHidden/>
-                <w:sz w:val="18"/>
-                <w:szCs w:val="18"/>
+                <w:sz w:val="16"/>
+                <w:szCs w:val="16"/>
               </w:rPr>
               <w:fldChar w:fldCharType="end"/>
             </w:r>
@@ -2699,29 +2738,31 @@
               <w:tab w:val="right" w:leader="dot" w:pos="8494"/>
             </w:tabs>
             <w:rPr>
-              <w:rFonts w:ascii="Times New Roman" w:hAnsi="Times New Roman" w:cs="Times New Roman"/>
+              <w:rFonts w:ascii="Times New Roman" w:eastAsiaTheme="minorEastAsia" w:hAnsi="Times New Roman" w:cs="Times New Roman"/>
               <w:noProof/>
-              <w:sz w:val="18"/>
-              <w:szCs w:val="18"/>
+              <w:sz w:val="16"/>
+              <w:szCs w:val="16"/>
+              <w:lang w:eastAsia="es-EC"/>
             </w:rPr>
           </w:pPr>
-          <w:hyperlink w:anchor="_Toc234187707" w:history="1">
+          <w:hyperlink w:anchor="_Toc234190922" w:history="1">
             <w:r>
               <w:rPr>
                 <w:rStyle w:val="Hipervnculo"/>
                 <w:rFonts w:ascii="Times New Roman" w:hAnsi="Times New Roman" w:cs="Times New Roman"/>
                 <w:noProof/>
-                <w:sz w:val="18"/>
-                <w:szCs w:val="18"/>
+                <w:sz w:val="16"/>
+                <w:szCs w:val="16"/>
               </w:rPr>
               <w:t>18.</w:t>
             </w:r>
             <w:r>
               <w:rPr>
-                <w:rFonts w:ascii="Times New Roman" w:hAnsi="Times New Roman" w:cs="Times New Roman"/>
+                <w:rFonts w:ascii="Times New Roman" w:eastAsiaTheme="minorEastAsia" w:hAnsi="Times New Roman" w:cs="Times New Roman"/>
                 <w:noProof/>
-                <w:sz w:val="18"/>
-                <w:szCs w:val="18"/>
+                <w:sz w:val="16"/>
+                <w:szCs w:val="16"/>
+                <w:lang w:eastAsia="es-EC"/>
               </w:rPr>
               <w:tab/>
             </w:r>
@@ -2730,18 +2771,18 @@
                 <w:rStyle w:val="Hipervnculo"/>
                 <w:rFonts w:ascii="Times New Roman" w:hAnsi="Times New Roman" w:cs="Times New Roman"/>
                 <w:noProof/>
-                <w:sz w:val="18"/>
-                <w:szCs w:val="18"/>
-              </w:rPr>
-              <w:t>Conclusiones</w:t>
+                <w:sz w:val="16"/>
+                <w:szCs w:val="16"/>
+              </w:rPr>
+              <w:t>Fragmentos de código</w:t>
             </w:r>
             <w:r>
               <w:rPr>
                 <w:rFonts w:ascii="Times New Roman" w:hAnsi="Times New Roman" w:cs="Times New Roman"/>
                 <w:noProof/>
                 <w:webHidden/>
-                <w:sz w:val="18"/>
-                <w:szCs w:val="18"/>
+                <w:sz w:val="16"/>
+                <w:szCs w:val="16"/>
               </w:rPr>
               <w:tab/>
             </w:r>
@@ -2750,8 +2791,8 @@
                 <w:rFonts w:ascii="Times New Roman" w:hAnsi="Times New Roman" w:cs="Times New Roman"/>
                 <w:noProof/>
                 <w:webHidden/>
-                <w:sz w:val="18"/>
-                <w:szCs w:val="18"/>
+                <w:sz w:val="16"/>
+                <w:szCs w:val="16"/>
               </w:rPr>
               <w:fldChar w:fldCharType="begin"/>
             </w:r>
@@ -2760,18 +2801,18 @@
                 <w:rFonts w:ascii="Times New Roman" w:hAnsi="Times New Roman" w:cs="Times New Roman"/>
                 <w:noProof/>
                 <w:webHidden/>
-                <w:sz w:val="18"/>
-                <w:szCs w:val="18"/>
-              </w:rPr>
-              <w:instrText xml:space="preserve"> PAGEREF _Toc234187707 \h </w:instrText>
+                <w:sz w:val="16"/>
+                <w:szCs w:val="16"/>
+              </w:rPr>
+              <w:instrText xml:space="preserve"> PAGEREF _Toc234190922 \h </w:instrText>
             </w:r>
             <w:r>
               <w:rPr>
                 <w:rFonts w:ascii="Times New Roman" w:hAnsi="Times New Roman" w:cs="Times New Roman"/>
                 <w:noProof/>
                 <w:webHidden/>
-                <w:sz w:val="18"/>
-                <w:szCs w:val="18"/>
+                <w:sz w:val="16"/>
+                <w:szCs w:val="16"/>
               </w:rPr>
             </w:r>
             <w:r>
@@ -2779,8 +2820,8 @@
                 <w:rFonts w:ascii="Times New Roman" w:hAnsi="Times New Roman" w:cs="Times New Roman"/>
                 <w:noProof/>
                 <w:webHidden/>
-                <w:sz w:val="18"/>
-                <w:szCs w:val="18"/>
+                <w:sz w:val="16"/>
+                <w:szCs w:val="16"/>
               </w:rPr>
               <w:fldChar w:fldCharType="separate"/>
             </w:r>
@@ -2789,18 +2830,18 @@
                 <w:rFonts w:ascii="Times New Roman" w:hAnsi="Times New Roman" w:cs="Times New Roman"/>
                 <w:noProof/>
                 <w:webHidden/>
-                <w:sz w:val="18"/>
-                <w:szCs w:val="18"/>
-              </w:rPr>
-              <w:t>25</w:t>
+                <w:sz w:val="16"/>
+                <w:szCs w:val="16"/>
+              </w:rPr>
+              <w:t>24</w:t>
             </w:r>
             <w:r>
               <w:rPr>
                 <w:rFonts w:ascii="Times New Roman" w:hAnsi="Times New Roman" w:cs="Times New Roman"/>
                 <w:noProof/>
                 <w:webHidden/>
-                <w:sz w:val="18"/>
-                <w:szCs w:val="18"/>
+                <w:sz w:val="16"/>
+                <w:szCs w:val="16"/>
               </w:rPr>
               <w:fldChar w:fldCharType="end"/>
             </w:r>
@@ -2814,29 +2855,31 @@
               <w:tab w:val="right" w:leader="dot" w:pos="8494"/>
             </w:tabs>
             <w:rPr>
-              <w:rFonts w:ascii="Times New Roman" w:hAnsi="Times New Roman" w:cs="Times New Roman"/>
+              <w:rFonts w:ascii="Times New Roman" w:eastAsiaTheme="minorEastAsia" w:hAnsi="Times New Roman" w:cs="Times New Roman"/>
               <w:noProof/>
-              <w:sz w:val="18"/>
-              <w:szCs w:val="18"/>
+              <w:sz w:val="16"/>
+              <w:szCs w:val="16"/>
+              <w:lang w:eastAsia="es-EC"/>
             </w:rPr>
           </w:pPr>
-          <w:hyperlink w:anchor="_Toc234187708" w:history="1">
+          <w:hyperlink w:anchor="_Toc234190923" w:history="1">
             <w:r>
               <w:rPr>
                 <w:rStyle w:val="Hipervnculo"/>
                 <w:rFonts w:ascii="Times New Roman" w:hAnsi="Times New Roman" w:cs="Times New Roman"/>
                 <w:noProof/>
-                <w:sz w:val="18"/>
-                <w:szCs w:val="18"/>
+                <w:sz w:val="16"/>
+                <w:szCs w:val="16"/>
               </w:rPr>
               <w:t>19.</w:t>
             </w:r>
             <w:r>
               <w:rPr>
-                <w:rFonts w:ascii="Times New Roman" w:hAnsi="Times New Roman" w:cs="Times New Roman"/>
+                <w:rFonts w:ascii="Times New Roman" w:eastAsiaTheme="minorEastAsia" w:hAnsi="Times New Roman" w:cs="Times New Roman"/>
                 <w:noProof/>
-                <w:sz w:val="18"/>
-                <w:szCs w:val="18"/>
+                <w:sz w:val="16"/>
+                <w:szCs w:val="16"/>
+                <w:lang w:eastAsia="es-EC"/>
               </w:rPr>
               <w:tab/>
             </w:r>
@@ -2845,18 +2888,18 @@
                 <w:rStyle w:val="Hipervnculo"/>
                 <w:rFonts w:ascii="Times New Roman" w:hAnsi="Times New Roman" w:cs="Times New Roman"/>
                 <w:noProof/>
-                <w:sz w:val="18"/>
-                <w:szCs w:val="18"/>
-              </w:rPr>
-              <w:t>Referencias</w:t>
+                <w:sz w:val="16"/>
+                <w:szCs w:val="16"/>
+              </w:rPr>
+              <w:t>Conclusiones</w:t>
             </w:r>
             <w:r>
               <w:rPr>
                 <w:rFonts w:ascii="Times New Roman" w:hAnsi="Times New Roman" w:cs="Times New Roman"/>
                 <w:noProof/>
                 <w:webHidden/>
-                <w:sz w:val="18"/>
-                <w:szCs w:val="18"/>
+                <w:sz w:val="16"/>
+                <w:szCs w:val="16"/>
               </w:rPr>
               <w:tab/>
             </w:r>
@@ -2865,8 +2908,8 @@
                 <w:rFonts w:ascii="Times New Roman" w:hAnsi="Times New Roman" w:cs="Times New Roman"/>
                 <w:noProof/>
                 <w:webHidden/>
-                <w:sz w:val="18"/>
-                <w:szCs w:val="18"/>
+                <w:sz w:val="16"/>
+                <w:szCs w:val="16"/>
               </w:rPr>
               <w:fldChar w:fldCharType="begin"/>
             </w:r>
@@ -2875,18 +2918,18 @@
                 <w:rFonts w:ascii="Times New Roman" w:hAnsi="Times New Roman" w:cs="Times New Roman"/>
                 <w:noProof/>
                 <w:webHidden/>
-                <w:sz w:val="18"/>
-                <w:szCs w:val="18"/>
-              </w:rPr>
-              <w:instrText xml:space="preserve"> PAGEREF _Toc234187708 \h </w:instrText>
+                <w:sz w:val="16"/>
+                <w:szCs w:val="16"/>
+              </w:rPr>
+              <w:instrText xml:space="preserve"> PAGEREF _Toc234190923 \h </w:instrText>
             </w:r>
             <w:r>
               <w:rPr>
                 <w:rFonts w:ascii="Times New Roman" w:hAnsi="Times New Roman" w:cs="Times New Roman"/>
                 <w:noProof/>
                 <w:webHidden/>
-                <w:sz w:val="18"/>
-                <w:szCs w:val="18"/>
+                <w:sz w:val="16"/>
+                <w:szCs w:val="16"/>
               </w:rPr>
             </w:r>
             <w:r>
@@ -2894,8 +2937,8 @@
                 <w:rFonts w:ascii="Times New Roman" w:hAnsi="Times New Roman" w:cs="Times New Roman"/>
                 <w:noProof/>
                 <w:webHidden/>
-                <w:sz w:val="18"/>
-                <w:szCs w:val="18"/>
+                <w:sz w:val="16"/>
+                <w:szCs w:val="16"/>
               </w:rPr>
               <w:fldChar w:fldCharType="separate"/>
             </w:r>
@@ -2904,18 +2947,135 @@
                 <w:rFonts w:ascii="Times New Roman" w:hAnsi="Times New Roman" w:cs="Times New Roman"/>
                 <w:noProof/>
                 <w:webHidden/>
-                <w:sz w:val="18"/>
-                <w:szCs w:val="18"/>
-              </w:rPr>
-              <w:t>25</w:t>
+                <w:sz w:val="16"/>
+                <w:szCs w:val="16"/>
+              </w:rPr>
+              <w:t>27</w:t>
             </w:r>
             <w:r>
               <w:rPr>
                 <w:rFonts w:ascii="Times New Roman" w:hAnsi="Times New Roman" w:cs="Times New Roman"/>
                 <w:noProof/>
                 <w:webHidden/>
-                <w:sz w:val="18"/>
-                <w:szCs w:val="18"/>
+                <w:sz w:val="16"/>
+                <w:szCs w:val="16"/>
+              </w:rPr>
+              <w:fldChar w:fldCharType="end"/>
+            </w:r>
+          </w:hyperlink>
+        </w:p>
+        <w:p>
+          <w:pPr>
+            <w:pStyle w:val="TDC1"/>
+            <w:tabs>
+              <w:tab w:val="left" w:pos="660"/>
+              <w:tab w:val="right" w:leader="dot" w:pos="8494"/>
+            </w:tabs>
+            <w:rPr>
+              <w:rFonts w:ascii="Times New Roman" w:eastAsiaTheme="minorEastAsia" w:hAnsi="Times New Roman" w:cs="Times New Roman"/>
+              <w:noProof/>
+              <w:sz w:val="16"/>
+              <w:szCs w:val="16"/>
+              <w:lang w:eastAsia="es-EC"/>
+            </w:rPr>
+          </w:pPr>
+          <w:hyperlink w:anchor="_Toc234190924" w:history="1">
+            <w:r>
+              <w:rPr>
+                <w:rStyle w:val="Hipervnculo"/>
+                <w:rFonts w:ascii="Times New Roman" w:hAnsi="Times New Roman" w:cs="Times New Roman"/>
+                <w:noProof/>
+                <w:sz w:val="16"/>
+                <w:szCs w:val="16"/>
+              </w:rPr>
+              <w:t>20.</w:t>
+            </w:r>
+            <w:r>
+              <w:rPr>
+                <w:rFonts w:ascii="Times New Roman" w:eastAsiaTheme="minorEastAsia" w:hAnsi="Times New Roman" w:cs="Times New Roman"/>
+                <w:noProof/>
+                <w:sz w:val="16"/>
+                <w:szCs w:val="16"/>
+                <w:lang w:eastAsia="es-EC"/>
+              </w:rPr>
+              <w:tab/>
+            </w:r>
+            <w:r>
+              <w:rPr>
+                <w:rStyle w:val="Hipervnculo"/>
+                <w:rFonts w:ascii="Times New Roman" w:hAnsi="Times New Roman" w:cs="Times New Roman"/>
+                <w:noProof/>
+                <w:sz w:val="16"/>
+                <w:szCs w:val="16"/>
+              </w:rPr>
+              <w:t>Referencias</w:t>
+            </w:r>
+            <w:r>
+              <w:rPr>
+                <w:rFonts w:ascii="Times New Roman" w:hAnsi="Times New Roman" w:cs="Times New Roman"/>
+                <w:noProof/>
+                <w:webHidden/>
+                <w:sz w:val="16"/>
+                <w:szCs w:val="16"/>
+              </w:rPr>
+              <w:tab/>
+            </w:r>
+            <w:r>
+              <w:rPr>
+                <w:rFonts w:ascii="Times New Roman" w:hAnsi="Times New Roman" w:cs="Times New Roman"/>
+                <w:noProof/>
+                <w:webHidden/>
+                <w:sz w:val="16"/>
+                <w:szCs w:val="16"/>
+              </w:rPr>
+              <w:fldChar w:fldCharType="begin"/>
+            </w:r>
+            <w:r>
+              <w:rPr>
+                <w:rFonts w:ascii="Times New Roman" w:hAnsi="Times New Roman" w:cs="Times New Roman"/>
+                <w:noProof/>
+                <w:webHidden/>
+                <w:sz w:val="16"/>
+                <w:szCs w:val="16"/>
+              </w:rPr>
+              <w:instrText xml:space="preserve"> PAGEREF _Toc234190924 \h </w:instrText>
+            </w:r>
+            <w:r>
+              <w:rPr>
+                <w:rFonts w:ascii="Times New Roman" w:hAnsi="Times New Roman" w:cs="Times New Roman"/>
+                <w:noProof/>
+                <w:webHidden/>
+                <w:sz w:val="16"/>
+                <w:szCs w:val="16"/>
+              </w:rPr>
+            </w:r>
+            <w:r>
+              <w:rPr>
+                <w:rFonts w:ascii="Times New Roman" w:hAnsi="Times New Roman" w:cs="Times New Roman"/>
+                <w:noProof/>
+                <w:webHidden/>
+                <w:sz w:val="16"/>
+                <w:szCs w:val="16"/>
+              </w:rPr>
+              <w:fldChar w:fldCharType="separate"/>
+            </w:r>
+            <w:r>
+              <w:rPr>
+                <w:rFonts w:ascii="Times New Roman" w:hAnsi="Times New Roman" w:cs="Times New Roman"/>
+                <w:noProof/>
+                <w:webHidden/>
+                <w:sz w:val="16"/>
+                <w:szCs w:val="16"/>
+              </w:rPr>
+              <w:t>28</w:t>
+            </w:r>
+            <w:r>
+              <w:rPr>
+                <w:rFonts w:ascii="Times New Roman" w:hAnsi="Times New Roman" w:cs="Times New Roman"/>
+                <w:noProof/>
+                <w:webHidden/>
+                <w:sz w:val="16"/>
+                <w:szCs w:val="16"/>
               </w:rPr>
               <w:fldChar w:fldCharType="end"/>
             </w:r>
@@ -2933,10 +3093,11 @@
           </w:pPr>
           <w:r>
             <w:rPr>
+              <w:rFonts w:ascii="Times New Roman" w:hAnsi="Times New Roman" w:cs="Times New Roman"/>
               <w:b/>
               <w:bCs/>
-              <w:sz w:val="18"/>
-              <w:szCs w:val="18"/>
+              <w:sz w:val="14"/>
+              <w:szCs w:val="14"/>
               <w:lang w:val="es-ES"/>
             </w:rPr>
             <w:fldChar w:fldCharType="end"/>
@@ -2953,7 +3114,7 @@
           <w:szCs w:val="24"/>
         </w:rPr>
       </w:pPr>
-      <w:bookmarkStart w:id="1" w:name="_Toc234187691"/>
+      <w:bookmarkStart w:id="1" w:name="_Toc234190906"/>
       <w:r>
         <w:rPr>
           <w:rFonts w:cs="Times New Roman"/>
@@ -3069,7 +3230,7 @@
             <w:sz w:val="20"/>
             <w:szCs w:val="20"/>
           </w:rPr>
-          <w:t>5</w:t>
+          <w:t>4</w:t>
         </w:r>
         <w:r>
           <w:rPr>
@@ -3261,7 +3422,7 @@
             <w:sz w:val="20"/>
             <w:szCs w:val="20"/>
           </w:rPr>
-          <w:t>6</w:t>
+          <w:t>5</w:t>
         </w:r>
         <w:r>
           <w:rPr>
@@ -3357,7 +3518,7 @@
             <w:sz w:val="20"/>
             <w:szCs w:val="20"/>
           </w:rPr>
-          <w:t>18</w:t>
+          <w:t>19</w:t>
         </w:r>
         <w:r>
           <w:rPr>
@@ -3453,7 +3614,7 @@
             <w:sz w:val="20"/>
             <w:szCs w:val="20"/>
           </w:rPr>
-          <w:t>18</w:t>
+          <w:t>19</w:t>
         </w:r>
         <w:r>
           <w:rPr>
@@ -3549,7 +3710,7 @@
             <w:sz w:val="20"/>
             <w:szCs w:val="20"/>
           </w:rPr>
-          <w:t>19</w:t>
+          <w:t>20</w:t>
         </w:r>
         <w:r>
           <w:rPr>
@@ -3741,7 +3902,7 @@
             <w:sz w:val="20"/>
             <w:szCs w:val="20"/>
           </w:rPr>
-          <w:t>20</w:t>
+          <w:t>21</w:t>
         </w:r>
         <w:r>
           <w:rPr>
@@ -4261,7 +4422,7 @@
           <w:szCs w:val="24"/>
         </w:rPr>
       </w:pPr>
-      <w:bookmarkStart w:id="2" w:name="_Toc234187692"/>
+      <w:bookmarkStart w:id="2" w:name="_Toc234190907"/>
       <w:r>
         <w:rPr>
           <w:rFonts w:cs="Times New Roman"/>
@@ -4473,7 +4634,7 @@
             <w:sz w:val="20"/>
             <w:szCs w:val="20"/>
           </w:rPr>
-          <w:t>7</w:t>
+          <w:t>6</w:t>
         </w:r>
         <w:r>
           <w:rPr>
@@ -4665,7 +4826,7 @@
             <w:sz w:val="20"/>
             <w:szCs w:val="20"/>
           </w:rPr>
-          <w:t>8</w:t>
+          <w:t>7</w:t>
         </w:r>
         <w:r>
           <w:rPr>
@@ -5088,7 +5249,7 @@
           <w:szCs w:val="24"/>
         </w:rPr>
       </w:pPr>
-      <w:bookmarkStart w:id="3" w:name="_Toc234187693"/>
+      <w:bookmarkStart w:id="3" w:name="_Toc234190908"/>
       <w:r>
         <w:rPr>
           <w:rFonts w:cs="Times New Roman"/>
@@ -5097,8 +5258,18 @@
         <w:lastRenderedPageBreak/>
         <w:t>Link de GitHub</w:t>
       </w:r>
-    </w:p>
-    <w:p/>
+      <w:bookmarkEnd w:id="3"/>
+    </w:p>
+    <w:p>
+      <w:hyperlink r:id="rId9" w:history="1">
+        <w:r>
+          <w:rPr>
+            <w:rStyle w:val="Hipervnculo"/>
+          </w:rPr>
+          <w:t>https://github.com/jmherrera11-jpg/HerreraJhon_LandingPage.git</w:t>
+        </w:r>
+      </w:hyperlink>
+    </w:p>
     <w:p>
       <w:pPr>
         <w:pStyle w:val="Ttulo1"/>
@@ -5107,6 +5278,7 @@
           <w:szCs w:val="24"/>
         </w:rPr>
       </w:pPr>
+      <w:bookmarkStart w:id="4" w:name="_Toc234190909"/>
       <w:r>
         <w:rPr>
           <w:rFonts w:cs="Times New Roman"/>
@@ -5114,7 +5286,7 @@
         </w:rPr>
         <w:t>Objetivo</w:t>
       </w:r>
-      <w:bookmarkEnd w:id="3"/>
+      <w:bookmarkEnd w:id="4"/>
     </w:p>
     <w:p>
       <w:pPr>
@@ -5188,7 +5360,7 @@
           <w:szCs w:val="24"/>
         </w:rPr>
       </w:pPr>
-      <w:bookmarkStart w:id="4" w:name="_Toc234187694"/>
+      <w:bookmarkStart w:id="5" w:name="_Toc234190910"/>
       <w:r>
         <w:rPr>
           <w:rFonts w:cs="Times New Roman"/>
@@ -5196,7 +5368,7 @@
         </w:rPr>
         <w:t>Descripción del cliente</w:t>
       </w:r>
-      <w:bookmarkEnd w:id="4"/>
+      <w:bookmarkEnd w:id="5"/>
     </w:p>
     <w:p>
       <w:pPr>
@@ -5247,7 +5419,7 @@
           <w:szCs w:val="24"/>
         </w:rPr>
       </w:pPr>
-      <w:bookmarkStart w:id="5" w:name="_Toc234187695"/>
+      <w:bookmarkStart w:id="6" w:name="_Toc234190911"/>
       <w:r>
         <w:rPr>
           <w:rFonts w:cs="Times New Roman"/>
@@ -5256,7 +5428,7 @@
         <w:lastRenderedPageBreak/>
         <w:t>Requerimientos del diseño</w:t>
       </w:r>
-      <w:bookmarkEnd w:id="5"/>
+      <w:bookmarkEnd w:id="6"/>
     </w:p>
     <w:p>
       <w:pPr>
@@ -5632,7 +5804,7 @@
           <w:szCs w:val="24"/>
         </w:rPr>
       </w:pPr>
-      <w:bookmarkStart w:id="6" w:name="_Toc234187696"/>
+      <w:bookmarkStart w:id="7" w:name="_Toc234190912"/>
       <w:r>
         <w:rPr>
           <w:rFonts w:cs="Times New Roman"/>
@@ -5648,7 +5820,7 @@
         </w:rPr>
         <w:t>wireframe</w:t>
       </w:r>
-      <w:bookmarkEnd w:id="6"/>
+      <w:bookmarkEnd w:id="7"/>
       <w:proofErr w:type="spellEnd"/>
     </w:p>
     <w:p>
@@ -5669,7 +5841,7 @@
           <w:szCs w:val="24"/>
         </w:rPr>
       </w:pPr>
-      <w:bookmarkStart w:id="7" w:name="_Toc234187757"/>
+      <w:bookmarkStart w:id="8" w:name="_Toc234187757"/>
       <w:r>
         <w:rPr>
           <w:sz w:val="24"/>
@@ -5720,7 +5892,7 @@
         </w:rPr>
         <w:t>. Boceto general de la estructura de la página</w:t>
       </w:r>
-      <w:bookmarkEnd w:id="7"/>
+      <w:bookmarkEnd w:id="8"/>
     </w:p>
     <w:p>
       <w:pPr>
@@ -5742,145 +5914,6 @@
             <wp:extent cx="3794125" cy="2012950"/>
             <wp:effectExtent l="0" t="0" r="0" b="6350"/>
             <wp:docPr id="4" name="Imagen 4"/>
-            <wp:cNvGraphicFramePr>
-              <a:graphicFrameLocks xmlns:a="http://schemas.openxmlformats.org/drawingml/2006/main" noChangeAspect="1"/>
-            </wp:cNvGraphicFramePr>
-            <a:graphic xmlns:a="http://schemas.openxmlformats.org/drawingml/2006/main">
-              <a:graphicData uri="http://schemas.openxmlformats.org/drawingml/2006/picture">
-                <pic:pic xmlns:pic="http://schemas.openxmlformats.org/drawingml/2006/picture">
-                  <pic:nvPicPr>
-                    <pic:cNvPr id="1" name=""/>
-                    <pic:cNvPicPr/>
-                  </pic:nvPicPr>
-                  <pic:blipFill>
-                    <a:blip r:embed="rId9"/>
-                    <a:stretch>
-                      <a:fillRect/>
-                    </a:stretch>
-                  </pic:blipFill>
-                  <pic:spPr>
-                    <a:xfrm>
-                      <a:off x="0" y="0"/>
-                      <a:ext cx="3809358" cy="2021032"/>
-                    </a:xfrm>
-                    <a:prstGeom prst="rect">
-                      <a:avLst/>
-                    </a:prstGeom>
-                  </pic:spPr>
-                </pic:pic>
-              </a:graphicData>
-            </a:graphic>
-          </wp:inline>
-        </w:drawing>
-      </w:r>
-    </w:p>
-    <w:p>
-      <w:pPr>
-        <w:pStyle w:val="APA7ma"/>
-        <w:ind w:firstLine="0"/>
-        <w:rPr>
-          <w:szCs w:val="24"/>
-        </w:rPr>
-      </w:pPr>
-      <w:r>
-        <w:rPr>
-          <w:szCs w:val="24"/>
-        </w:rPr>
-        <w:lastRenderedPageBreak/>
-        <w:t>Muestra la distribución inicial planteada para el encabezado, el Hero y la sección "Nosotros".</w:t>
-      </w:r>
-    </w:p>
-    <w:p>
-      <w:pPr>
-        <w:rPr>
-          <w:rFonts w:ascii="Times New Roman" w:hAnsi="Times New Roman" w:cs="Times New Roman"/>
-          <w:sz w:val="24"/>
-          <w:szCs w:val="24"/>
-        </w:rPr>
-      </w:pPr>
-    </w:p>
-    <w:p>
-      <w:pPr>
-        <w:pStyle w:val="Descripcin"/>
-        <w:keepNext/>
-        <w:rPr>
-          <w:sz w:val="24"/>
-          <w:szCs w:val="24"/>
-        </w:rPr>
-      </w:pPr>
-      <w:bookmarkStart w:id="8" w:name="_Toc234187758"/>
-      <w:r>
-        <w:rPr>
-          <w:sz w:val="24"/>
-          <w:szCs w:val="24"/>
-        </w:rPr>
-        <w:t xml:space="preserve">Figura </w:t>
-      </w:r>
-      <w:r>
-        <w:rPr>
-          <w:sz w:val="24"/>
-          <w:szCs w:val="24"/>
-        </w:rPr>
-        <w:fldChar w:fldCharType="begin"/>
-      </w:r>
-      <w:r>
-        <w:rPr>
-          <w:sz w:val="24"/>
-          <w:szCs w:val="24"/>
-        </w:rPr>
-        <w:instrText xml:space="preserve"> SEQ Figura \* ARABIC </w:instrText>
-      </w:r>
-      <w:r>
-        <w:rPr>
-          <w:sz w:val="24"/>
-          <w:szCs w:val="24"/>
-        </w:rPr>
-        <w:fldChar w:fldCharType="separate"/>
-      </w:r>
-      <w:r>
-        <w:rPr>
-          <w:noProof/>
-          <w:sz w:val="24"/>
-          <w:szCs w:val="24"/>
-        </w:rPr>
-        <w:t>2</w:t>
-      </w:r>
-      <w:r>
-        <w:rPr>
-          <w:sz w:val="24"/>
-          <w:szCs w:val="24"/>
-        </w:rPr>
-        <w:fldChar w:fldCharType="end"/>
-      </w:r>
-      <w:r>
-        <w:rPr>
-          <w:sz w:val="24"/>
-          <w:szCs w:val="24"/>
-        </w:rPr>
-        <w:t>. Boceto de las secciones de contenido intermedio</w:t>
-      </w:r>
-      <w:bookmarkEnd w:id="8"/>
-    </w:p>
-    <w:p>
-      <w:pPr>
-        <w:rPr>
-          <w:rFonts w:ascii="Times New Roman" w:hAnsi="Times New Roman" w:cs="Times New Roman"/>
-          <w:sz w:val="24"/>
-          <w:szCs w:val="24"/>
-        </w:rPr>
-      </w:pPr>
-      <w:r>
-        <w:rPr>
-          <w:rFonts w:ascii="Times New Roman" w:hAnsi="Times New Roman" w:cs="Times New Roman"/>
-          <w:noProof/>
-          <w:sz w:val="24"/>
-          <w:szCs w:val="24"/>
-        </w:rPr>
-        <w:drawing>
-          <wp:inline distT="0" distB="0" distL="0" distR="0" wp14:anchorId="1756A659" wp14:editId="094A0ECC">
-            <wp:extent cx="3757246" cy="2654674"/>
-            <wp:effectExtent l="0" t="0" r="0" b="0"/>
-            <wp:docPr id="5" name="Imagen 5"/>
             <wp:cNvGraphicFramePr>
               <a:graphicFrameLocks xmlns:a="http://schemas.openxmlformats.org/drawingml/2006/main" noChangeAspect="1"/>
             </wp:cNvGraphicFramePr>
@@ -5900,7 +5933,7 @@
                   <pic:spPr>
                     <a:xfrm>
                       <a:off x="0" y="0"/>
-                      <a:ext cx="3778436" cy="2669646"/>
+                      <a:ext cx="3809358" cy="2021032"/>
                     </a:xfrm>
                     <a:prstGeom prst="rect">
                       <a:avLst/>
@@ -5925,8 +5958,18 @@
         <w:rPr>
           <w:szCs w:val="24"/>
         </w:rPr>
-        <w:t>Representa la organización propuesta para Servicios, Proyectos y Testimonios antes de su maquetación final.</w:t>
-      </w:r>
+        <w:lastRenderedPageBreak/>
+        <w:t>Muestra la distribución inicial planteada para el encabezado, el Hero y la sección "Nosotros".</w:t>
+      </w:r>
+    </w:p>
+    <w:p>
+      <w:pPr>
+        <w:rPr>
+          <w:rFonts w:ascii="Times New Roman" w:hAnsi="Times New Roman" w:cs="Times New Roman"/>
+          <w:sz w:val="24"/>
+          <w:szCs w:val="24"/>
+        </w:rPr>
+      </w:pPr>
     </w:p>
     <w:p>
       <w:pPr>
@@ -5937,7 +5980,7 @@
           <w:szCs w:val="24"/>
         </w:rPr>
       </w:pPr>
-      <w:bookmarkStart w:id="9" w:name="_Toc234187759"/>
+      <w:bookmarkStart w:id="9" w:name="_Toc234187758"/>
       <w:r>
         <w:rPr>
           <w:sz w:val="24"/>
@@ -5972,7 +6015,7 @@
           <w:sz w:val="24"/>
           <w:szCs w:val="24"/>
         </w:rPr>
-        <w:t>3</w:t>
+        <w:t>2</w:t>
       </w:r>
       <w:r>
         <w:rPr>
@@ -5986,7 +6029,7 @@
           <w:sz w:val="24"/>
           <w:szCs w:val="24"/>
         </w:rPr>
-        <w:t>. Boceto de la sección de contacto y pie de página</w:t>
+        <w:t>. Boceto de las secciones de contenido intermedio</w:t>
       </w:r>
       <w:bookmarkEnd w:id="9"/>
     </w:p>
@@ -6006,10 +6049,10 @@
           <w:szCs w:val="24"/>
         </w:rPr>
         <w:drawing>
-          <wp:inline distT="0" distB="0" distL="0" distR="0" wp14:anchorId="6C4CC6B1" wp14:editId="5985ACA4">
-            <wp:extent cx="3727450" cy="3251200"/>
-            <wp:effectExtent l="0" t="0" r="6350" b="6350"/>
-            <wp:docPr id="6" name="Imagen 6"/>
+          <wp:inline distT="0" distB="0" distL="0" distR="0" wp14:anchorId="1756A659" wp14:editId="094A0ECC">
+            <wp:extent cx="3757246" cy="2654674"/>
+            <wp:effectExtent l="0" t="0" r="0" b="0"/>
+            <wp:docPr id="5" name="Imagen 5"/>
             <wp:cNvGraphicFramePr>
               <a:graphicFrameLocks xmlns:a="http://schemas.openxmlformats.org/drawingml/2006/main" noChangeAspect="1"/>
             </wp:cNvGraphicFramePr>
@@ -6029,6 +6072,135 @@
                   <pic:spPr>
                     <a:xfrm>
                       <a:off x="0" y="0"/>
+                      <a:ext cx="3778436" cy="2669646"/>
+                    </a:xfrm>
+                    <a:prstGeom prst="rect">
+                      <a:avLst/>
+                    </a:prstGeom>
+                  </pic:spPr>
+                </pic:pic>
+              </a:graphicData>
+            </a:graphic>
+          </wp:inline>
+        </w:drawing>
+      </w:r>
+    </w:p>
+    <w:p>
+      <w:pPr>
+        <w:pStyle w:val="APA7ma"/>
+        <w:ind w:firstLine="0"/>
+        <w:rPr>
+          <w:szCs w:val="24"/>
+        </w:rPr>
+      </w:pPr>
+      <w:r>
+        <w:rPr>
+          <w:szCs w:val="24"/>
+        </w:rPr>
+        <w:t>Representa la organización propuesta para Servicios, Proyectos y Testimonios antes de su maquetación final.</w:t>
+      </w:r>
+    </w:p>
+    <w:p>
+      <w:pPr>
+        <w:pStyle w:val="Descripcin"/>
+        <w:keepNext/>
+        <w:rPr>
+          <w:sz w:val="24"/>
+          <w:szCs w:val="24"/>
+        </w:rPr>
+      </w:pPr>
+      <w:bookmarkStart w:id="10" w:name="_Toc234187759"/>
+      <w:r>
+        <w:rPr>
+          <w:sz w:val="24"/>
+          <w:szCs w:val="24"/>
+        </w:rPr>
+        <w:t xml:space="preserve">Figura </w:t>
+      </w:r>
+      <w:r>
+        <w:rPr>
+          <w:sz w:val="24"/>
+          <w:szCs w:val="24"/>
+        </w:rPr>
+        <w:fldChar w:fldCharType="begin"/>
+      </w:r>
+      <w:r>
+        <w:rPr>
+          <w:sz w:val="24"/>
+          <w:szCs w:val="24"/>
+        </w:rPr>
+        <w:instrText xml:space="preserve"> SEQ Figura \* ARABIC </w:instrText>
+      </w:r>
+      <w:r>
+        <w:rPr>
+          <w:sz w:val="24"/>
+          <w:szCs w:val="24"/>
+        </w:rPr>
+        <w:fldChar w:fldCharType="separate"/>
+      </w:r>
+      <w:r>
+        <w:rPr>
+          <w:noProof/>
+          <w:sz w:val="24"/>
+          <w:szCs w:val="24"/>
+        </w:rPr>
+        <w:t>3</w:t>
+      </w:r>
+      <w:r>
+        <w:rPr>
+          <w:sz w:val="24"/>
+          <w:szCs w:val="24"/>
+        </w:rPr>
+        <w:fldChar w:fldCharType="end"/>
+      </w:r>
+      <w:r>
+        <w:rPr>
+          <w:sz w:val="24"/>
+          <w:szCs w:val="24"/>
+        </w:rPr>
+        <w:t>. Boceto de la sección de contacto y pie de página</w:t>
+      </w:r>
+      <w:bookmarkEnd w:id="10"/>
+    </w:p>
+    <w:p>
+      <w:pPr>
+        <w:rPr>
+          <w:rFonts w:ascii="Times New Roman" w:hAnsi="Times New Roman" w:cs="Times New Roman"/>
+          <w:sz w:val="24"/>
+          <w:szCs w:val="24"/>
+        </w:rPr>
+      </w:pPr>
+      <w:r>
+        <w:rPr>
+          <w:rFonts w:ascii="Times New Roman" w:hAnsi="Times New Roman" w:cs="Times New Roman"/>
+          <w:noProof/>
+          <w:sz w:val="24"/>
+          <w:szCs w:val="24"/>
+        </w:rPr>
+        <w:drawing>
+          <wp:inline distT="0" distB="0" distL="0" distR="0" wp14:anchorId="6C4CC6B1" wp14:editId="5985ACA4">
+            <wp:extent cx="3727450" cy="3251200"/>
+            <wp:effectExtent l="0" t="0" r="6350" b="6350"/>
+            <wp:docPr id="6" name="Imagen 6"/>
+            <wp:cNvGraphicFramePr>
+              <a:graphicFrameLocks xmlns:a="http://schemas.openxmlformats.org/drawingml/2006/main" noChangeAspect="1"/>
+            </wp:cNvGraphicFramePr>
+            <a:graphic xmlns:a="http://schemas.openxmlformats.org/drawingml/2006/main">
+              <a:graphicData uri="http://schemas.openxmlformats.org/drawingml/2006/picture">
+                <pic:pic xmlns:pic="http://schemas.openxmlformats.org/drawingml/2006/picture">
+                  <pic:nvPicPr>
+                    <pic:cNvPr id="1" name=""/>
+                    <pic:cNvPicPr/>
+                  </pic:nvPicPr>
+                  <pic:blipFill>
+                    <a:blip r:embed="rId12"/>
+                    <a:stretch>
+                      <a:fillRect/>
+                    </a:stretch>
+                  </pic:blipFill>
+                  <pic:spPr>
+                    <a:xfrm>
+                      <a:off x="0" y="0"/>
                       <a:ext cx="3746885" cy="3268152"/>
                     </a:xfrm>
                     <a:prstGeom prst="rect">
@@ -6149,7 +6321,7 @@
           <w:szCs w:val="24"/>
         </w:rPr>
       </w:pPr>
-      <w:hyperlink r:id="rId12" w:history="1">
+      <w:hyperlink r:id="rId13" w:history="1">
         <w:r>
           <w:rPr>
             <w:rStyle w:val="Hipervnculo"/>
@@ -6169,7 +6341,7 @@
           <w:szCs w:val="24"/>
         </w:rPr>
       </w:pPr>
-      <w:bookmarkStart w:id="10" w:name="_Toc234187697"/>
+      <w:bookmarkStart w:id="11" w:name="_Toc234190913"/>
       <w:r>
         <w:rPr>
           <w:rFonts w:cs="Times New Roman"/>
@@ -6177,7 +6349,7 @@
         </w:rPr>
         <w:t>Paleta de colores</w:t>
       </w:r>
-      <w:bookmarkEnd w:id="10"/>
+      <w:bookmarkEnd w:id="11"/>
     </w:p>
     <w:p>
       <w:pPr>
@@ -6188,7 +6360,7 @@
           <w:szCs w:val="24"/>
         </w:rPr>
       </w:pPr>
-      <w:bookmarkStart w:id="11" w:name="_Toc234187770"/>
+      <w:bookmarkStart w:id="12" w:name="_Toc234187770"/>
       <w:r>
         <w:rPr>
           <w:sz w:val="24"/>
@@ -6239,7 +6411,7 @@
         </w:rPr>
         <w:t>. Paleta de colores principales del sitio</w:t>
       </w:r>
-      <w:bookmarkEnd w:id="11"/>
+      <w:bookmarkEnd w:id="12"/>
     </w:p>
     <w:tbl>
       <w:tblPr>
@@ -6437,7 +6609,7 @@
                           <pic:cNvPicPr/>
                         </pic:nvPicPr>
                         <pic:blipFill rotWithShape="1">
-                          <a:blip r:embed="rId13"/>
+                          <a:blip r:embed="rId14"/>
                           <a:srcRect l="24932" t="-4355" r="12670" b="4104"/>
                           <a:stretch/>
                         </pic:blipFill>
@@ -6595,7 +6767,7 @@
                           <pic:cNvPicPr/>
                         </pic:nvPicPr>
                         <pic:blipFill>
-                          <a:blip r:embed="rId14"/>
+                          <a:blip r:embed="rId15"/>
                           <a:stretch>
                             <a:fillRect/>
                           </a:stretch>
@@ -6717,139 +6889,6 @@
                   <wp:extent cx="1286054" cy="247685"/>
                   <wp:effectExtent l="0" t="0" r="0" b="0"/>
                   <wp:docPr id="10" name="Imagen 10"/>
-                  <wp:cNvGraphicFramePr>
-                    <a:graphicFrameLocks xmlns:a="http://schemas.openxmlformats.org/drawingml/2006/main" noChangeAspect="1"/>
-                  </wp:cNvGraphicFramePr>
-                  <a:graphic xmlns:a="http://schemas.openxmlformats.org/drawingml/2006/main">
-                    <a:graphicData uri="http://schemas.openxmlformats.org/drawingml/2006/picture">
-                      <pic:pic xmlns:pic="http://schemas.openxmlformats.org/drawingml/2006/picture">
-                        <pic:nvPicPr>
-                          <pic:cNvPr id="1" name=""/>
-                          <pic:cNvPicPr/>
-                        </pic:nvPicPr>
-                        <pic:blipFill>
-                          <a:blip r:embed="rId15"/>
-                          <a:stretch>
-                            <a:fillRect/>
-                          </a:stretch>
-                        </pic:blipFill>
-                        <pic:spPr>
-                          <a:xfrm>
-                            <a:off x="0" y="0"/>
-                            <a:ext cx="1286054" cy="247685"/>
-                          </a:xfrm>
-                          <a:prstGeom prst="rect">
-                            <a:avLst/>
-                          </a:prstGeom>
-                        </pic:spPr>
-                      </pic:pic>
-                    </a:graphicData>
-                  </a:graphic>
-                </wp:inline>
-              </w:drawing>
-            </w:r>
-          </w:p>
-        </w:tc>
-        <w:tc>
-          <w:tcPr>
-            <w:tcW w:w="3054" w:type="dxa"/>
-            <w:shd w:val="clear" w:color="auto" w:fill="D9E2F3" w:themeFill="accent1" w:themeFillTint="33"/>
-            <w:hideMark/>
-          </w:tcPr>
-          <w:p>
-            <w:pPr>
-              <w:rPr>
-                <w:rFonts w:ascii="Times New Roman" w:hAnsi="Times New Roman" w:cs="Times New Roman"/>
-                <w:sz w:val="24"/>
-                <w:szCs w:val="24"/>
-              </w:rPr>
-            </w:pPr>
-            <w:r>
-              <w:rPr>
-                <w:rFonts w:ascii="Times New Roman" w:hAnsi="Times New Roman" w:cs="Times New Roman"/>
-                <w:sz w:val="24"/>
-                <w:szCs w:val="24"/>
-              </w:rPr>
-              <w:t>Líneas decorativas bajo títulos, indicadores de éxito, elementos destacados</w:t>
-            </w:r>
-          </w:p>
-        </w:tc>
-      </w:tr>
-      <w:tr>
-        <w:tc>
-          <w:tcPr>
-            <w:tcW w:w="0" w:type="auto"/>
-            <w:shd w:val="clear" w:color="auto" w:fill="D9E2F3" w:themeFill="accent1" w:themeFillTint="33"/>
-            <w:hideMark/>
-          </w:tcPr>
-          <w:p>
-            <w:pPr>
-              <w:rPr>
-                <w:rFonts w:ascii="Times New Roman" w:hAnsi="Times New Roman" w:cs="Times New Roman"/>
-                <w:sz w:val="24"/>
-                <w:szCs w:val="24"/>
-              </w:rPr>
-            </w:pPr>
-            <w:r>
-              <w:rPr>
-                <w:rFonts w:ascii="Times New Roman" w:hAnsi="Times New Roman" w:cs="Times New Roman"/>
-                <w:sz w:val="24"/>
-                <w:szCs w:val="24"/>
-              </w:rPr>
-              <w:t>Fondo</w:t>
-            </w:r>
-          </w:p>
-        </w:tc>
-        <w:tc>
-          <w:tcPr>
-            <w:tcW w:w="0" w:type="auto"/>
-            <w:shd w:val="clear" w:color="auto" w:fill="D9E2F3" w:themeFill="accent1" w:themeFillTint="33"/>
-            <w:hideMark/>
-          </w:tcPr>
-          <w:p>
-            <w:pPr>
-              <w:rPr>
-                <w:rFonts w:ascii="Times New Roman" w:hAnsi="Times New Roman" w:cs="Times New Roman"/>
-                <w:sz w:val="24"/>
-                <w:szCs w:val="24"/>
-              </w:rPr>
-            </w:pPr>
-            <w:r>
-              <w:rPr>
-                <w:rFonts w:ascii="Times New Roman" w:hAnsi="Times New Roman" w:cs="Times New Roman"/>
-                <w:sz w:val="24"/>
-                <w:szCs w:val="24"/>
-              </w:rPr>
-              <w:t>#F8FBF9</w:t>
-            </w:r>
-          </w:p>
-        </w:tc>
-        <w:tc>
-          <w:tcPr>
-            <w:tcW w:w="2715" w:type="dxa"/>
-            <w:shd w:val="clear" w:color="auto" w:fill="D9E2F3" w:themeFill="accent1" w:themeFillTint="33"/>
-            <w:hideMark/>
-          </w:tcPr>
-          <w:p>
-            <w:pPr>
-              <w:rPr>
-                <w:rFonts w:ascii="Times New Roman" w:hAnsi="Times New Roman" w:cs="Times New Roman"/>
-                <w:sz w:val="24"/>
-                <w:szCs w:val="24"/>
-              </w:rPr>
-            </w:pPr>
-            <w:r>
-              <w:rPr>
-                <w:rFonts w:ascii="Times New Roman" w:hAnsi="Times New Roman" w:cs="Times New Roman"/>
-                <w:noProof/>
-                <w:sz w:val="24"/>
-                <w:szCs w:val="24"/>
-              </w:rPr>
-              <w:drawing>
-                <wp:inline distT="0" distB="0" distL="0" distR="0" wp14:anchorId="710A0E1E" wp14:editId="35C9B1A7">
-                  <wp:extent cx="1114581" cy="257211"/>
-                  <wp:effectExtent l="0" t="0" r="9525" b="9525"/>
-                  <wp:docPr id="11" name="Imagen 11"/>
                   <wp:cNvGraphicFramePr>
                     <a:graphicFrameLocks xmlns:a="http://schemas.openxmlformats.org/drawingml/2006/main" noChangeAspect="1"/>
                   </wp:cNvGraphicFramePr>
@@ -6869,6 +6908,139 @@
                         <pic:spPr>
                           <a:xfrm>
                             <a:off x="0" y="0"/>
+                            <a:ext cx="1286054" cy="247685"/>
+                          </a:xfrm>
+                          <a:prstGeom prst="rect">
+                            <a:avLst/>
+                          </a:prstGeom>
+                        </pic:spPr>
+                      </pic:pic>
+                    </a:graphicData>
+                  </a:graphic>
+                </wp:inline>
+              </w:drawing>
+            </w:r>
+          </w:p>
+        </w:tc>
+        <w:tc>
+          <w:tcPr>
+            <w:tcW w:w="3054" w:type="dxa"/>
+            <w:shd w:val="clear" w:color="auto" w:fill="D9E2F3" w:themeFill="accent1" w:themeFillTint="33"/>
+            <w:hideMark/>
+          </w:tcPr>
+          <w:p>
+            <w:pPr>
+              <w:rPr>
+                <w:rFonts w:ascii="Times New Roman" w:hAnsi="Times New Roman" w:cs="Times New Roman"/>
+                <w:sz w:val="24"/>
+                <w:szCs w:val="24"/>
+              </w:rPr>
+            </w:pPr>
+            <w:r>
+              <w:rPr>
+                <w:rFonts w:ascii="Times New Roman" w:hAnsi="Times New Roman" w:cs="Times New Roman"/>
+                <w:sz w:val="24"/>
+                <w:szCs w:val="24"/>
+              </w:rPr>
+              <w:t>Líneas decorativas bajo títulos, indicadores de éxito, elementos destacados</w:t>
+            </w:r>
+          </w:p>
+        </w:tc>
+      </w:tr>
+      <w:tr>
+        <w:tc>
+          <w:tcPr>
+            <w:tcW w:w="0" w:type="auto"/>
+            <w:shd w:val="clear" w:color="auto" w:fill="D9E2F3" w:themeFill="accent1" w:themeFillTint="33"/>
+            <w:hideMark/>
+          </w:tcPr>
+          <w:p>
+            <w:pPr>
+              <w:rPr>
+                <w:rFonts w:ascii="Times New Roman" w:hAnsi="Times New Roman" w:cs="Times New Roman"/>
+                <w:sz w:val="24"/>
+                <w:szCs w:val="24"/>
+              </w:rPr>
+            </w:pPr>
+            <w:r>
+              <w:rPr>
+                <w:rFonts w:ascii="Times New Roman" w:hAnsi="Times New Roman" w:cs="Times New Roman"/>
+                <w:sz w:val="24"/>
+                <w:szCs w:val="24"/>
+              </w:rPr>
+              <w:t>Fondo</w:t>
+            </w:r>
+          </w:p>
+        </w:tc>
+        <w:tc>
+          <w:tcPr>
+            <w:tcW w:w="0" w:type="auto"/>
+            <w:shd w:val="clear" w:color="auto" w:fill="D9E2F3" w:themeFill="accent1" w:themeFillTint="33"/>
+            <w:hideMark/>
+          </w:tcPr>
+          <w:p>
+            <w:pPr>
+              <w:rPr>
+                <w:rFonts w:ascii="Times New Roman" w:hAnsi="Times New Roman" w:cs="Times New Roman"/>
+                <w:sz w:val="24"/>
+                <w:szCs w:val="24"/>
+              </w:rPr>
+            </w:pPr>
+            <w:r>
+              <w:rPr>
+                <w:rFonts w:ascii="Times New Roman" w:hAnsi="Times New Roman" w:cs="Times New Roman"/>
+                <w:sz w:val="24"/>
+                <w:szCs w:val="24"/>
+              </w:rPr>
+              <w:t>#F8FBF9</w:t>
+            </w:r>
+          </w:p>
+        </w:tc>
+        <w:tc>
+          <w:tcPr>
+            <w:tcW w:w="2715" w:type="dxa"/>
+            <w:shd w:val="clear" w:color="auto" w:fill="D9E2F3" w:themeFill="accent1" w:themeFillTint="33"/>
+            <w:hideMark/>
+          </w:tcPr>
+          <w:p>
+            <w:pPr>
+              <w:rPr>
+                <w:rFonts w:ascii="Times New Roman" w:hAnsi="Times New Roman" w:cs="Times New Roman"/>
+                <w:sz w:val="24"/>
+                <w:szCs w:val="24"/>
+              </w:rPr>
+            </w:pPr>
+            <w:r>
+              <w:rPr>
+                <w:rFonts w:ascii="Times New Roman" w:hAnsi="Times New Roman" w:cs="Times New Roman"/>
+                <w:noProof/>
+                <w:sz w:val="24"/>
+                <w:szCs w:val="24"/>
+              </w:rPr>
+              <w:drawing>
+                <wp:inline distT="0" distB="0" distL="0" distR="0" wp14:anchorId="710A0E1E" wp14:editId="35C9B1A7">
+                  <wp:extent cx="1114581" cy="257211"/>
+                  <wp:effectExtent l="0" t="0" r="9525" b="9525"/>
+                  <wp:docPr id="11" name="Imagen 11"/>
+                  <wp:cNvGraphicFramePr>
+                    <a:graphicFrameLocks xmlns:a="http://schemas.openxmlformats.org/drawingml/2006/main" noChangeAspect="1"/>
+                  </wp:cNvGraphicFramePr>
+                  <a:graphic xmlns:a="http://schemas.openxmlformats.org/drawingml/2006/main">
+                    <a:graphicData uri="http://schemas.openxmlformats.org/drawingml/2006/picture">
+                      <pic:pic xmlns:pic="http://schemas.openxmlformats.org/drawingml/2006/picture">
+                        <pic:nvPicPr>
+                          <pic:cNvPr id="1" name=""/>
+                          <pic:cNvPicPr/>
+                        </pic:nvPicPr>
+                        <pic:blipFill>
+                          <a:blip r:embed="rId17"/>
+                          <a:stretch>
+                            <a:fillRect/>
+                          </a:stretch>
+                        </pic:blipFill>
+                        <pic:spPr>
+                          <a:xfrm>
+                            <a:off x="0" y="0"/>
                             <a:ext cx="1114581" cy="257211"/>
                           </a:xfrm>
                           <a:prstGeom prst="rect">
@@ -6944,7 +7116,7 @@
           <w:szCs w:val="24"/>
         </w:rPr>
       </w:pPr>
-      <w:bookmarkStart w:id="12" w:name="_Toc234187771"/>
+      <w:bookmarkStart w:id="13" w:name="_Toc234187771"/>
       <w:r>
         <w:rPr>
           <w:sz w:val="24"/>
@@ -6995,7 +7167,7 @@
         </w:rPr>
         <w:t>. Colores adicionales utilizados</w:t>
       </w:r>
-      <w:bookmarkEnd w:id="12"/>
+      <w:bookmarkEnd w:id="13"/>
     </w:p>
     <w:tbl>
       <w:tblPr>
@@ -7195,7 +7367,7 @@
                           <pic:cNvPicPr/>
                         </pic:nvPicPr>
                         <pic:blipFill>
-                          <a:blip r:embed="rId17"/>
+                          <a:blip r:embed="rId18"/>
                           <a:stretch>
                             <a:fillRect/>
                           </a:stretch>
@@ -7337,7 +7509,7 @@
                           <pic:cNvPicPr/>
                         </pic:nvPicPr>
                         <pic:blipFill>
-                          <a:blip r:embed="rId18"/>
+                          <a:blip r:embed="rId19"/>
                           <a:stretch>
                             <a:fillRect/>
                           </a:stretch>
@@ -7470,7 +7642,7 @@
                           <pic:cNvPicPr/>
                         </pic:nvPicPr>
                         <pic:blipFill rotWithShape="1">
-                          <a:blip r:embed="rId19"/>
+                          <a:blip r:embed="rId20"/>
                           <a:srcRect t="16590" b="-1"/>
                           <a:stretch/>
                         </pic:blipFill>
@@ -7542,7 +7714,7 @@
           <w:szCs w:val="24"/>
         </w:rPr>
       </w:pPr>
-      <w:bookmarkStart w:id="13" w:name="_Toc234187698"/>
+      <w:bookmarkStart w:id="14" w:name="_Toc234190914"/>
       <w:r>
         <w:rPr>
           <w:rFonts w:cs="Times New Roman"/>
@@ -7550,7 +7722,7 @@
         </w:rPr>
         <w:t>Tipografía e iconos</w:t>
       </w:r>
-      <w:bookmarkEnd w:id="13"/>
+      <w:bookmarkEnd w:id="14"/>
     </w:p>
     <w:p>
       <w:pPr>
@@ -7631,7 +7803,7 @@
           <w:szCs w:val="24"/>
         </w:rPr>
       </w:pPr>
-      <w:bookmarkStart w:id="14" w:name="_Toc234187772"/>
+      <w:bookmarkStart w:id="15" w:name="_Toc234187772"/>
       <w:r>
         <w:rPr>
           <w:sz w:val="24"/>
@@ -7683,7 +7855,7 @@
         </w:rPr>
         <w:t>. Tamaños de fuente por dispositivo variables CSS</w:t>
       </w:r>
-      <w:bookmarkEnd w:id="14"/>
+      <w:bookmarkEnd w:id="15"/>
     </w:p>
     <w:tbl>
       <w:tblPr>
@@ -8169,7 +8341,7 @@
           <w:szCs w:val="24"/>
         </w:rPr>
       </w:pPr>
-      <w:bookmarkStart w:id="15" w:name="_Toc234187773"/>
+      <w:bookmarkStart w:id="16" w:name="_Toc234187773"/>
       <w:r>
         <w:rPr>
           <w:sz w:val="24"/>
@@ -8220,7 +8392,7 @@
         </w:rPr>
         <w:t>. Uso de encabezados y párrafos en la página</w:t>
       </w:r>
-      <w:bookmarkEnd w:id="15"/>
+      <w:bookmarkEnd w:id="16"/>
     </w:p>
     <w:tbl>
       <w:tblPr>
@@ -9356,7 +9528,7 @@
           <w:szCs w:val="24"/>
         </w:rPr>
       </w:pPr>
-      <w:bookmarkStart w:id="16" w:name="_Toc234187774"/>
+      <w:bookmarkStart w:id="17" w:name="_Toc234187774"/>
       <w:r>
         <w:rPr>
           <w:sz w:val="24"/>
@@ -9407,7 +9579,7 @@
         </w:rPr>
         <w:t>. Razón de selección de cada icono utilizado</w:t>
       </w:r>
-      <w:bookmarkEnd w:id="16"/>
+      <w:bookmarkEnd w:id="17"/>
     </w:p>
     <w:tbl>
       <w:tblPr>
@@ -10275,7 +10447,7 @@
           <w:szCs w:val="24"/>
         </w:rPr>
       </w:pPr>
-      <w:bookmarkStart w:id="17" w:name="_Toc234187775"/>
+      <w:bookmarkStart w:id="18" w:name="_Toc234187775"/>
       <w:r>
         <w:rPr>
           <w:sz w:val="24"/>
@@ -10326,7 +10498,7 @@
         </w:rPr>
         <w:t>. Relación entre iconos y servicios</w:t>
       </w:r>
-      <w:bookmarkEnd w:id="17"/>
+      <w:bookmarkEnd w:id="18"/>
     </w:p>
     <w:tbl>
       <w:tblPr>
@@ -12552,7 +12724,7 @@
           <w:szCs w:val="24"/>
         </w:rPr>
       </w:pPr>
-      <w:bookmarkStart w:id="18" w:name="_Toc234187776"/>
+      <w:bookmarkStart w:id="19" w:name="_Toc234187776"/>
       <w:r>
         <w:rPr>
           <w:sz w:val="24"/>
@@ -12603,7 +12775,7 @@
         </w:rPr>
         <w:t>. Resultados de pruebas responsive</w:t>
       </w:r>
-      <w:bookmarkEnd w:id="18"/>
+      <w:bookmarkEnd w:id="19"/>
     </w:p>
     <w:tbl>
       <w:tblPr>
@@ -13139,7 +13311,7 @@
           <w:szCs w:val="24"/>
         </w:rPr>
       </w:pPr>
-      <w:bookmarkStart w:id="19" w:name="_Toc234187699"/>
+      <w:bookmarkStart w:id="20" w:name="_Toc234190915"/>
       <w:r>
         <w:rPr>
           <w:rFonts w:cs="Times New Roman"/>
@@ -13148,30 +13320,29 @@
         <w:lastRenderedPageBreak/>
         <w:t>Estructura del proyecto</w:t>
       </w:r>
-      <w:bookmarkEnd w:id="19"/>
-    </w:p>
-    <w:p>
-      <w:pPr>
-        <w:pStyle w:val="Ttulo1"/>
-        <w:numPr>
-          <w:ilvl w:val="0"/>
-          <w:numId w:val="0"/>
-        </w:numPr>
-        <w:rPr>
-          <w:rFonts w:cs="Times New Roman"/>
-          <w:szCs w:val="24"/>
-        </w:rPr>
-      </w:pPr>
-      <w:r>
-        <w:rPr>
-          <w:rFonts w:cs="Times New Roman"/>
-          <w:szCs w:val="24"/>
+      <w:bookmarkEnd w:id="20"/>
+    </w:p>
+    <w:p>
+      <w:pPr>
+        <w:rPr>
+          <w:rFonts w:ascii="Times New Roman" w:hAnsi="Times New Roman" w:cs="Times New Roman"/>
+          <w:b/>
+          <w:bCs/>
+        </w:rPr>
+      </w:pPr>
+      <w:r>
+        <w:rPr>
+          <w:rFonts w:ascii="Times New Roman" w:hAnsi="Times New Roman" w:cs="Times New Roman"/>
+          <w:b/>
+          <w:bCs/>
         </w:rPr>
         <w:t>Código 1. Árbol de estructura del proyecto</w:t>
       </w:r>
       <w:r>
         <w:rPr>
-          <w:rFonts w:ascii="Consolas" w:hAnsi="Consolas" w:cs="Courier New"/>
+          <w:rFonts w:ascii="Times New Roman" w:hAnsi="Times New Roman" w:cs="Times New Roman"/>
+          <w:b/>
+          <w:bCs/>
           <w:sz w:val="17"/>
           <w:szCs w:val="17"/>
         </w:rPr>
@@ -13179,7 +13350,9 @@
       </w:r>
       <w:r>
         <w:rPr>
-          <w:rFonts w:ascii="Consolas" w:hAnsi="Consolas" w:cs="Courier New"/>
+          <w:rFonts w:ascii="Times New Roman" w:hAnsi="Times New Roman" w:cs="Times New Roman"/>
+          <w:b/>
+          <w:bCs/>
           <w:color w:val="000000"/>
           <w:sz w:val="17"/>
           <w:szCs w:val="17"/>
@@ -15231,7 +15404,7 @@
           <w:szCs w:val="24"/>
         </w:rPr>
       </w:pPr>
-      <w:bookmarkStart w:id="20" w:name="_Toc234187700"/>
+      <w:bookmarkStart w:id="21" w:name="_Toc234190916"/>
       <w:r>
         <w:rPr>
           <w:rFonts w:cs="Times New Roman"/>
@@ -15239,7 +15412,7 @@
         </w:rPr>
         <w:t>Estructura semántica</w:t>
       </w:r>
-      <w:bookmarkEnd w:id="20"/>
+      <w:bookmarkEnd w:id="21"/>
     </w:p>
     <w:p>
       <w:pPr>
@@ -16040,7 +16213,7 @@
           <w:szCs w:val="24"/>
         </w:rPr>
       </w:pPr>
-      <w:bookmarkStart w:id="21" w:name="_Toc234187701"/>
+      <w:bookmarkStart w:id="22" w:name="_Toc234190917"/>
       <w:r>
         <w:rPr>
           <w:rFonts w:cs="Times New Roman"/>
@@ -16049,7 +16222,7 @@
         <w:lastRenderedPageBreak/>
         <w:t>Desarrollo con Bootstrap</w:t>
       </w:r>
-      <w:bookmarkEnd w:id="21"/>
+      <w:bookmarkEnd w:id="22"/>
     </w:p>
     <w:p>
       <w:pPr>
@@ -17162,7 +17335,7 @@
           <w:szCs w:val="24"/>
         </w:rPr>
       </w:pPr>
-      <w:bookmarkStart w:id="22" w:name="_Toc234187702"/>
+      <w:bookmarkStart w:id="23" w:name="_Toc234190918"/>
       <w:r>
         <w:rPr>
           <w:rFonts w:cs="Times New Roman"/>
@@ -17170,7 +17343,7 @@
         </w:rPr>
         <w:t>Desarrollo del CSS externo</w:t>
       </w:r>
-      <w:bookmarkEnd w:id="22"/>
+      <w:bookmarkEnd w:id="23"/>
     </w:p>
     <w:p>
       <w:pPr>
@@ -18345,7 +18518,7 @@
           <w:szCs w:val="24"/>
         </w:rPr>
       </w:pPr>
-      <w:bookmarkStart w:id="23" w:name="_Toc234187703"/>
+      <w:bookmarkStart w:id="24" w:name="_Toc234190919"/>
       <w:r>
         <w:rPr>
           <w:rFonts w:cs="Times New Roman"/>
@@ -18377,7 +18550,7 @@
         </w:rPr>
         <w:t>first</w:t>
       </w:r>
-      <w:bookmarkEnd w:id="23"/>
+      <w:bookmarkEnd w:id="24"/>
       <w:proofErr w:type="spellEnd"/>
     </w:p>
     <w:p>
@@ -19111,7 +19284,7 @@
           <w:szCs w:val="24"/>
         </w:rPr>
       </w:pPr>
-      <w:bookmarkStart w:id="24" w:name="_Toc234187704"/>
+      <w:bookmarkStart w:id="25" w:name="_Toc234190920"/>
       <w:r>
         <w:rPr>
           <w:rFonts w:cs="Times New Roman"/>
@@ -19119,7 +19292,7 @@
         </w:rPr>
         <w:t>Evidencias del resultado</w:t>
       </w:r>
-      <w:bookmarkEnd w:id="24"/>
+      <w:bookmarkEnd w:id="25"/>
     </w:p>
     <w:p>
       <w:pPr>
@@ -19151,7 +19324,7 @@
           <w:szCs w:val="24"/>
         </w:rPr>
       </w:pPr>
-      <w:bookmarkStart w:id="25" w:name="_Toc234187760"/>
+      <w:bookmarkStart w:id="26" w:name="_Toc234187760"/>
       <w:r>
         <w:rPr>
           <w:sz w:val="24"/>
@@ -19202,7 +19375,7 @@
         </w:rPr>
         <w:t>. Vista móvil de la parte superior de la página</w:t>
       </w:r>
-      <w:bookmarkEnd w:id="25"/>
+      <w:bookmarkEnd w:id="26"/>
     </w:p>
     <w:p>
       <w:pPr>
@@ -19235,7 +19408,7 @@
                     <pic:cNvPicPr/>
                   </pic:nvPicPr>
                   <pic:blipFill rotWithShape="1">
-                    <a:blip r:embed="rId20"/>
+                    <a:blip r:embed="rId21"/>
                     <a:srcRect t="-1" b="38658"/>
                     <a:stretch/>
                   </pic:blipFill>
@@ -19287,7 +19460,7 @@
           <w:szCs w:val="24"/>
         </w:rPr>
       </w:pPr>
-      <w:bookmarkStart w:id="26" w:name="_Toc234187761"/>
+      <w:bookmarkStart w:id="27" w:name="_Toc234187761"/>
       <w:r>
         <w:rPr>
           <w:sz w:val="24"/>
@@ -19338,7 +19511,7 @@
         </w:rPr>
         <w:t>. Vista móvil de la parte intermedia de la página</w:t>
       </w:r>
-      <w:bookmarkEnd w:id="26"/>
+      <w:bookmarkEnd w:id="27"/>
     </w:p>
     <w:p>
       <w:pPr>
@@ -19371,7 +19544,7 @@
                     <pic:cNvPicPr/>
                   </pic:nvPicPr>
                   <pic:blipFill>
-                    <a:blip r:embed="rId21"/>
+                    <a:blip r:embed="rId22"/>
                     <a:stretch>
                       <a:fillRect/>
                     </a:stretch>
@@ -19425,7 +19598,7 @@
           <w:szCs w:val="24"/>
         </w:rPr>
       </w:pPr>
-      <w:bookmarkStart w:id="27" w:name="_Toc234187762"/>
+      <w:bookmarkStart w:id="28" w:name="_Toc234187762"/>
       <w:r>
         <w:rPr>
           <w:sz w:val="24"/>
@@ -19476,7 +19649,7 @@
         </w:rPr>
         <w:t>. Vista móvil de la parte inferior de la página</w:t>
       </w:r>
-      <w:bookmarkEnd w:id="27"/>
+      <w:bookmarkEnd w:id="28"/>
     </w:p>
     <w:p>
       <w:pPr>
@@ -19509,7 +19682,7 @@
                     <pic:cNvPicPr/>
                   </pic:nvPicPr>
                   <pic:blipFill rotWithShape="1">
-                    <a:blip r:embed="rId22"/>
+                    <a:blip r:embed="rId23"/>
                     <a:srcRect r="1394"/>
                     <a:stretch/>
                   </pic:blipFill>
@@ -19605,7 +19778,7 @@
           <w:szCs w:val="24"/>
         </w:rPr>
       </w:pPr>
-      <w:bookmarkStart w:id="28" w:name="_Toc234187763"/>
+      <w:bookmarkStart w:id="29" w:name="_Toc234187763"/>
       <w:r>
         <w:rPr>
           <w:sz w:val="24"/>
@@ -19672,7 +19845,7 @@
         </w:rPr>
         <w:t xml:space="preserve"> del encabezado y secciones iniciales</w:t>
       </w:r>
-      <w:bookmarkEnd w:id="28"/>
+      <w:bookmarkEnd w:id="29"/>
     </w:p>
     <w:p>
       <w:pPr>
@@ -19694,166 +19867,6 @@
             <wp:extent cx="3383280" cy="2666362"/>
             <wp:effectExtent l="0" t="0" r="7620" b="1270"/>
             <wp:docPr id="18" name="Imagen 18"/>
-            <wp:cNvGraphicFramePr>
-              <a:graphicFrameLocks xmlns:a="http://schemas.openxmlformats.org/drawingml/2006/main" noChangeAspect="1"/>
-            </wp:cNvGraphicFramePr>
-            <a:graphic xmlns:a="http://schemas.openxmlformats.org/drawingml/2006/main">
-              <a:graphicData uri="http://schemas.openxmlformats.org/drawingml/2006/picture">
-                <pic:pic xmlns:pic="http://schemas.openxmlformats.org/drawingml/2006/picture">
-                  <pic:nvPicPr>
-                    <pic:cNvPr id="1" name=""/>
-                    <pic:cNvPicPr/>
-                  </pic:nvPicPr>
-                  <pic:blipFill>
-                    <a:blip r:embed="rId23"/>
-                    <a:stretch>
-                      <a:fillRect/>
-                    </a:stretch>
-                  </pic:blipFill>
-                  <pic:spPr>
-                    <a:xfrm>
-                      <a:off x="0" y="0"/>
-                      <a:ext cx="3399973" cy="2679518"/>
-                    </a:xfrm>
-                    <a:prstGeom prst="rect">
-                      <a:avLst/>
-                    </a:prstGeom>
-                  </pic:spPr>
-                </pic:pic>
-              </a:graphicData>
-            </a:graphic>
-          </wp:inline>
-        </w:drawing>
-      </w:r>
-    </w:p>
-    <w:p>
-      <w:pPr>
-        <w:pStyle w:val="APA7ma"/>
-        <w:ind w:firstLine="0"/>
-        <w:rPr>
-          <w:szCs w:val="24"/>
-        </w:rPr>
-      </w:pPr>
-      <w:r>
-        <w:rPr>
-          <w:szCs w:val="24"/>
-        </w:rPr>
-        <w:t xml:space="preserve">Muestra la distribución en dos columnas aplicada desde el </w:t>
-      </w:r>
-      <w:proofErr w:type="spellStart"/>
-      <w:r>
-        <w:rPr>
-          <w:szCs w:val="24"/>
-        </w:rPr>
-        <w:t>breakpoint</w:t>
-      </w:r>
-      <w:proofErr w:type="spellEnd"/>
-      <w:r>
-        <w:rPr>
-          <w:szCs w:val="24"/>
-        </w:rPr>
-        <w:t xml:space="preserve"> de 768px.</w:t>
-      </w:r>
-    </w:p>
-    <w:p>
-      <w:pPr>
-        <w:pStyle w:val="Descripcin"/>
-        <w:keepNext/>
-        <w:rPr>
-          <w:sz w:val="24"/>
-          <w:szCs w:val="24"/>
-        </w:rPr>
-      </w:pPr>
-      <w:bookmarkStart w:id="29" w:name="_Toc234187764"/>
-      <w:r>
-        <w:rPr>
-          <w:sz w:val="24"/>
-          <w:szCs w:val="24"/>
-        </w:rPr>
-        <w:lastRenderedPageBreak/>
-        <w:t xml:space="preserve">Figura </w:t>
-      </w:r>
-      <w:r>
-        <w:rPr>
-          <w:sz w:val="24"/>
-          <w:szCs w:val="24"/>
-        </w:rPr>
-        <w:fldChar w:fldCharType="begin"/>
-      </w:r>
-      <w:r>
-        <w:rPr>
-          <w:sz w:val="24"/>
-          <w:szCs w:val="24"/>
-        </w:rPr>
-        <w:instrText xml:space="preserve"> SEQ Figura \* ARABIC </w:instrText>
-      </w:r>
-      <w:r>
-        <w:rPr>
-          <w:sz w:val="24"/>
-          <w:szCs w:val="24"/>
-        </w:rPr>
-        <w:fldChar w:fldCharType="separate"/>
-      </w:r>
-      <w:r>
-        <w:rPr>
-          <w:noProof/>
-          <w:sz w:val="24"/>
-          <w:szCs w:val="24"/>
-        </w:rPr>
-        <w:t>8</w:t>
-      </w:r>
-      <w:r>
-        <w:rPr>
-          <w:sz w:val="24"/>
-          <w:szCs w:val="24"/>
-        </w:rPr>
-        <w:fldChar w:fldCharType="end"/>
-      </w:r>
-      <w:r>
-        <w:rPr>
-          <w:sz w:val="24"/>
-          <w:szCs w:val="24"/>
-        </w:rPr>
-        <w:t xml:space="preserve">. Vista </w:t>
-      </w:r>
-      <w:proofErr w:type="spellStart"/>
-      <w:r>
-        <w:rPr>
-          <w:sz w:val="24"/>
-          <w:szCs w:val="24"/>
-        </w:rPr>
-        <w:t>tablet</w:t>
-      </w:r>
-      <w:proofErr w:type="spellEnd"/>
-      <w:r>
-        <w:rPr>
-          <w:sz w:val="24"/>
-          <w:szCs w:val="24"/>
-        </w:rPr>
-        <w:t xml:space="preserve"> de las secciones intermedias</w:t>
-      </w:r>
-      <w:bookmarkEnd w:id="29"/>
-    </w:p>
-    <w:p>
-      <w:pPr>
-        <w:rPr>
-          <w:rFonts w:ascii="Times New Roman" w:hAnsi="Times New Roman" w:cs="Times New Roman"/>
-          <w:sz w:val="24"/>
-          <w:szCs w:val="24"/>
-        </w:rPr>
-      </w:pPr>
-      <w:r>
-        <w:rPr>
-          <w:rFonts w:ascii="Times New Roman" w:hAnsi="Times New Roman" w:cs="Times New Roman"/>
-          <w:noProof/>
-          <w:sz w:val="24"/>
-          <w:szCs w:val="24"/>
-        </w:rPr>
-        <w:drawing>
-          <wp:inline distT="0" distB="0" distL="0" distR="0" wp14:anchorId="556A1F6F" wp14:editId="7DC3EA13">
-            <wp:extent cx="3412946" cy="2235200"/>
-            <wp:effectExtent l="0" t="0" r="0" b="0"/>
-            <wp:docPr id="19" name="Imagen 19"/>
             <wp:cNvGraphicFramePr>
               <a:graphicFrameLocks xmlns:a="http://schemas.openxmlformats.org/drawingml/2006/main" noChangeAspect="1"/>
             </wp:cNvGraphicFramePr>
@@ -19873,7 +19886,7 @@
                   <pic:spPr>
                     <a:xfrm>
                       <a:off x="0" y="0"/>
-                      <a:ext cx="3437036" cy="2250977"/>
+                      <a:ext cx="3399973" cy="2679518"/>
                     </a:xfrm>
                     <a:prstGeom prst="rect">
                       <a:avLst/>
@@ -19898,42 +19911,21 @@
         <w:rPr>
           <w:szCs w:val="24"/>
         </w:rPr>
-        <w:t xml:space="preserve">Muestra cómo se reorganizan Servicios, Proyectos y Testimonios en el ancho de </w:t>
-      </w:r>
-      <w:proofErr w:type="spellStart"/>
-      <w:r>
-        <w:rPr>
-          <w:szCs w:val="24"/>
-        </w:rPr>
-        <w:t>tablet</w:t>
-      </w:r>
-      <w:proofErr w:type="spellEnd"/>
-      <w:r>
-        <w:rPr>
-          <w:szCs w:val="24"/>
-        </w:rPr>
-        <w:t>.</w:t>
-      </w:r>
-    </w:p>
-    <w:p>
-      <w:pPr>
-        <w:rPr>
-          <w:rFonts w:ascii="Times New Roman" w:hAnsi="Times New Roman" w:cs="Times New Roman"/>
-          <w:b/>
-          <w:bCs/>
-          <w:sz w:val="24"/>
-          <w:szCs w:val="24"/>
-        </w:rPr>
-      </w:pPr>
-      <w:r>
-        <w:rPr>
-          <w:rFonts w:ascii="Times New Roman" w:hAnsi="Times New Roman" w:cs="Times New Roman"/>
-          <w:b/>
-          <w:bCs/>
-          <w:sz w:val="24"/>
-          <w:szCs w:val="24"/>
-        </w:rPr>
-        <w:t>Implementación Desktop</w:t>
+        <w:t xml:space="preserve">Muestra la distribución en dos columnas aplicada desde el </w:t>
+      </w:r>
+      <w:proofErr w:type="spellStart"/>
+      <w:r>
+        <w:rPr>
+          <w:szCs w:val="24"/>
+        </w:rPr>
+        <w:t>breakpoint</w:t>
+      </w:r>
+      <w:proofErr w:type="spellEnd"/>
+      <w:r>
+        <w:rPr>
+          <w:szCs w:val="24"/>
+        </w:rPr>
+        <w:t xml:space="preserve"> de 768px.</w:t>
       </w:r>
     </w:p>
     <w:p>
@@ -19945,12 +19937,13 @@
           <w:szCs w:val="24"/>
         </w:rPr>
       </w:pPr>
-      <w:bookmarkStart w:id="30" w:name="_Toc234187765"/>
-      <w:r>
-        <w:rPr>
-          <w:sz w:val="24"/>
-          <w:szCs w:val="24"/>
-        </w:rPr>
+      <w:bookmarkStart w:id="30" w:name="_Toc234187764"/>
+      <w:r>
+        <w:rPr>
+          <w:sz w:val="24"/>
+          <w:szCs w:val="24"/>
+        </w:rPr>
+        <w:lastRenderedPageBreak/>
         <w:t xml:space="preserve">Figura </w:t>
       </w:r>
       <w:r>
@@ -19980,7 +19973,7 @@
           <w:sz w:val="24"/>
           <w:szCs w:val="24"/>
         </w:rPr>
-        <w:t>9</w:t>
+        <w:t>8</w:t>
       </w:r>
       <w:r>
         <w:rPr>
@@ -19994,7 +19987,23 @@
           <w:sz w:val="24"/>
           <w:szCs w:val="24"/>
         </w:rPr>
-        <w:t>. Vista desktop del encabezado y Hero</w:t>
+        <w:t xml:space="preserve">. Vista </w:t>
+      </w:r>
+      <w:proofErr w:type="spellStart"/>
+      <w:r>
+        <w:rPr>
+          <w:sz w:val="24"/>
+          <w:szCs w:val="24"/>
+        </w:rPr>
+        <w:t>tablet</w:t>
+      </w:r>
+      <w:proofErr w:type="spellEnd"/>
+      <w:r>
+        <w:rPr>
+          <w:sz w:val="24"/>
+          <w:szCs w:val="24"/>
+        </w:rPr>
+        <w:t xml:space="preserve"> de las secciones intermedias</w:t>
       </w:r>
       <w:bookmarkEnd w:id="30"/>
     </w:p>
@@ -20014,10 +20023,10 @@
           <w:szCs w:val="24"/>
         </w:rPr>
         <w:drawing>
-          <wp:inline distT="0" distB="0" distL="0" distR="0" wp14:anchorId="34B2BC3F" wp14:editId="5AB703CD">
-            <wp:extent cx="4470400" cy="1857108"/>
-            <wp:effectExtent l="0" t="0" r="6350" b="0"/>
-            <wp:docPr id="20" name="Imagen 20"/>
+          <wp:inline distT="0" distB="0" distL="0" distR="0" wp14:anchorId="556A1F6F" wp14:editId="7DC3EA13">
+            <wp:extent cx="3412946" cy="2235200"/>
+            <wp:effectExtent l="0" t="0" r="0" b="0"/>
+            <wp:docPr id="19" name="Imagen 19"/>
             <wp:cNvGraphicFramePr>
               <a:graphicFrameLocks xmlns:a="http://schemas.openxmlformats.org/drawingml/2006/main" noChangeAspect="1"/>
             </wp:cNvGraphicFramePr>
@@ -20037,7 +20046,7 @@
                   <pic:spPr>
                     <a:xfrm>
                       <a:off x="0" y="0"/>
-                      <a:ext cx="4491621" cy="1865924"/>
+                      <a:ext cx="3437036" cy="2250977"/>
                     </a:xfrm>
                     <a:prstGeom prst="rect">
                       <a:avLst/>
@@ -20062,17 +20071,43 @@
         <w:rPr>
           <w:szCs w:val="24"/>
         </w:rPr>
-        <w:t>Muestra la distribución completa en dos columnas del Hero en pantallas de 1366px.</w:t>
+        <w:t xml:space="preserve">Muestra cómo se reorganizan Servicios, Proyectos y Testimonios en el ancho de </w:t>
+      </w:r>
+      <w:proofErr w:type="spellStart"/>
+      <w:r>
+        <w:rPr>
+          <w:szCs w:val="24"/>
+        </w:rPr>
+        <w:t>tablet</w:t>
+      </w:r>
+      <w:proofErr w:type="spellEnd"/>
+      <w:r>
+        <w:rPr>
+          <w:szCs w:val="24"/>
+        </w:rPr>
+        <w:t>.</w:t>
       </w:r>
     </w:p>
     <w:p>
       <w:pPr>
         <w:rPr>
           <w:rFonts w:ascii="Times New Roman" w:hAnsi="Times New Roman" w:cs="Times New Roman"/>
-          <w:sz w:val="24"/>
-          <w:szCs w:val="24"/>
-        </w:rPr>
-      </w:pPr>
+          <w:b/>
+          <w:bCs/>
+          <w:sz w:val="24"/>
+          <w:szCs w:val="24"/>
+        </w:rPr>
+      </w:pPr>
+      <w:r>
+        <w:rPr>
+          <w:rFonts w:ascii="Times New Roman" w:hAnsi="Times New Roman" w:cs="Times New Roman"/>
+          <w:b/>
+          <w:bCs/>
+          <w:sz w:val="24"/>
+          <w:szCs w:val="24"/>
+        </w:rPr>
+        <w:t>Implementación Desktop</w:t>
+      </w:r>
     </w:p>
     <w:p>
       <w:pPr>
@@ -20083,7 +20118,7 @@
           <w:szCs w:val="24"/>
         </w:rPr>
       </w:pPr>
-      <w:bookmarkStart w:id="31" w:name="_Toc234187766"/>
+      <w:bookmarkStart w:id="31" w:name="_Toc234187765"/>
       <w:r>
         <w:rPr>
           <w:sz w:val="24"/>
@@ -20118,7 +20153,7 @@
           <w:sz w:val="24"/>
           <w:szCs w:val="24"/>
         </w:rPr>
-        <w:t>10</w:t>
+        <w:t>9</w:t>
       </w:r>
       <w:r>
         <w:rPr>
@@ -20132,7 +20167,7 @@
           <w:sz w:val="24"/>
           <w:szCs w:val="24"/>
         </w:rPr>
-        <w:t>. Vista desktop de la sección de Servicios</w:t>
+        <w:t>. Vista desktop del encabezado y Hero</w:t>
       </w:r>
       <w:bookmarkEnd w:id="31"/>
     </w:p>
@@ -20152,10 +20187,10 @@
           <w:szCs w:val="24"/>
         </w:rPr>
         <w:drawing>
-          <wp:inline distT="0" distB="0" distL="0" distR="0" wp14:anchorId="22A1DD27" wp14:editId="2BE9F7C2">
-            <wp:extent cx="4235450" cy="1852102"/>
-            <wp:effectExtent l="0" t="0" r="0" b="0"/>
-            <wp:docPr id="25" name="Imagen 25"/>
+          <wp:inline distT="0" distB="0" distL="0" distR="0" wp14:anchorId="34B2BC3F" wp14:editId="5AB703CD">
+            <wp:extent cx="4470400" cy="1857108"/>
+            <wp:effectExtent l="0" t="0" r="6350" b="0"/>
+            <wp:docPr id="20" name="Imagen 20"/>
             <wp:cNvGraphicFramePr>
               <a:graphicFrameLocks xmlns:a="http://schemas.openxmlformats.org/drawingml/2006/main" noChangeAspect="1"/>
             </wp:cNvGraphicFramePr>
@@ -20175,7 +20210,7 @@
                   <pic:spPr>
                     <a:xfrm>
                       <a:off x="0" y="0"/>
-                      <a:ext cx="4272199" cy="1868172"/>
+                      <a:ext cx="4491621" cy="1865924"/>
                     </a:xfrm>
                     <a:prstGeom prst="rect">
                       <a:avLst/>
@@ -20200,8 +20235,17 @@
         <w:rPr>
           <w:szCs w:val="24"/>
         </w:rPr>
-        <w:t>Muestra las tres columnas de tarjetas de servicio distribuidas con col-lg-4.</w:t>
-      </w:r>
+        <w:t>Muestra la distribución completa en dos columnas del Hero en pantallas de 1366px.</w:t>
+      </w:r>
+    </w:p>
+    <w:p>
+      <w:pPr>
+        <w:rPr>
+          <w:rFonts w:ascii="Times New Roman" w:hAnsi="Times New Roman" w:cs="Times New Roman"/>
+          <w:sz w:val="24"/>
+          <w:szCs w:val="24"/>
+        </w:rPr>
+      </w:pPr>
     </w:p>
     <w:p>
       <w:pPr>
@@ -20212,13 +20256,12 @@
           <w:szCs w:val="24"/>
         </w:rPr>
       </w:pPr>
-      <w:bookmarkStart w:id="32" w:name="_Toc234187767"/>
-      <w:r>
-        <w:rPr>
-          <w:sz w:val="24"/>
-          <w:szCs w:val="24"/>
-        </w:rPr>
-        <w:lastRenderedPageBreak/>
+      <w:bookmarkStart w:id="32" w:name="_Toc234187766"/>
+      <w:r>
+        <w:rPr>
+          <w:sz w:val="24"/>
+          <w:szCs w:val="24"/>
+        </w:rPr>
         <w:t xml:space="preserve">Figura </w:t>
       </w:r>
       <w:r>
@@ -20248,7 +20291,7 @@
           <w:sz w:val="24"/>
           <w:szCs w:val="24"/>
         </w:rPr>
-        <w:t>11</w:t>
+        <w:t>10</w:t>
       </w:r>
       <w:r>
         <w:rPr>
@@ -20262,7 +20305,7 @@
           <w:sz w:val="24"/>
           <w:szCs w:val="24"/>
         </w:rPr>
-        <w:t>. Vista desktop de Testimonios</w:t>
+        <w:t>. Vista desktop de la sección de Servicios</w:t>
       </w:r>
       <w:bookmarkEnd w:id="32"/>
     </w:p>
@@ -20282,10 +20325,10 @@
           <w:szCs w:val="24"/>
         </w:rPr>
         <w:drawing>
-          <wp:inline distT="0" distB="0" distL="0" distR="0" wp14:anchorId="3FE323F2" wp14:editId="178C1555">
-            <wp:extent cx="4632960" cy="1587541"/>
+          <wp:inline distT="0" distB="0" distL="0" distR="0" wp14:anchorId="22A1DD27" wp14:editId="2BE9F7C2">
+            <wp:extent cx="4235450" cy="1852102"/>
             <wp:effectExtent l="0" t="0" r="0" b="0"/>
-            <wp:docPr id="22" name="Imagen 22"/>
+            <wp:docPr id="25" name="Imagen 25"/>
             <wp:cNvGraphicFramePr>
               <a:graphicFrameLocks xmlns:a="http://schemas.openxmlformats.org/drawingml/2006/main" noChangeAspect="1"/>
             </wp:cNvGraphicFramePr>
@@ -20305,7 +20348,7 @@
                   <pic:spPr>
                     <a:xfrm>
                       <a:off x="0" y="0"/>
-                      <a:ext cx="4648696" cy="1592933"/>
+                      <a:ext cx="4272199" cy="1868172"/>
                     </a:xfrm>
                     <a:prstGeom prst="rect">
                       <a:avLst/>
@@ -20330,7 +20373,7 @@
         <w:rPr>
           <w:szCs w:val="24"/>
         </w:rPr>
-        <w:t>Muestra la disposición final del bloque de testimonios</w:t>
+        <w:t>Muestra las tres columnas de tarjetas de servicio distribuidas con col-lg-4.</w:t>
       </w:r>
     </w:p>
     <w:p>
@@ -20342,12 +20385,13 @@
           <w:szCs w:val="24"/>
         </w:rPr>
       </w:pPr>
-      <w:bookmarkStart w:id="33" w:name="_Toc234187768"/>
-      <w:r>
-        <w:rPr>
-          <w:sz w:val="24"/>
-          <w:szCs w:val="24"/>
-        </w:rPr>
+      <w:bookmarkStart w:id="33" w:name="_Toc234187767"/>
+      <w:r>
+        <w:rPr>
+          <w:sz w:val="24"/>
+          <w:szCs w:val="24"/>
+        </w:rPr>
+        <w:lastRenderedPageBreak/>
         <w:t xml:space="preserve">Figura </w:t>
       </w:r>
       <w:r>
@@ -20377,7 +20421,7 @@
           <w:sz w:val="24"/>
           <w:szCs w:val="24"/>
         </w:rPr>
-        <w:t>12</w:t>
+        <w:t>11</w:t>
       </w:r>
       <w:r>
         <w:rPr>
@@ -20391,7 +20435,7 @@
           <w:sz w:val="24"/>
           <w:szCs w:val="24"/>
         </w:rPr>
-        <w:t>. Vista desktop de Contacto y cotización</w:t>
+        <w:t>. Vista desktop de Testimonios</w:t>
       </w:r>
       <w:bookmarkEnd w:id="33"/>
     </w:p>
@@ -20411,10 +20455,10 @@
           <w:szCs w:val="24"/>
         </w:rPr>
         <w:drawing>
-          <wp:inline distT="0" distB="0" distL="0" distR="0" wp14:anchorId="7F224F85" wp14:editId="7449E889">
-            <wp:extent cx="4648200" cy="2014184"/>
-            <wp:effectExtent l="0" t="0" r="0" b="5715"/>
-            <wp:docPr id="23" name="Imagen 23"/>
+          <wp:inline distT="0" distB="0" distL="0" distR="0" wp14:anchorId="3FE323F2" wp14:editId="178C1555">
+            <wp:extent cx="4632960" cy="1587541"/>
+            <wp:effectExtent l="0" t="0" r="0" b="0"/>
+            <wp:docPr id="22" name="Imagen 22"/>
             <wp:cNvGraphicFramePr>
               <a:graphicFrameLocks xmlns:a="http://schemas.openxmlformats.org/drawingml/2006/main" noChangeAspect="1"/>
             </wp:cNvGraphicFramePr>
@@ -20434,7 +20478,7 @@
                   <pic:spPr>
                     <a:xfrm>
                       <a:off x="0" y="0"/>
-                      <a:ext cx="4663750" cy="2020922"/>
+                      <a:ext cx="4648696" cy="1592933"/>
                     </a:xfrm>
                     <a:prstGeom prst="rect">
                       <a:avLst/>
@@ -20449,19 +20493,17 @@
     </w:p>
     <w:p>
       <w:pPr>
-        <w:rPr>
-          <w:rFonts w:ascii="Times New Roman" w:hAnsi="Times New Roman" w:cs="Times New Roman"/>
-          <w:sz w:val="24"/>
-          <w:szCs w:val="24"/>
-        </w:rPr>
-      </w:pPr>
-      <w:r>
-        <w:rPr>
-          <w:rFonts w:ascii="Times New Roman" w:hAnsi="Times New Roman" w:cs="Times New Roman"/>
-          <w:sz w:val="24"/>
-          <w:szCs w:val="24"/>
-        </w:rPr>
-        <w:t>Muestra el formulario de contacto y la información por si se desea contactarse para una cotización.</w:t>
+        <w:pStyle w:val="APA7ma"/>
+        <w:ind w:firstLine="0"/>
+        <w:rPr>
+          <w:szCs w:val="24"/>
+        </w:rPr>
+      </w:pPr>
+      <w:r>
+        <w:rPr>
+          <w:szCs w:val="24"/>
+        </w:rPr>
+        <w:t>Muestra la disposición final del bloque de testimonios</w:t>
       </w:r>
     </w:p>
     <w:p>
@@ -20473,7 +20515,7 @@
           <w:szCs w:val="24"/>
         </w:rPr>
       </w:pPr>
-      <w:bookmarkStart w:id="34" w:name="_Toc234187769"/>
+      <w:bookmarkStart w:id="34" w:name="_Toc234187768"/>
       <w:r>
         <w:rPr>
           <w:sz w:val="24"/>
@@ -20508,7 +20550,7 @@
           <w:sz w:val="24"/>
           <w:szCs w:val="24"/>
         </w:rPr>
-        <w:t>13</w:t>
+        <w:t>12</w:t>
       </w:r>
       <w:r>
         <w:rPr>
@@ -20522,7 +20564,7 @@
           <w:sz w:val="24"/>
           <w:szCs w:val="24"/>
         </w:rPr>
-        <w:t>. Vista desktop del pie de página</w:t>
+        <w:t>. Vista desktop de Contacto y cotización</w:t>
       </w:r>
       <w:bookmarkEnd w:id="34"/>
     </w:p>
@@ -20542,10 +20584,10 @@
           <w:szCs w:val="24"/>
         </w:rPr>
         <w:drawing>
-          <wp:inline distT="0" distB="0" distL="0" distR="0" wp14:anchorId="759E991A" wp14:editId="6CC0A777">
-            <wp:extent cx="4663440" cy="794057"/>
-            <wp:effectExtent l="0" t="0" r="3810" b="6350"/>
-            <wp:docPr id="24" name="Imagen 24"/>
+          <wp:inline distT="0" distB="0" distL="0" distR="0" wp14:anchorId="7F224F85" wp14:editId="7449E889">
+            <wp:extent cx="4648200" cy="2014184"/>
+            <wp:effectExtent l="0" t="0" r="0" b="5715"/>
+            <wp:docPr id="23" name="Imagen 23"/>
             <wp:cNvGraphicFramePr>
               <a:graphicFrameLocks xmlns:a="http://schemas.openxmlformats.org/drawingml/2006/main" noChangeAspect="1"/>
             </wp:cNvGraphicFramePr>
@@ -20565,6 +20607,137 @@
                   <pic:spPr>
                     <a:xfrm>
                       <a:off x="0" y="0"/>
+                      <a:ext cx="4663750" cy="2020922"/>
+                    </a:xfrm>
+                    <a:prstGeom prst="rect">
+                      <a:avLst/>
+                    </a:prstGeom>
+                  </pic:spPr>
+                </pic:pic>
+              </a:graphicData>
+            </a:graphic>
+          </wp:inline>
+        </w:drawing>
+      </w:r>
+    </w:p>
+    <w:p>
+      <w:pPr>
+        <w:rPr>
+          <w:rFonts w:ascii="Times New Roman" w:hAnsi="Times New Roman" w:cs="Times New Roman"/>
+          <w:sz w:val="24"/>
+          <w:szCs w:val="24"/>
+        </w:rPr>
+      </w:pPr>
+      <w:r>
+        <w:rPr>
+          <w:rFonts w:ascii="Times New Roman" w:hAnsi="Times New Roman" w:cs="Times New Roman"/>
+          <w:sz w:val="24"/>
+          <w:szCs w:val="24"/>
+        </w:rPr>
+        <w:t>Muestra el formulario de contacto y la información por si se desea contactarse para una cotización.</w:t>
+      </w:r>
+    </w:p>
+    <w:p>
+      <w:pPr>
+        <w:pStyle w:val="Descripcin"/>
+        <w:keepNext/>
+        <w:rPr>
+          <w:sz w:val="24"/>
+          <w:szCs w:val="24"/>
+        </w:rPr>
+      </w:pPr>
+      <w:bookmarkStart w:id="35" w:name="_Toc234187769"/>
+      <w:r>
+        <w:rPr>
+          <w:sz w:val="24"/>
+          <w:szCs w:val="24"/>
+        </w:rPr>
+        <w:t xml:space="preserve">Figura </w:t>
+      </w:r>
+      <w:r>
+        <w:rPr>
+          <w:sz w:val="24"/>
+          <w:szCs w:val="24"/>
+        </w:rPr>
+        <w:fldChar w:fldCharType="begin"/>
+      </w:r>
+      <w:r>
+        <w:rPr>
+          <w:sz w:val="24"/>
+          <w:szCs w:val="24"/>
+        </w:rPr>
+        <w:instrText xml:space="preserve"> SEQ Figura \* ARABIC </w:instrText>
+      </w:r>
+      <w:r>
+        <w:rPr>
+          <w:sz w:val="24"/>
+          <w:szCs w:val="24"/>
+        </w:rPr>
+        <w:fldChar w:fldCharType="separate"/>
+      </w:r>
+      <w:r>
+        <w:rPr>
+          <w:noProof/>
+          <w:sz w:val="24"/>
+          <w:szCs w:val="24"/>
+        </w:rPr>
+        <w:t>13</w:t>
+      </w:r>
+      <w:r>
+        <w:rPr>
+          <w:sz w:val="24"/>
+          <w:szCs w:val="24"/>
+        </w:rPr>
+        <w:fldChar w:fldCharType="end"/>
+      </w:r>
+      <w:r>
+        <w:rPr>
+          <w:sz w:val="24"/>
+          <w:szCs w:val="24"/>
+        </w:rPr>
+        <w:t>. Vista desktop del pie de página</w:t>
+      </w:r>
+      <w:bookmarkEnd w:id="35"/>
+    </w:p>
+    <w:p>
+      <w:pPr>
+        <w:rPr>
+          <w:rFonts w:ascii="Times New Roman" w:hAnsi="Times New Roman" w:cs="Times New Roman"/>
+          <w:sz w:val="24"/>
+          <w:szCs w:val="24"/>
+        </w:rPr>
+      </w:pPr>
+      <w:r>
+        <w:rPr>
+          <w:rFonts w:ascii="Times New Roman" w:hAnsi="Times New Roman" w:cs="Times New Roman"/>
+          <w:noProof/>
+          <w:sz w:val="24"/>
+          <w:szCs w:val="24"/>
+        </w:rPr>
+        <w:drawing>
+          <wp:inline distT="0" distB="0" distL="0" distR="0" wp14:anchorId="759E991A" wp14:editId="6CC0A777">
+            <wp:extent cx="4663440" cy="794057"/>
+            <wp:effectExtent l="0" t="0" r="3810" b="6350"/>
+            <wp:docPr id="24" name="Imagen 24"/>
+            <wp:cNvGraphicFramePr>
+              <a:graphicFrameLocks xmlns:a="http://schemas.openxmlformats.org/drawingml/2006/main" noChangeAspect="1"/>
+            </wp:cNvGraphicFramePr>
+            <a:graphic xmlns:a="http://schemas.openxmlformats.org/drawingml/2006/main">
+              <a:graphicData uri="http://schemas.openxmlformats.org/drawingml/2006/picture">
+                <pic:pic xmlns:pic="http://schemas.openxmlformats.org/drawingml/2006/picture">
+                  <pic:nvPicPr>
+                    <pic:cNvPr id="1" name=""/>
+                    <pic:cNvPicPr/>
+                  </pic:nvPicPr>
+                  <pic:blipFill>
+                    <a:blip r:embed="rId30"/>
+                    <a:stretch>
+                      <a:fillRect/>
+                    </a:stretch>
+                  </pic:blipFill>
+                  <pic:spPr>
+                    <a:xfrm>
+                      <a:off x="0" y="0"/>
                       <a:ext cx="4696360" cy="799662"/>
                     </a:xfrm>
                     <a:prstGeom prst="rect">
@@ -20651,7 +20824,7 @@
           <w:szCs w:val="24"/>
         </w:rPr>
       </w:pPr>
-      <w:bookmarkStart w:id="35" w:name="_Toc234187705"/>
+      <w:bookmarkStart w:id="36" w:name="_Toc234190921"/>
       <w:r>
         <w:rPr>
           <w:rFonts w:cs="Times New Roman"/>
@@ -20660,7 +20833,7 @@
         <w:lastRenderedPageBreak/>
         <w:t>Pruebas responsive</w:t>
       </w:r>
-      <w:bookmarkEnd w:id="35"/>
+      <w:bookmarkEnd w:id="36"/>
     </w:p>
     <w:p>
       <w:pPr>
@@ -20680,7 +20853,7 @@
           <w:szCs w:val="24"/>
         </w:rPr>
       </w:pPr>
-      <w:bookmarkStart w:id="36" w:name="_Toc234187777"/>
+      <w:bookmarkStart w:id="37" w:name="_Toc234187777"/>
       <w:r>
         <w:rPr>
           <w:sz w:val="24"/>
@@ -20745,7 +20918,7 @@
         </w:rPr>
         <w:t>ados de las pruebas responsive</w:t>
       </w:r>
-      <w:bookmarkEnd w:id="36"/>
+      <w:bookmarkEnd w:id="37"/>
     </w:p>
     <w:tbl>
       <w:tblPr>
@@ -21260,7 +21433,7 @@
           <w:szCs w:val="24"/>
         </w:rPr>
       </w:pPr>
-      <w:bookmarkStart w:id="37" w:name="_Toc234187706"/>
+      <w:bookmarkStart w:id="38" w:name="_Toc234190922"/>
       <w:r>
         <w:rPr>
           <w:rFonts w:cs="Times New Roman"/>
@@ -21275,7 +21448,7 @@
         </w:rPr>
         <w:t>ragmentos de código</w:t>
       </w:r>
-      <w:bookmarkEnd w:id="37"/>
+      <w:bookmarkEnd w:id="38"/>
     </w:p>
     <w:p>
       <w:pPr>
@@ -25770,7 +25943,15 @@
           <w:szCs w:val="18"/>
           <w:lang w:val="en-US"/>
         </w:rPr>
-        <w:t xml:space="preserve"> 2. </w:t>
+        <w:t xml:space="preserve"> </w:t>
+      </w:r>
+      <w:r>
+        <w:rPr>
+          <w:rFonts w:ascii="Consolas" w:hAnsi="Consolas" w:cs="Courier New"/>
+          <w:sz w:val="18"/>
+          <w:szCs w:val="18"/>
+        </w:rPr>
+        <w:t xml:space="preserve">2. </w:t>
       </w:r>
       <w:r>
         <w:rPr>
@@ -25778,7 +25959,6 @@
           <w:color w:val="000000"/>
           <w:sz w:val="18"/>
           <w:szCs w:val="18"/>
-          <w:lang w:val="en-US"/>
         </w:rPr>
         <w:t xml:space="preserve">    </w:t>
       </w:r>
@@ -33100,7 +33280,7 @@
           <w:szCs w:val="24"/>
         </w:rPr>
       </w:pPr>
-      <w:bookmarkStart w:id="38" w:name="_Toc234187707"/>
+      <w:bookmarkStart w:id="39" w:name="_Toc234190923"/>
       <w:r>
         <w:rPr>
           <w:rFonts w:cs="Times New Roman"/>
@@ -33108,7 +33288,7 @@
         </w:rPr>
         <w:t>Conclusiones</w:t>
       </w:r>
-      <w:bookmarkEnd w:id="38"/>
+      <w:bookmarkEnd w:id="39"/>
     </w:p>
     <w:p>
       <w:pPr>
@@ -33271,7 +33451,7 @@
           <w:szCs w:val="24"/>
         </w:rPr>
       </w:pPr>
-      <w:bookmarkStart w:id="39" w:name="_Toc234187708"/>
+      <w:bookmarkStart w:id="40" w:name="_Toc234190924"/>
       <w:r>
         <w:rPr>
           <w:rFonts w:cs="Times New Roman"/>
@@ -33279,7 +33459,7 @@
         </w:rPr>
         <w:t>Referencias</w:t>
       </w:r>
-      <w:bookmarkEnd w:id="39"/>
+      <w:bookmarkEnd w:id="40"/>
     </w:p>
     <w:p>
       <w:pPr>

</xml_diff>